<commit_message>
docs: add first chapters of task description
</commit_message>
<xml_diff>
--- a/Work Doc.docx
+++ b/Work Doc.docx
@@ -28,26 +28,497 @@
           <w:numId w:val="1"/>
         </w:numPr>
         <w:jc w:val="center"/>
+      </w:pPr>
+      <w:r>
+        <w:t>Цель разработки</w:t>
+      </w:r>
+      <w:r>
+        <w:t>.</w:t>
+      </w:r>
+    </w:p>
+    <w:p>
+      <w:r>
+        <w:t>Основной целью разработки является создание информационной системы</w:t>
+      </w:r>
+      <w:r>
+        <w:t xml:space="preserve"> (приложения)</w:t>
+      </w:r>
+      <w:r>
+        <w:t>, обеспечи</w:t>
+      </w:r>
+      <w:r>
+        <w:t xml:space="preserve">вающей динамическую обработку и визуализацию данных, представленных в структурированной синтаксической разметке </w:t>
+      </w:r>
+      <w:r>
         <w:rPr>
-          <w:color w:val="000000" w:themeColor="text1"/>
+          <w:lang w:val="en-US"/>
         </w:rPr>
-      </w:pPr>
+        <w:t>Markdown</w:t>
+      </w:r>
+      <w:r>
+        <w:t>.</w:t>
+      </w:r>
+    </w:p>
+    <w:p>
+      <w:r>
+        <w:t xml:space="preserve">Приложение представляет из себя локальный, десктопный </w:t>
+      </w:r>
       <w:r>
         <w:rPr>
-          <w:color w:val="000000" w:themeColor="text1"/>
+          <w:lang w:val="en-US"/>
         </w:rPr>
-        <w:t>Цель разработки</w:t>
+        <w:t>WYSIWYG</w:t>
+      </w:r>
+      <w:r>
+        <w:t xml:space="preserve"> редактор, работающий с </w:t>
       </w:r>
       <w:r>
         <w:rPr>
-          <w:color w:val="000000" w:themeColor="text1"/>
+          <w:lang w:val="en-US"/>
         </w:rPr>
+        <w:t>Markdown</w:t>
+      </w:r>
+      <w:r>
+        <w:t xml:space="preserve"> </w:t>
+      </w:r>
+      <w:r>
+        <w:t xml:space="preserve">как с форматом хранения и экспорта написанного текста. Цель такой проектировки – обеспечение максимального удобства, простоты и наглядности редактирования. </w:t>
+      </w:r>
+    </w:p>
+    <w:p>
+      <w:r>
+        <w:t>Частными целями работы являются:</w:t>
+      </w:r>
+    </w:p>
+    <w:p>
+      <w:pPr>
+        <w:pStyle w:val="ListParagraph"/>
+        <w:numPr>
+          <w:ilvl w:val="0"/>
+          <w:numId w:val="2"/>
+        </w:numPr>
+      </w:pPr>
+      <w:r>
+        <w:t xml:space="preserve">Создание системы обработки структурированных данных за счёт использования модели документа, а не редактирования исходного </w:t>
+      </w:r>
+      <w:r>
+        <w:rPr>
+          <w:lang w:val="en-US"/>
+        </w:rPr>
+        <w:t>markdown</w:t>
+      </w:r>
+      <w:r>
+        <w:t xml:space="preserve"> </w:t>
+      </w:r>
+      <w:r>
+        <w:t>напрямую.</w:t>
+      </w:r>
+    </w:p>
+    <w:p>
+      <w:pPr>
+        <w:pStyle w:val="ListParagraph"/>
+        <w:numPr>
+          <w:ilvl w:val="0"/>
+          <w:numId w:val="2"/>
+        </w:numPr>
+      </w:pPr>
+      <w:r>
+        <w:t>Обеспечение режима скрытия синтаксиса в неактивных строках.</w:t>
+      </w:r>
+    </w:p>
+    <w:p>
+      <w:pPr>
+        <w:pStyle w:val="ListParagraph"/>
+        <w:numPr>
+          <w:ilvl w:val="0"/>
+          <w:numId w:val="2"/>
+        </w:numPr>
+      </w:pPr>
+      <w:r>
+        <w:t>Обеспечение режима полного скрытия синтаксиса с управлением форматированием через панель инструментов и сочетания клавиш.</w:t>
+      </w:r>
+    </w:p>
+    <w:p>
+      <w:pPr>
+        <w:pStyle w:val="ListParagraph"/>
+        <w:numPr>
+          <w:ilvl w:val="0"/>
+          <w:numId w:val="2"/>
+        </w:numPr>
+      </w:pPr>
+      <w:r>
+        <w:t>Гарантия сохранения внешнего вида документа между загрузками</w:t>
+      </w:r>
+      <w:r>
         <w:t>.</w:t>
       </w:r>
     </w:p>
     <w:p>
-      <w:r>
-        <w:t>Основной целью разработки является создание информационной системы, обеспечи</w:t>
+      <w:pPr>
+        <w:pStyle w:val="ListParagraph"/>
+        <w:numPr>
+          <w:ilvl w:val="0"/>
+          <w:numId w:val="2"/>
+        </w:numPr>
+      </w:pPr>
+      <w:r>
+        <w:t xml:space="preserve">Обеспечение экспорта каждой заметки в </w:t>
+      </w:r>
+      <w:r>
+        <w:rPr>
+          <w:lang w:val="en-US"/>
+        </w:rPr>
+        <w:t>Raw</w:t>
+      </w:r>
+      <w:r>
+        <w:t xml:space="preserve"> </w:t>
+      </w:r>
+      <w:r>
+        <w:rPr>
+          <w:lang w:val="en-US"/>
+        </w:rPr>
+        <w:t>Markdown</w:t>
+      </w:r>
+      <w:r>
+        <w:t>.</w:t>
+      </w:r>
+    </w:p>
+    <w:p>
+      <w:r>
+        <w:t>Также, для обеспечения полноты пользовательского опыта, в приложении будет реализован ряд функций:</w:t>
+      </w:r>
+    </w:p>
+    <w:p>
+      <w:pPr>
+        <w:pStyle w:val="ListParagraph"/>
+        <w:numPr>
+          <w:ilvl w:val="0"/>
+          <w:numId w:val="2"/>
+        </w:numPr>
+      </w:pPr>
+      <w:r>
+        <w:t>Система папок.</w:t>
+      </w:r>
+    </w:p>
+    <w:p>
+      <w:pPr>
+        <w:pStyle w:val="ListParagraph"/>
+        <w:numPr>
+          <w:ilvl w:val="0"/>
+          <w:numId w:val="2"/>
+        </w:numPr>
+      </w:pPr>
+      <w:r>
+        <w:t>Система поиска заметок и отдельных слов в файлах.</w:t>
+      </w:r>
+    </w:p>
+    <w:p>
+      <w:pPr>
+        <w:pStyle w:val="ListParagraph"/>
+        <w:numPr>
+          <w:ilvl w:val="0"/>
+          <w:numId w:val="2"/>
+        </w:numPr>
+      </w:pPr>
+      <w:r>
+        <w:t>Введение тегов, ссылок и других методов взаимной связи между заметками.</w:t>
+      </w:r>
+    </w:p>
+    <w:p>
+      <w:pPr>
+        <w:pStyle w:val="ListParagraph"/>
+        <w:numPr>
+          <w:ilvl w:val="0"/>
+          <w:numId w:val="2"/>
+        </w:numPr>
+      </w:pPr>
+      <w:r>
+        <w:t>Реализация режима быстрой вставки ссылок из интернета при помощи внутреннего отображения поиска в браузере.</w:t>
+      </w:r>
+    </w:p>
+    <w:p>
+      <w:pPr>
+        <w:pStyle w:val="ListParagraph"/>
+        <w:numPr>
+          <w:ilvl w:val="0"/>
+          <w:numId w:val="2"/>
+        </w:numPr>
+      </w:pPr>
+      <w:r>
+        <w:t>Реализация режима быстрой вставки ссылок на файлы с локальных папок.</w:t>
+      </w:r>
+    </w:p>
+    <w:p>
+      <w:pPr>
+        <w:pStyle w:val="ListParagraph"/>
+        <w:numPr>
+          <w:ilvl w:val="0"/>
+          <w:numId w:val="2"/>
+        </w:numPr>
+      </w:pPr>
+      <w:r>
+        <w:t xml:space="preserve">Создание стилизованного, тактильного </w:t>
+      </w:r>
+      <w:r>
+        <w:t>интерфейса приложения.</w:t>
+      </w:r>
+    </w:p>
+    <w:p/>
+    <w:p/>
+    <w:p>
+      <w:pPr>
+        <w:pStyle w:val="Heading2"/>
+        <w:numPr>
+          <w:ilvl w:val="0"/>
+          <w:numId w:val="1"/>
+        </w:numPr>
+        <w:jc w:val="center"/>
+      </w:pPr>
+      <w:r>
+        <w:lastRenderedPageBreak/>
+        <w:t>Назначение приложения</w:t>
+      </w:r>
+    </w:p>
+    <w:p>
+      <w:r>
+        <w:t xml:space="preserve">Приложение разрабатывается как система для ведения личного дневника, базы знаний или стилизованной Вики. </w:t>
+      </w:r>
+    </w:p>
+    <w:p>
+      <w:r>
+        <w:t xml:space="preserve">При разработке упор делается на иммерсивный пользовательский опыт, высокую читаемость текста, отвлечение от работы с исходным </w:t>
+      </w:r>
+      <w:r>
+        <w:rPr>
+          <w:lang w:val="en-US"/>
+        </w:rPr>
+        <w:t>markdown</w:t>
+      </w:r>
+      <w:r>
+        <w:t xml:space="preserve"> и на инструменты, позволяющие редактировать и производить вставку из внешних источников не покидая окно приложения.</w:t>
+      </w:r>
+    </w:p>
+    <w:p/>
+    <w:p>
+      <w:pPr>
+        <w:pStyle w:val="Heading2"/>
+        <w:numPr>
+          <w:ilvl w:val="0"/>
+          <w:numId w:val="1"/>
+        </w:numPr>
+        <w:jc w:val="center"/>
+      </w:pPr>
+      <w:r>
+        <w:t>Задачи научной работы</w:t>
+      </w:r>
+    </w:p>
+    <w:p>
+      <w:r>
+        <w:t>При выполнении работы ставятся следующие задачи:</w:t>
+      </w:r>
+    </w:p>
+    <w:p>
+      <w:pPr>
+        <w:pStyle w:val="ListParagraph"/>
+        <w:numPr>
+          <w:ilvl w:val="0"/>
+          <w:numId w:val="4"/>
+        </w:numPr>
+      </w:pPr>
+      <w:r>
+        <w:t>Провести анализ существующих решений для работы со структурированной синтаксической разметкой, выявить их функционал, достоинства и ограничения.</w:t>
+      </w:r>
+    </w:p>
+    <w:p>
+      <w:pPr>
+        <w:pStyle w:val="ListParagraph"/>
+        <w:numPr>
+          <w:ilvl w:val="0"/>
+          <w:numId w:val="4"/>
+        </w:numPr>
+      </w:pPr>
+      <w:r>
+        <w:t>Выбор стека разработки</w:t>
+      </w:r>
+      <w:r>
+        <w:t>.</w:t>
+      </w:r>
+    </w:p>
+    <w:p>
+      <w:pPr>
+        <w:pStyle w:val="ListParagraph"/>
+        <w:numPr>
+          <w:ilvl w:val="0"/>
+          <w:numId w:val="4"/>
+        </w:numPr>
+      </w:pPr>
+      <w:r>
+        <w:t xml:space="preserve">Реализация простого </w:t>
+      </w:r>
+      <w:r>
+        <w:rPr>
+          <w:lang w:val="en-US"/>
+        </w:rPr>
+        <w:t>CRUD</w:t>
+      </w:r>
+      <w:r>
+        <w:t>-функционала.</w:t>
+      </w:r>
+    </w:p>
+    <w:p>
+      <w:pPr>
+        <w:pStyle w:val="ListParagraph"/>
+        <w:numPr>
+          <w:ilvl w:val="0"/>
+          <w:numId w:val="4"/>
+        </w:numPr>
+      </w:pPr>
+      <w:r>
+        <w:t xml:space="preserve">Спроектировать модель документа, хранящую структурированные данные независимо от исходного </w:t>
+      </w:r>
+      <w:r>
+        <w:rPr>
+          <w:lang w:val="en-US"/>
+        </w:rPr>
+        <w:t>Markdown</w:t>
+      </w:r>
+      <w:r>
+        <w:t xml:space="preserve"> </w:t>
+      </w:r>
+      <w:r>
+        <w:t>файла.</w:t>
+      </w:r>
+    </w:p>
+    <w:p>
+      <w:pPr>
+        <w:pStyle w:val="ListParagraph"/>
+        <w:numPr>
+          <w:ilvl w:val="0"/>
+          <w:numId w:val="4"/>
+        </w:numPr>
+      </w:pPr>
+      <w:r>
+        <w:t xml:space="preserve">Разработать двустороннее преобразование «Исходный файл – модель документа». </w:t>
+      </w:r>
+    </w:p>
+    <w:p>
+      <w:pPr>
+        <w:pStyle w:val="ListParagraph"/>
+        <w:numPr>
+          <w:ilvl w:val="0"/>
+          <w:numId w:val="4"/>
+        </w:numPr>
+      </w:pPr>
+      <w:r>
+        <w:t>Реализовать механизм динамической обработки данных, обновления лишь измененных частей внутренней модели документа.</w:t>
+      </w:r>
+    </w:p>
+    <w:p>
+      <w:pPr>
+        <w:pStyle w:val="ListParagraph"/>
+        <w:numPr>
+          <w:ilvl w:val="0"/>
+          <w:numId w:val="4"/>
+        </w:numPr>
+      </w:pPr>
+      <w:r>
+        <w:t xml:space="preserve">Реализовать режим </w:t>
+      </w:r>
+      <w:r>
+        <w:rPr>
+          <w:lang w:val="en-US"/>
+        </w:rPr>
+        <w:t>Live</w:t>
+      </w:r>
+      <w:r>
+        <w:t xml:space="preserve"> </w:t>
+      </w:r>
+      <w:r>
+        <w:rPr>
+          <w:lang w:val="en-US"/>
+        </w:rPr>
+        <w:t>Preview</w:t>
+      </w:r>
+      <w:r>
+        <w:t xml:space="preserve">, обеспечивая при этом строгую сериализацию и чтение при сохранении и чтении исходного </w:t>
+      </w:r>
+      <w:r>
+        <w:rPr>
+          <w:lang w:val="en-US"/>
+        </w:rPr>
+        <w:t>Markdown</w:t>
+      </w:r>
+      <w:r>
+        <w:t>.</w:t>
+      </w:r>
+    </w:p>
+    <w:p>
+      <w:pPr>
+        <w:pStyle w:val="ListParagraph"/>
+        <w:numPr>
+          <w:ilvl w:val="0"/>
+          <w:numId w:val="4"/>
+        </w:numPr>
+      </w:pPr>
+      <w:r>
+        <w:t xml:space="preserve">Реализовать режим </w:t>
+      </w:r>
+      <w:r>
+        <w:rPr>
+          <w:lang w:val="en-US"/>
+        </w:rPr>
+        <w:t>Full Render</w:t>
+      </w:r>
+      <w:r>
+        <w:t>.</w:t>
+      </w:r>
+    </w:p>
+    <w:p>
+      <w:pPr>
+        <w:pStyle w:val="ListParagraph"/>
+        <w:numPr>
+          <w:ilvl w:val="0"/>
+          <w:numId w:val="4"/>
+        </w:numPr>
+      </w:pPr>
+      <w:r>
+        <w:t>Реализовать систему хранения заметок.</w:t>
+      </w:r>
+    </w:p>
+    <w:p>
+      <w:pPr>
+        <w:pStyle w:val="ListParagraph"/>
+        <w:numPr>
+          <w:ilvl w:val="0"/>
+          <w:numId w:val="4"/>
+        </w:numPr>
+      </w:pPr>
+      <w:r>
+        <w:t>Разработать систему работы со ссылками.</w:t>
+      </w:r>
+    </w:p>
+    <w:p>
+      <w:pPr>
+        <w:pStyle w:val="ListParagraph"/>
+        <w:numPr>
+          <w:ilvl w:val="0"/>
+          <w:numId w:val="4"/>
+        </w:numPr>
+      </w:pPr>
+      <w:r>
+        <w:t>Разработать пользовательский интерфейс.</w:t>
+      </w:r>
+    </w:p>
+    <w:p>
+      <w:pPr>
+        <w:pStyle w:val="ListParagraph"/>
+        <w:numPr>
+          <w:ilvl w:val="0"/>
+          <w:numId w:val="4"/>
+        </w:numPr>
+      </w:pPr>
+      <w:r>
+        <w:t>Протестировать и оценить удобство использования приложения.</w:t>
       </w:r>
     </w:p>
     <w:sectPr>
@@ -63,6 +534,296 @@
 <file path=word/numbering.xml><?xml version="1.0" encoding="utf-8"?>
 <w:numbering xmlns:wpc="http://schemas.microsoft.com/office/word/2010/wordprocessingCanvas" xmlns:cx="http://schemas.microsoft.com/office/drawing/2014/chartex" xmlns:cx1="http://schemas.microsoft.com/office/drawing/2015/9/8/chartex" xmlns:cx2="http://schemas.microsoft.com/office/drawing/2015/10/21/chartex" xmlns:cx3="http://schemas.microsoft.com/office/drawing/2016/5/9/chartex" xmlns:cx4="http://schemas.microsoft.com/office/drawing/2016/5/10/chartex" xmlns:cx5="http://schemas.microsoft.com/office/drawing/2016/5/11/chartex" xmlns:cx6="http://schemas.microsoft.com/office/drawing/2016/5/12/chartex" xmlns:cx7="http://schemas.microsoft.com/office/drawing/2016/5/13/chartex" xmlns:cx8="http://schemas.microsoft.com/office/drawing/2016/5/14/chartex" xmlns:mc="http://schemas.openxmlformats.org/markup-compatibility/2006" xmlns:aink="http://schemas.microsoft.com/office/drawing/2016/ink" xmlns:am3d="http://schemas.microsoft.com/office/drawing/2017/model3d" xmlns:o="urn:schemas-microsoft-com:office:office" xmlns:oel="http://schemas.microsoft.com/office/2019/extlst" xmlns:r="http://schemas.openxmlformats.org/officeDocument/2006/relationships" xmlns:m="http://schemas.openxmlformats.org/officeDocument/2006/math" xmlns:v="urn:schemas-microsoft-com:vml" xmlns:wp14="http://schemas.microsoft.com/office/word/2010/wordprocessingDrawing" xmlns:wp="http://schemas.openxmlformats.org/drawingml/2006/wordprocessingDrawing" xmlns:w10="urn:schemas-microsoft-com:office:word" xmlns:w="http://schemas.openxmlformats.org/wordprocessingml/2006/main" xmlns:w14="http://schemas.microsoft.com/office/word/2010/wordml" xmlns:w15="http://schemas.microsoft.com/office/word/2012/wordml" xmlns:w16cex="http://schemas.microsoft.com/office/word/2018/wordml/cex" xmlns:w16cid="http://schemas.microsoft.com/office/word/2016/wordml/cid" xmlns:w16="http://schemas.microsoft.com/office/word/2018/wordml" xmlns:w16du="http://schemas.microsoft.com/office/word/2023/wordml/word16du" xmlns:w16sdtdh="http://schemas.microsoft.com/office/word/2020/wordml/sdtdatahash" xmlns:w16sdtfl="http://schemas.microsoft.com/office/word/2024/wordml/sdtformatlock" xmlns:w16se="http://schemas.microsoft.com/office/word/2015/wordml/symex" xmlns:wpg="http://schemas.microsoft.com/office/word/2010/wordprocessingGroup" xmlns:wpi="http://schemas.microsoft.com/office/word/2010/wordprocessingInk" xmlns:wne="http://schemas.microsoft.com/office/word/2006/wordml" xmlns:wps="http://schemas.microsoft.com/office/word/2010/wordprocessingShape" mc:Ignorable="w14 w15 w16se w16cid w16 w16cex w16sdtdh w16sdtfl w16du wp14">
   <w:abstractNum w:abstractNumId="0" w15:restartNumberingAfterBreak="0">
+    <w:nsid w:val="072F48D8"/>
+    <w:multiLevelType w:val="hybridMultilevel"/>
+    <w:tmpl w:val="9B7694CA"/>
+    <w:lvl w:ilvl="0" w:tplc="0419000F">
+      <w:start w:val="1"/>
+      <w:numFmt w:val="decimal"/>
+      <w:lvlText w:val="%1."/>
+      <w:lvlJc w:val="left"/>
+      <w:pPr>
+        <w:ind w:left="720" w:hanging="360"/>
+      </w:pPr>
+      <w:rPr>
+        <w:rFonts w:hint="default"/>
+      </w:rPr>
+    </w:lvl>
+    <w:lvl w:ilvl="1" w:tplc="04190019" w:tentative="1">
+      <w:start w:val="1"/>
+      <w:numFmt w:val="lowerLetter"/>
+      <w:lvlText w:val="%2."/>
+      <w:lvlJc w:val="left"/>
+      <w:pPr>
+        <w:ind w:left="1440" w:hanging="360"/>
+      </w:pPr>
+    </w:lvl>
+    <w:lvl w:ilvl="2" w:tplc="0419001B" w:tentative="1">
+      <w:start w:val="1"/>
+      <w:numFmt w:val="lowerRoman"/>
+      <w:lvlText w:val="%3."/>
+      <w:lvlJc w:val="right"/>
+      <w:pPr>
+        <w:ind w:left="2160" w:hanging="180"/>
+      </w:pPr>
+    </w:lvl>
+    <w:lvl w:ilvl="3" w:tplc="0419000F" w:tentative="1">
+      <w:start w:val="1"/>
+      <w:numFmt w:val="decimal"/>
+      <w:lvlText w:val="%4."/>
+      <w:lvlJc w:val="left"/>
+      <w:pPr>
+        <w:ind w:left="2880" w:hanging="360"/>
+      </w:pPr>
+    </w:lvl>
+    <w:lvl w:ilvl="4" w:tplc="04190019" w:tentative="1">
+      <w:start w:val="1"/>
+      <w:numFmt w:val="lowerLetter"/>
+      <w:lvlText w:val="%5."/>
+      <w:lvlJc w:val="left"/>
+      <w:pPr>
+        <w:ind w:left="3600" w:hanging="360"/>
+      </w:pPr>
+    </w:lvl>
+    <w:lvl w:ilvl="5" w:tplc="0419001B" w:tentative="1">
+      <w:start w:val="1"/>
+      <w:numFmt w:val="lowerRoman"/>
+      <w:lvlText w:val="%6."/>
+      <w:lvlJc w:val="right"/>
+      <w:pPr>
+        <w:ind w:left="4320" w:hanging="180"/>
+      </w:pPr>
+    </w:lvl>
+    <w:lvl w:ilvl="6" w:tplc="0419000F" w:tentative="1">
+      <w:start w:val="1"/>
+      <w:numFmt w:val="decimal"/>
+      <w:lvlText w:val="%7."/>
+      <w:lvlJc w:val="left"/>
+      <w:pPr>
+        <w:ind w:left="5040" w:hanging="360"/>
+      </w:pPr>
+    </w:lvl>
+    <w:lvl w:ilvl="7" w:tplc="04190019" w:tentative="1">
+      <w:start w:val="1"/>
+      <w:numFmt w:val="lowerLetter"/>
+      <w:lvlText w:val="%8."/>
+      <w:lvlJc w:val="left"/>
+      <w:pPr>
+        <w:ind w:left="5760" w:hanging="360"/>
+      </w:pPr>
+    </w:lvl>
+    <w:lvl w:ilvl="8" w:tplc="0419001B" w:tentative="1">
+      <w:start w:val="1"/>
+      <w:numFmt w:val="lowerRoman"/>
+      <w:lvlText w:val="%9."/>
+      <w:lvlJc w:val="right"/>
+      <w:pPr>
+        <w:ind w:left="6480" w:hanging="180"/>
+      </w:pPr>
+    </w:lvl>
+  </w:abstractNum>
+  <w:abstractNum w:abstractNumId="1" w15:restartNumberingAfterBreak="0">
+    <w:nsid w:val="64E31645"/>
+    <w:multiLevelType w:val="hybridMultilevel"/>
+    <w:tmpl w:val="1B307C96"/>
+    <w:lvl w:ilvl="0" w:tplc="0419000F">
+      <w:start w:val="1"/>
+      <w:numFmt w:val="decimal"/>
+      <w:lvlText w:val="%1."/>
+      <w:lvlJc w:val="left"/>
+      <w:pPr>
+        <w:ind w:left="720" w:hanging="360"/>
+      </w:pPr>
+      <w:rPr>
+        <w:rFonts w:hint="default"/>
+      </w:rPr>
+    </w:lvl>
+    <w:lvl w:ilvl="1" w:tplc="04190019" w:tentative="1">
+      <w:start w:val="1"/>
+      <w:numFmt w:val="lowerLetter"/>
+      <w:lvlText w:val="%2."/>
+      <w:lvlJc w:val="left"/>
+      <w:pPr>
+        <w:ind w:left="1440" w:hanging="360"/>
+      </w:pPr>
+    </w:lvl>
+    <w:lvl w:ilvl="2" w:tplc="0419001B" w:tentative="1">
+      <w:start w:val="1"/>
+      <w:numFmt w:val="lowerRoman"/>
+      <w:lvlText w:val="%3."/>
+      <w:lvlJc w:val="right"/>
+      <w:pPr>
+        <w:ind w:left="2160" w:hanging="180"/>
+      </w:pPr>
+    </w:lvl>
+    <w:lvl w:ilvl="3" w:tplc="0419000F" w:tentative="1">
+      <w:start w:val="1"/>
+      <w:numFmt w:val="decimal"/>
+      <w:lvlText w:val="%4."/>
+      <w:lvlJc w:val="left"/>
+      <w:pPr>
+        <w:ind w:left="2880" w:hanging="360"/>
+      </w:pPr>
+    </w:lvl>
+    <w:lvl w:ilvl="4" w:tplc="04190019" w:tentative="1">
+      <w:start w:val="1"/>
+      <w:numFmt w:val="lowerLetter"/>
+      <w:lvlText w:val="%5."/>
+      <w:lvlJc w:val="left"/>
+      <w:pPr>
+        <w:ind w:left="3600" w:hanging="360"/>
+      </w:pPr>
+    </w:lvl>
+    <w:lvl w:ilvl="5" w:tplc="0419001B" w:tentative="1">
+      <w:start w:val="1"/>
+      <w:numFmt w:val="lowerRoman"/>
+      <w:lvlText w:val="%6."/>
+      <w:lvlJc w:val="right"/>
+      <w:pPr>
+        <w:ind w:left="4320" w:hanging="180"/>
+      </w:pPr>
+    </w:lvl>
+    <w:lvl w:ilvl="6" w:tplc="0419000F" w:tentative="1">
+      <w:start w:val="1"/>
+      <w:numFmt w:val="decimal"/>
+      <w:lvlText w:val="%7."/>
+      <w:lvlJc w:val="left"/>
+      <w:pPr>
+        <w:ind w:left="5040" w:hanging="360"/>
+      </w:pPr>
+    </w:lvl>
+    <w:lvl w:ilvl="7" w:tplc="04190019" w:tentative="1">
+      <w:start w:val="1"/>
+      <w:numFmt w:val="lowerLetter"/>
+      <w:lvlText w:val="%8."/>
+      <w:lvlJc w:val="left"/>
+      <w:pPr>
+        <w:ind w:left="5760" w:hanging="360"/>
+      </w:pPr>
+    </w:lvl>
+    <w:lvl w:ilvl="8" w:tplc="0419001B" w:tentative="1">
+      <w:start w:val="1"/>
+      <w:numFmt w:val="lowerRoman"/>
+      <w:lvlText w:val="%9."/>
+      <w:lvlJc w:val="right"/>
+      <w:pPr>
+        <w:ind w:left="6480" w:hanging="180"/>
+      </w:pPr>
+    </w:lvl>
+  </w:abstractNum>
+  <w:abstractNum w:abstractNumId="2" w15:restartNumberingAfterBreak="0">
+    <w:nsid w:val="7A0C6653"/>
+    <w:multiLevelType w:val="hybridMultilevel"/>
+    <w:tmpl w:val="05D65B1E"/>
+    <w:lvl w:ilvl="0" w:tplc="90EE9F7C">
+      <w:numFmt w:val="bullet"/>
+      <w:lvlText w:val=""/>
+      <w:lvlJc w:val="left"/>
+      <w:pPr>
+        <w:ind w:left="720" w:hanging="360"/>
+      </w:pPr>
+      <w:rPr>
+        <w:rFonts w:ascii="Symbol" w:eastAsiaTheme="minorHAnsi" w:hAnsi="Symbol" w:cstheme="minorBidi" w:hint="default"/>
+      </w:rPr>
+    </w:lvl>
+    <w:lvl w:ilvl="1" w:tplc="04190003" w:tentative="1">
+      <w:start w:val="1"/>
+      <w:numFmt w:val="bullet"/>
+      <w:lvlText w:val="o"/>
+      <w:lvlJc w:val="left"/>
+      <w:pPr>
+        <w:ind w:left="1440" w:hanging="360"/>
+      </w:pPr>
+      <w:rPr>
+        <w:rFonts w:ascii="Courier New" w:hAnsi="Courier New" w:cs="Courier New" w:hint="default"/>
+      </w:rPr>
+    </w:lvl>
+    <w:lvl w:ilvl="2" w:tplc="04190005" w:tentative="1">
+      <w:start w:val="1"/>
+      <w:numFmt w:val="bullet"/>
+      <w:lvlText w:val=""/>
+      <w:lvlJc w:val="left"/>
+      <w:pPr>
+        <w:ind w:left="2160" w:hanging="360"/>
+      </w:pPr>
+      <w:rPr>
+        <w:rFonts w:ascii="Wingdings" w:hAnsi="Wingdings" w:hint="default"/>
+      </w:rPr>
+    </w:lvl>
+    <w:lvl w:ilvl="3" w:tplc="04190001" w:tentative="1">
+      <w:start w:val="1"/>
+      <w:numFmt w:val="bullet"/>
+      <w:lvlText w:val=""/>
+      <w:lvlJc w:val="left"/>
+      <w:pPr>
+        <w:ind w:left="2880" w:hanging="360"/>
+      </w:pPr>
+      <w:rPr>
+        <w:rFonts w:ascii="Symbol" w:hAnsi="Symbol" w:hint="default"/>
+      </w:rPr>
+    </w:lvl>
+    <w:lvl w:ilvl="4" w:tplc="04190003" w:tentative="1">
+      <w:start w:val="1"/>
+      <w:numFmt w:val="bullet"/>
+      <w:lvlText w:val="o"/>
+      <w:lvlJc w:val="left"/>
+      <w:pPr>
+        <w:ind w:left="3600" w:hanging="360"/>
+      </w:pPr>
+      <w:rPr>
+        <w:rFonts w:ascii="Courier New" w:hAnsi="Courier New" w:cs="Courier New" w:hint="default"/>
+      </w:rPr>
+    </w:lvl>
+    <w:lvl w:ilvl="5" w:tplc="04190005" w:tentative="1">
+      <w:start w:val="1"/>
+      <w:numFmt w:val="bullet"/>
+      <w:lvlText w:val=""/>
+      <w:lvlJc w:val="left"/>
+      <w:pPr>
+        <w:ind w:left="4320" w:hanging="360"/>
+      </w:pPr>
+      <w:rPr>
+        <w:rFonts w:ascii="Wingdings" w:hAnsi="Wingdings" w:hint="default"/>
+      </w:rPr>
+    </w:lvl>
+    <w:lvl w:ilvl="6" w:tplc="04190001" w:tentative="1">
+      <w:start w:val="1"/>
+      <w:numFmt w:val="bullet"/>
+      <w:lvlText w:val=""/>
+      <w:lvlJc w:val="left"/>
+      <w:pPr>
+        <w:ind w:left="5040" w:hanging="360"/>
+      </w:pPr>
+      <w:rPr>
+        <w:rFonts w:ascii="Symbol" w:hAnsi="Symbol" w:hint="default"/>
+      </w:rPr>
+    </w:lvl>
+    <w:lvl w:ilvl="7" w:tplc="04190003" w:tentative="1">
+      <w:start w:val="1"/>
+      <w:numFmt w:val="bullet"/>
+      <w:lvlText w:val="o"/>
+      <w:lvlJc w:val="left"/>
+      <w:pPr>
+        <w:ind w:left="5760" w:hanging="360"/>
+      </w:pPr>
+      <w:rPr>
+        <w:rFonts w:ascii="Courier New" w:hAnsi="Courier New" w:cs="Courier New" w:hint="default"/>
+      </w:rPr>
+    </w:lvl>
+    <w:lvl w:ilvl="8" w:tplc="04190005" w:tentative="1">
+      <w:start w:val="1"/>
+      <w:numFmt w:val="bullet"/>
+      <w:lvlText w:val=""/>
+      <w:lvlJc w:val="left"/>
+      <w:pPr>
+        <w:ind w:left="6480" w:hanging="360"/>
+      </w:pPr>
+      <w:rPr>
+        <w:rFonts w:ascii="Wingdings" w:hAnsi="Wingdings" w:hint="default"/>
+      </w:rPr>
+    </w:lvl>
+  </w:abstractNum>
+  <w:abstractNum w:abstractNumId="3" w15:restartNumberingAfterBreak="0">
     <w:nsid w:val="7BED0C21"/>
     <w:multiLevelType w:val="hybridMultilevel"/>
     <w:tmpl w:val="1DBAE204"/>
@@ -152,7 +913,16 @@
     </w:lvl>
   </w:abstractNum>
   <w:num w:numId="1" w16cid:durableId="50275076">
+    <w:abstractNumId w:val="3"/>
+  </w:num>
+  <w:num w:numId="2" w16cid:durableId="862211869">
+    <w:abstractNumId w:val="2"/>
+  </w:num>
+  <w:num w:numId="3" w16cid:durableId="850755467">
     <w:abstractNumId w:val="0"/>
+  </w:num>
+  <w:num w:numId="4" w16cid:durableId="1606229814">
+    <w:abstractNumId w:val="1"/>
   </w:num>
 </w:numbering>
 </file>
@@ -587,7 +1357,7 @@
     <w:uiPriority w:val="9"/>
     <w:unhideWhenUsed/>
     <w:qFormat/>
-    <w:rsid w:val="002952C4"/>
+    <w:rsid w:val="00E44451"/>
     <w:pPr>
       <w:keepNext/>
       <w:keepLines/>
@@ -596,7 +1366,7 @@
     </w:pPr>
     <w:rPr>
       <w:rFonts w:asciiTheme="majorHAnsi" w:eastAsiaTheme="majorEastAsia" w:hAnsiTheme="majorHAnsi" w:cstheme="majorBidi"/>
-      <w:color w:val="0F4761" w:themeColor="accent1" w:themeShade="BF"/>
+      <w:color w:val="000000" w:themeColor="text1"/>
       <w:sz w:val="32"/>
       <w:szCs w:val="32"/>
     </w:rPr>
@@ -759,6 +1529,7 @@
   <w:style w:type="character" w:default="1" w:styleId="DefaultParagraphFont">
     <w:name w:val="Default Paragraph Font"/>
     <w:uiPriority w:val="1"/>
+    <w:semiHidden/>
     <w:unhideWhenUsed/>
   </w:style>
   <w:style w:type="table" w:default="1" w:styleId="TableNormal">
@@ -800,10 +1571,10 @@
     <w:basedOn w:val="DefaultParagraphFont"/>
     <w:link w:val="Heading2"/>
     <w:uiPriority w:val="9"/>
-    <w:rsid w:val="002952C4"/>
+    <w:rsid w:val="00E44451"/>
     <w:rPr>
       <w:rFonts w:asciiTheme="majorHAnsi" w:eastAsiaTheme="majorEastAsia" w:hAnsiTheme="majorHAnsi" w:cstheme="majorBidi"/>
-      <w:color w:val="0F4761" w:themeColor="accent1" w:themeShade="BF"/>
+      <w:color w:val="000000" w:themeColor="text1"/>
       <w:sz w:val="32"/>
       <w:szCs w:val="32"/>
     </w:rPr>

</xml_diff>

<commit_message>
docs: rewrite the first part due to architectural changes
</commit_message>
<xml_diff>
--- a/Work Doc.docx
+++ b/Work Doc.docx
@@ -76,13 +76,28 @@
         <w:rPr>
           <w:lang w:val="en-US"/>
         </w:rPr>
-        <w:t>Markdown</w:t>
+        <w:t>Markdow</w:t>
+      </w:r>
+      <w:r>
+        <w:rPr>
+          <w:lang w:val="en-US"/>
+        </w:rPr>
+        <w:t>n</w:t>
+      </w:r>
+      <w:r>
+        <w:t xml:space="preserve"> и</w:t>
       </w:r>
       <w:r>
         <w:t xml:space="preserve"> </w:t>
       </w:r>
       <w:r>
-        <w:t xml:space="preserve">как с форматом хранения и экспорта написанного текста. Цель такой проектировки – обеспечение максимального удобства, простоты и наглядности редактирования. </w:t>
+        <w:t>использующий исходный текст в процессе изменения</w:t>
+      </w:r>
+      <w:r>
+        <w:t xml:space="preserve">. </w:t>
+      </w:r>
+      <w:r>
+        <w:t xml:space="preserve">Цель такой проектировки – обеспечение максимального удобства, простоты и наглядности редактирования. </w:t>
       </w:r>
     </w:p>
     <w:p>
@@ -95,11 +110,26 @@
         <w:pStyle w:val="ListParagraph"/>
         <w:numPr>
           <w:ilvl w:val="0"/>
-          <w:numId w:val="2"/>
-        </w:numPr>
-      </w:pPr>
-      <w:r>
-        <w:t xml:space="preserve">Создание системы обработки структурированных данных за счёт использования модели документа, а не редактирования исходного </w:t>
+          <w:numId w:val="5"/>
+        </w:numPr>
+      </w:pPr>
+      <w:r>
+        <w:t xml:space="preserve">Создание системы динамической нормализации синтаксиса, обеспечивающей приведение </w:t>
+      </w:r>
+      <w:r>
+        <w:t>различных написаний конструкций к одному виду.</w:t>
+      </w:r>
+    </w:p>
+    <w:p>
+      <w:pPr>
+        <w:pStyle w:val="ListParagraph"/>
+        <w:numPr>
+          <w:ilvl w:val="0"/>
+          <w:numId w:val="5"/>
+        </w:numPr>
+      </w:pPr>
+      <w:r>
+        <w:t xml:space="preserve">Формирование канонического диалекта </w:t>
       </w:r>
       <w:r>
         <w:rPr>
@@ -111,64 +141,88 @@
         <w:t xml:space="preserve"> </w:t>
       </w:r>
       <w:r>
-        <w:t>напрямую.</w:t>
-      </w:r>
-    </w:p>
-    <w:p>
-      <w:pPr>
-        <w:pStyle w:val="ListParagraph"/>
-        <w:numPr>
-          <w:ilvl w:val="0"/>
-          <w:numId w:val="2"/>
-        </w:numPr>
-      </w:pPr>
-      <w:r>
-        <w:t>Обеспечение режима скрытия синтаксиса в неактивных строках.</w:t>
-      </w:r>
-    </w:p>
-    <w:p>
-      <w:pPr>
-        <w:pStyle w:val="ListParagraph"/>
-        <w:numPr>
-          <w:ilvl w:val="0"/>
-          <w:numId w:val="2"/>
-        </w:numPr>
-      </w:pPr>
-      <w:r>
-        <w:t>Обеспечение режима полного скрытия синтаксиса с управлением форматированием через панель инструментов и сочетания клавиш.</w:t>
-      </w:r>
-    </w:p>
-    <w:p>
-      <w:pPr>
-        <w:pStyle w:val="ListParagraph"/>
-        <w:numPr>
-          <w:ilvl w:val="0"/>
-          <w:numId w:val="2"/>
-        </w:numPr>
-      </w:pPr>
-      <w:r>
-        <w:t>Гарантия сохранения внешнего вида документа между загрузками</w:t>
-      </w:r>
-      <w:r>
-        <w:t>.</w:t>
-      </w:r>
-    </w:p>
-    <w:p>
-      <w:pPr>
-        <w:pStyle w:val="ListParagraph"/>
-        <w:numPr>
-          <w:ilvl w:val="0"/>
-          <w:numId w:val="2"/>
-        </w:numPr>
-      </w:pPr>
-      <w:r>
-        <w:t xml:space="preserve">Обеспечение экспорта каждой заметки в </w:t>
+        <w:t>с правилами записи и сериализации в файл.</w:t>
+      </w:r>
+    </w:p>
+    <w:p>
+      <w:pPr>
+        <w:pStyle w:val="ListParagraph"/>
+        <w:numPr>
+          <w:ilvl w:val="0"/>
+          <w:numId w:val="5"/>
+        </w:numPr>
+      </w:pPr>
+      <w:r>
+        <w:t xml:space="preserve"> Обеспечение режима </w:t>
       </w:r>
       <w:r>
         <w:rPr>
           <w:lang w:val="en-US"/>
         </w:rPr>
-        <w:t>Raw</w:t>
+        <w:t>Live</w:t>
+      </w:r>
+      <w:r>
+        <w:t xml:space="preserve"> </w:t>
+      </w:r>
+      <w:r>
+        <w:rPr>
+          <w:lang w:val="en-US"/>
+        </w:rPr>
+        <w:t>Preview</w:t>
+      </w:r>
+      <w:r>
+        <w:t xml:space="preserve"> </w:t>
+      </w:r>
+      <w:r>
+        <w:t>–</w:t>
+      </w:r>
+      <w:r>
+        <w:t xml:space="preserve"> </w:t>
+      </w:r>
+      <w:r>
+        <w:t>скрытия синтаксиса в неактивных строках.</w:t>
+      </w:r>
+    </w:p>
+    <w:p>
+      <w:pPr>
+        <w:pStyle w:val="ListParagraph"/>
+        <w:numPr>
+          <w:ilvl w:val="0"/>
+          <w:numId w:val="5"/>
+        </w:numPr>
+      </w:pPr>
+      <w:r>
+        <w:t>Обеспечение управления форматированием через панель инструментов и систему сочетаний клавиш.</w:t>
+      </w:r>
+    </w:p>
+    <w:p>
+      <w:pPr>
+        <w:pStyle w:val="ListParagraph"/>
+        <w:numPr>
+          <w:ilvl w:val="0"/>
+          <w:numId w:val="5"/>
+        </w:numPr>
+      </w:pPr>
+      <w:r>
+        <w:t>Обеспечение предсказуемости и точности записи и отображения документа за счёт канонического диалекта.</w:t>
+      </w:r>
+    </w:p>
+    <w:p>
+      <w:pPr>
+        <w:pStyle w:val="ListParagraph"/>
+        <w:numPr>
+          <w:ilvl w:val="0"/>
+          <w:numId w:val="5"/>
+        </w:numPr>
+      </w:pPr>
+      <w:r>
+        <w:t xml:space="preserve">Обеспечение экспорта в </w:t>
+      </w:r>
+      <w:r>
+        <w:rPr>
+          <w:lang w:val="en-US"/>
+        </w:rPr>
+        <w:t>RAW</w:t>
       </w:r>
       <w:r>
         <w:t xml:space="preserve"> </w:t>
@@ -179,92 +233,105 @@
         </w:rPr>
         <w:t>Markdown</w:t>
       </w:r>
-      <w:r>
-        <w:t>.</w:t>
-      </w:r>
-    </w:p>
-    <w:p>
-      <w:r>
-        <w:t>Также, для обеспечения полноты пользовательского опыта, в приложении будет реализован ряд функций:</w:t>
-      </w:r>
-    </w:p>
-    <w:p>
-      <w:pPr>
-        <w:pStyle w:val="ListParagraph"/>
-        <w:numPr>
-          <w:ilvl w:val="0"/>
-          <w:numId w:val="2"/>
-        </w:numPr>
-      </w:pPr>
-      <w:r>
-        <w:t>Система папок.</w:t>
-      </w:r>
-    </w:p>
-    <w:p>
-      <w:pPr>
-        <w:pStyle w:val="ListParagraph"/>
-        <w:numPr>
-          <w:ilvl w:val="0"/>
-          <w:numId w:val="2"/>
-        </w:numPr>
-      </w:pPr>
-      <w:r>
-        <w:t>Система поиска заметок и отдельных слов в файлах.</w:t>
-      </w:r>
-    </w:p>
-    <w:p>
-      <w:pPr>
-        <w:pStyle w:val="ListParagraph"/>
-        <w:numPr>
-          <w:ilvl w:val="0"/>
-          <w:numId w:val="2"/>
-        </w:numPr>
-      </w:pPr>
-      <w:r>
-        <w:t>Введение тегов, ссылок и других методов взаимной связи между заметками.</w:t>
-      </w:r>
-    </w:p>
-    <w:p>
-      <w:pPr>
-        <w:pStyle w:val="ListParagraph"/>
-        <w:numPr>
-          <w:ilvl w:val="0"/>
-          <w:numId w:val="2"/>
-        </w:numPr>
-      </w:pPr>
-      <w:r>
-        <w:t>Реализация режима быстрой вставки ссылок из интернета при помощи внутреннего отображения поиска в браузере.</w:t>
-      </w:r>
-    </w:p>
-    <w:p>
-      <w:pPr>
-        <w:pStyle w:val="ListParagraph"/>
-        <w:numPr>
-          <w:ilvl w:val="0"/>
-          <w:numId w:val="2"/>
-        </w:numPr>
-      </w:pPr>
-      <w:r>
-        <w:t>Реализация режима быстрой вставки ссылок на файлы с локальных папок.</w:t>
-      </w:r>
-    </w:p>
-    <w:p>
-      <w:pPr>
-        <w:pStyle w:val="ListParagraph"/>
-        <w:numPr>
-          <w:ilvl w:val="0"/>
-          <w:numId w:val="2"/>
-        </w:numPr>
-      </w:pPr>
-      <w:r>
-        <w:t xml:space="preserve">Создание стилизованного, тактильного </w:t>
-      </w:r>
-      <w:r>
-        <w:t>интерфейса приложения.</w:t>
+    </w:p>
+    <w:p>
+      <w:pPr>
+        <w:pStyle w:val="ListParagraph"/>
+        <w:numPr>
+          <w:ilvl w:val="0"/>
+          <w:numId w:val="5"/>
+        </w:numPr>
+      </w:pPr>
+      <w:r>
+        <w:t>Реализация инкрементального пересчета только измененных фрагментов содержимого.</w:t>
       </w:r>
     </w:p>
     <w:p/>
     <w:p/>
+    <w:p/>
+    <w:p/>
+    <w:p/>
+    <w:p>
+      <w:r>
+        <w:lastRenderedPageBreak/>
+        <w:t>Также, для обеспечения полноты пользовательского опыта, в приложении будет реализован ряд функций:</w:t>
+      </w:r>
+    </w:p>
+    <w:p>
+      <w:pPr>
+        <w:pStyle w:val="ListParagraph"/>
+        <w:numPr>
+          <w:ilvl w:val="0"/>
+          <w:numId w:val="2"/>
+        </w:numPr>
+      </w:pPr>
+      <w:r>
+        <w:t>Система папок.</w:t>
+      </w:r>
+    </w:p>
+    <w:p>
+      <w:pPr>
+        <w:pStyle w:val="ListParagraph"/>
+        <w:numPr>
+          <w:ilvl w:val="0"/>
+          <w:numId w:val="2"/>
+        </w:numPr>
+      </w:pPr>
+      <w:r>
+        <w:t>Система поиска заметок и отдельных слов в файлах.</w:t>
+      </w:r>
+    </w:p>
+    <w:p>
+      <w:pPr>
+        <w:pStyle w:val="ListParagraph"/>
+        <w:numPr>
+          <w:ilvl w:val="0"/>
+          <w:numId w:val="2"/>
+        </w:numPr>
+      </w:pPr>
+      <w:r>
+        <w:t>Введение тегов, ссылок и других методов взаимной связи между заметками.</w:t>
+      </w:r>
+    </w:p>
+    <w:p>
+      <w:pPr>
+        <w:pStyle w:val="ListParagraph"/>
+        <w:numPr>
+          <w:ilvl w:val="0"/>
+          <w:numId w:val="2"/>
+        </w:numPr>
+      </w:pPr>
+      <w:r>
+        <w:t>Реализация режима быстрой вставки ссылок из интернета при помощи внутреннего отображения поиска в браузере.</w:t>
+      </w:r>
+    </w:p>
+    <w:p>
+      <w:pPr>
+        <w:pStyle w:val="ListParagraph"/>
+        <w:numPr>
+          <w:ilvl w:val="0"/>
+          <w:numId w:val="2"/>
+        </w:numPr>
+      </w:pPr>
+      <w:r>
+        <w:t>Реализация режима быстрой вставки ссылок на файлы с локальных папок.</w:t>
+      </w:r>
+    </w:p>
+    <w:p>
+      <w:pPr>
+        <w:pStyle w:val="ListParagraph"/>
+        <w:numPr>
+          <w:ilvl w:val="0"/>
+          <w:numId w:val="2"/>
+        </w:numPr>
+      </w:pPr>
+      <w:r>
+        <w:t xml:space="preserve">Создание стилизованного, тактильного </w:t>
+      </w:r>
+      <w:r>
+        <w:t>интерфейса приложения.</w:t>
+      </w:r>
+    </w:p>
     <w:p>
       <w:pPr>
         <w:pStyle w:val="Heading2"/>
@@ -275,7 +342,6 @@
         <w:jc w:val="center"/>
       </w:pPr>
       <w:r>
-        <w:lastRenderedPageBreak/>
         <w:t>Назначение приложения</w:t>
       </w:r>
     </w:p>
@@ -286,19 +352,9 @@
     </w:p>
     <w:p>
       <w:r>
-        <w:t xml:space="preserve">При разработке упор делается на иммерсивный пользовательский опыт, высокую читаемость текста, отвлечение от работы с исходным </w:t>
-      </w:r>
-      <w:r>
-        <w:rPr>
-          <w:lang w:val="en-US"/>
-        </w:rPr>
-        <w:t>markdown</w:t>
-      </w:r>
-      <w:r>
-        <w:t xml:space="preserve"> и на инструменты, позволяющие редактировать и производить вставку из внешних источников не покидая окно приложения.</w:t>
-      </w:r>
-    </w:p>
-    <w:p/>
+        <w:t>При разработке упор делается на иммерсивный пользовательский опыт, высокую читаемость текста, и на инструменты, позволяющие редактировать и производить вставку из внешних источников не покидая окно приложения.</w:t>
+      </w:r>
+    </w:p>
     <w:p>
       <w:pPr>
         <w:pStyle w:val="Heading2"/>
@@ -374,7 +430,7 @@
         </w:numPr>
       </w:pPr>
       <w:r>
-        <w:t xml:space="preserve">Спроектировать модель документа, хранящую структурированные данные независимо от исходного </w:t>
+        <w:t xml:space="preserve">Спроектировать канонический диалект </w:t>
       </w:r>
       <w:r>
         <w:rPr>
@@ -383,10 +439,7 @@
         <w:t>Markdown</w:t>
       </w:r>
       <w:r>
-        <w:t xml:space="preserve"> </w:t>
-      </w:r>
-      <w:r>
-        <w:t>файла.</w:t>
+        <w:t>.</w:t>
       </w:r>
     </w:p>
     <w:p>
@@ -398,49 +451,19 @@
         </w:numPr>
       </w:pPr>
       <w:r>
-        <w:t xml:space="preserve">Разработать двустороннее преобразование «Исходный файл – модель документа». </w:t>
-      </w:r>
-    </w:p>
-    <w:p>
-      <w:pPr>
-        <w:pStyle w:val="ListParagraph"/>
-        <w:numPr>
-          <w:ilvl w:val="0"/>
-          <w:numId w:val="4"/>
-        </w:numPr>
-      </w:pPr>
-      <w:r>
-        <w:t>Реализовать механизм динамической обработки данных, обновления лишь измененных частей внутренней модели документа.</w:t>
-      </w:r>
-    </w:p>
-    <w:p>
-      <w:pPr>
-        <w:pStyle w:val="ListParagraph"/>
-        <w:numPr>
-          <w:ilvl w:val="0"/>
-          <w:numId w:val="4"/>
-        </w:numPr>
-      </w:pPr>
-      <w:r>
-        <w:t xml:space="preserve">Реализовать режим </w:t>
+        <w:t xml:space="preserve">Реализовать правильную загрузку и построение </w:t>
       </w:r>
       <w:r>
         <w:rPr>
           <w:lang w:val="en-US"/>
         </w:rPr>
-        <w:t>Live</w:t>
+        <w:t>AST</w:t>
       </w:r>
       <w:r>
         <w:t xml:space="preserve"> </w:t>
       </w:r>
       <w:r>
-        <w:rPr>
-          <w:lang w:val="en-US"/>
-        </w:rPr>
-        <w:t>Preview</w:t>
-      </w:r>
-      <w:r>
-        <w:t xml:space="preserve">, обеспечивая при этом строгую сериализацию и чтение при сохранении и чтении исходного </w:t>
+        <w:t xml:space="preserve">при помощи парсера </w:t>
       </w:r>
       <w:r>
         <w:rPr>
@@ -449,7 +472,49 @@
         <w:t>Markdown</w:t>
       </w:r>
       <w:r>
-        <w:t>.</w:t>
+        <w:t xml:space="preserve"> </w:t>
+      </w:r>
+      <w:r>
+        <w:t>текста.</w:t>
+      </w:r>
+    </w:p>
+    <w:p>
+      <w:pPr>
+        <w:pStyle w:val="ListParagraph"/>
+        <w:numPr>
+          <w:ilvl w:val="0"/>
+          <w:numId w:val="4"/>
+        </w:numPr>
+      </w:pPr>
+      <w:r>
+        <w:t xml:space="preserve">Реализовать сериализатор, обеспечивающий </w:t>
+      </w:r>
+      <w:r>
+        <w:t>запись в едином формате.</w:t>
+      </w:r>
+    </w:p>
+    <w:p>
+      <w:pPr>
+        <w:pStyle w:val="ListParagraph"/>
+        <w:numPr>
+          <w:ilvl w:val="0"/>
+          <w:numId w:val="4"/>
+        </w:numPr>
+      </w:pPr>
+      <w:r>
+        <w:t>Реализовать динамическую нормализацию текста.</w:t>
+      </w:r>
+    </w:p>
+    <w:p>
+      <w:pPr>
+        <w:pStyle w:val="ListParagraph"/>
+        <w:numPr>
+          <w:ilvl w:val="0"/>
+          <w:numId w:val="4"/>
+        </w:numPr>
+      </w:pPr>
+      <w:r>
+        <w:t>Реализовать механизм инкрементальной обработки данных.</w:t>
       </w:r>
     </w:p>
     <w:p>
@@ -467,10 +532,7 @@
         <w:rPr>
           <w:lang w:val="en-US"/>
         </w:rPr>
-        <w:t>Full Render</w:t>
-      </w:r>
-      <w:r>
-        <w:t>.</w:t>
+        <w:t>Live Preview.</w:t>
       </w:r>
     </w:p>
     <w:p>
@@ -482,7 +544,7 @@
         </w:numPr>
       </w:pPr>
       <w:r>
-        <w:t>Реализовать систему хранения заметок.</w:t>
+        <w:t>Разработать панель инструментов и систему горячих клавиш.</w:t>
       </w:r>
     </w:p>
     <w:p>
@@ -494,7 +556,7 @@
         </w:numPr>
       </w:pPr>
       <w:r>
-        <w:t>Разработать систему работы со ссылками.</w:t>
+        <w:t>Реализовать детальную систему хранения заметок.</w:t>
       </w:r>
     </w:p>
     <w:p>
@@ -506,7 +568,7 @@
         </w:numPr>
       </w:pPr>
       <w:r>
-        <w:t>Разработать пользовательский интерфейс.</w:t>
+        <w:t>Реализовать систему связи между заметками и файлами на локальной машине.</w:t>
       </w:r>
     </w:p>
     <w:p>
@@ -518,7 +580,31 @@
         </w:numPr>
       </w:pPr>
       <w:r>
-        <w:t>Протестировать и оценить удобство использования приложения.</w:t>
+        <w:t>Реализовать работу с внешними ссылками.</w:t>
+      </w:r>
+    </w:p>
+    <w:p>
+      <w:pPr>
+        <w:pStyle w:val="ListParagraph"/>
+        <w:numPr>
+          <w:ilvl w:val="0"/>
+          <w:numId w:val="4"/>
+        </w:numPr>
+      </w:pPr>
+      <w:r>
+        <w:t>Разработать тактильный пользовательский интерфейс.</w:t>
+      </w:r>
+    </w:p>
+    <w:p>
+      <w:pPr>
+        <w:pStyle w:val="ListParagraph"/>
+        <w:numPr>
+          <w:ilvl w:val="0"/>
+          <w:numId w:val="4"/>
+        </w:numPr>
+      </w:pPr>
+      <w:r>
+        <w:t>Протестировать программу.</w:t>
       </w:r>
     </w:p>
     <w:sectPr>
@@ -824,6 +910,118 @@
     </w:lvl>
   </w:abstractNum>
   <w:abstractNum w:abstractNumId="3" w15:restartNumberingAfterBreak="0">
+    <w:nsid w:val="7A9870C3"/>
+    <w:multiLevelType w:val="hybridMultilevel"/>
+    <w:tmpl w:val="689A5B82"/>
+    <w:lvl w:ilvl="0" w:tplc="FB86CA38">
+      <w:numFmt w:val="bullet"/>
+      <w:lvlText w:val=""/>
+      <w:lvlJc w:val="left"/>
+      <w:pPr>
+        <w:ind w:left="720" w:hanging="360"/>
+      </w:pPr>
+      <w:rPr>
+        <w:rFonts w:ascii="Symbol" w:eastAsiaTheme="minorHAnsi" w:hAnsi="Symbol" w:cstheme="minorBidi" w:hint="default"/>
+      </w:rPr>
+    </w:lvl>
+    <w:lvl w:ilvl="1" w:tplc="04190003" w:tentative="1">
+      <w:start w:val="1"/>
+      <w:numFmt w:val="bullet"/>
+      <w:lvlText w:val="o"/>
+      <w:lvlJc w:val="left"/>
+      <w:pPr>
+        <w:ind w:left="1440" w:hanging="360"/>
+      </w:pPr>
+      <w:rPr>
+        <w:rFonts w:ascii="Courier New" w:hAnsi="Courier New" w:cs="Courier New" w:hint="default"/>
+      </w:rPr>
+    </w:lvl>
+    <w:lvl w:ilvl="2" w:tplc="04190005" w:tentative="1">
+      <w:start w:val="1"/>
+      <w:numFmt w:val="bullet"/>
+      <w:lvlText w:val=""/>
+      <w:lvlJc w:val="left"/>
+      <w:pPr>
+        <w:ind w:left="2160" w:hanging="360"/>
+      </w:pPr>
+      <w:rPr>
+        <w:rFonts w:ascii="Wingdings" w:hAnsi="Wingdings" w:hint="default"/>
+      </w:rPr>
+    </w:lvl>
+    <w:lvl w:ilvl="3" w:tplc="04190001" w:tentative="1">
+      <w:start w:val="1"/>
+      <w:numFmt w:val="bullet"/>
+      <w:lvlText w:val=""/>
+      <w:lvlJc w:val="left"/>
+      <w:pPr>
+        <w:ind w:left="2880" w:hanging="360"/>
+      </w:pPr>
+      <w:rPr>
+        <w:rFonts w:ascii="Symbol" w:hAnsi="Symbol" w:hint="default"/>
+      </w:rPr>
+    </w:lvl>
+    <w:lvl w:ilvl="4" w:tplc="04190003" w:tentative="1">
+      <w:start w:val="1"/>
+      <w:numFmt w:val="bullet"/>
+      <w:lvlText w:val="o"/>
+      <w:lvlJc w:val="left"/>
+      <w:pPr>
+        <w:ind w:left="3600" w:hanging="360"/>
+      </w:pPr>
+      <w:rPr>
+        <w:rFonts w:ascii="Courier New" w:hAnsi="Courier New" w:cs="Courier New" w:hint="default"/>
+      </w:rPr>
+    </w:lvl>
+    <w:lvl w:ilvl="5" w:tplc="04190005" w:tentative="1">
+      <w:start w:val="1"/>
+      <w:numFmt w:val="bullet"/>
+      <w:lvlText w:val=""/>
+      <w:lvlJc w:val="left"/>
+      <w:pPr>
+        <w:ind w:left="4320" w:hanging="360"/>
+      </w:pPr>
+      <w:rPr>
+        <w:rFonts w:ascii="Wingdings" w:hAnsi="Wingdings" w:hint="default"/>
+      </w:rPr>
+    </w:lvl>
+    <w:lvl w:ilvl="6" w:tplc="04190001" w:tentative="1">
+      <w:start w:val="1"/>
+      <w:numFmt w:val="bullet"/>
+      <w:lvlText w:val=""/>
+      <w:lvlJc w:val="left"/>
+      <w:pPr>
+        <w:ind w:left="5040" w:hanging="360"/>
+      </w:pPr>
+      <w:rPr>
+        <w:rFonts w:ascii="Symbol" w:hAnsi="Symbol" w:hint="default"/>
+      </w:rPr>
+    </w:lvl>
+    <w:lvl w:ilvl="7" w:tplc="04190003" w:tentative="1">
+      <w:start w:val="1"/>
+      <w:numFmt w:val="bullet"/>
+      <w:lvlText w:val="o"/>
+      <w:lvlJc w:val="left"/>
+      <w:pPr>
+        <w:ind w:left="5760" w:hanging="360"/>
+      </w:pPr>
+      <w:rPr>
+        <w:rFonts w:ascii="Courier New" w:hAnsi="Courier New" w:cs="Courier New" w:hint="default"/>
+      </w:rPr>
+    </w:lvl>
+    <w:lvl w:ilvl="8" w:tplc="04190005" w:tentative="1">
+      <w:start w:val="1"/>
+      <w:numFmt w:val="bullet"/>
+      <w:lvlText w:val=""/>
+      <w:lvlJc w:val="left"/>
+      <w:pPr>
+        <w:ind w:left="6480" w:hanging="360"/>
+      </w:pPr>
+      <w:rPr>
+        <w:rFonts w:ascii="Wingdings" w:hAnsi="Wingdings" w:hint="default"/>
+      </w:rPr>
+    </w:lvl>
+  </w:abstractNum>
+  <w:abstractNum w:abstractNumId="4" w15:restartNumberingAfterBreak="0">
     <w:nsid w:val="7BED0C21"/>
     <w:multiLevelType w:val="hybridMultilevel"/>
     <w:tmpl w:val="1DBAE204"/>
@@ -913,7 +1111,7 @@
     </w:lvl>
   </w:abstractNum>
   <w:num w:numId="1" w16cid:durableId="50275076">
-    <w:abstractNumId w:val="3"/>
+    <w:abstractNumId w:val="4"/>
   </w:num>
   <w:num w:numId="2" w16cid:durableId="862211869">
     <w:abstractNumId w:val="2"/>
@@ -923,6 +1121,9 @@
   </w:num>
   <w:num w:numId="4" w16cid:durableId="1606229814">
     <w:abstractNumId w:val="1"/>
+  </w:num>
+  <w:num w:numId="5" w16cid:durableId="1861312040">
+    <w:abstractNumId w:val="3"/>
   </w:num>
 </w:numbering>
 </file>

</xml_diff>

<commit_message>
docs: add a point about caching in work objectives
</commit_message>
<xml_diff>
--- a/Work Doc.docx
+++ b/Work Doc.docx
@@ -492,6 +492,9 @@
       <w:r>
         <w:t>запись в едином формате.</w:t>
       </w:r>
+      <w:r>
+        <w:t>ы</w:t>
+      </w:r>
     </w:p>
     <w:p>
       <w:pPr>
@@ -568,6 +571,18 @@
         </w:numPr>
       </w:pPr>
       <w:r>
+        <w:t>Обеспечить оптимизацию загрузки и отображения заметок при помощи кэширования.</w:t>
+      </w:r>
+    </w:p>
+    <w:p>
+      <w:pPr>
+        <w:pStyle w:val="ListParagraph"/>
+        <w:numPr>
+          <w:ilvl w:val="0"/>
+          <w:numId w:val="4"/>
+        </w:numPr>
+      </w:pPr>
+      <w:r>
         <w:t>Реализовать систему связи между заметками и файлами на локальной машине.</w:t>
       </w:r>
     </w:p>
@@ -604,6 +619,7 @@
         </w:numPr>
       </w:pPr>
       <w:r>
+        <w:lastRenderedPageBreak/>
         <w:t>Протестировать программу.</w:t>
       </w:r>
     </w:p>

</xml_diff>

<commit_message>
docs: start to add existing apps info
</commit_message>
<xml_diff>
--- a/Work Doc.docx
+++ b/Work Doc.docx
@@ -606,13 +606,272 @@
       </w:r>
     </w:p>
     <w:p/>
-    <w:p>
-      <w:pPr>
+    <w:p/>
+    <w:p/>
+    <w:p>
+      <w:pPr>
+        <w:pStyle w:val="Heading1"/>
+        <w:jc w:val="center"/>
+      </w:pPr>
+      <w:r>
+        <w:lastRenderedPageBreak/>
+        <w:t>Глава 1. Проектирование</w:t>
+      </w:r>
+    </w:p>
+    <w:p/>
+    <w:p>
+      <w:pPr>
+        <w:pStyle w:val="Heading2"/>
+        <w:numPr>
+          <w:ilvl w:val="1"/>
+          <w:numId w:val="10"/>
+        </w:numPr>
+        <w:jc w:val="center"/>
+      </w:pPr>
+      <w:r>
+        <w:t>Анализ существующих решений.</w:t>
+      </w:r>
+    </w:p>
+    <w:p>
+      <w:r>
+        <w:t xml:space="preserve">Ближайшими по функционалу приложениями, работающими с </w:t>
+      </w:r>
+      <w:r>
         <w:rPr>
           <w:lang w:val="en-US"/>
         </w:rPr>
-      </w:pPr>
-    </w:p>
+        <w:t>md</w:t>
+      </w:r>
+      <w:r>
+        <w:t xml:space="preserve"> </w:t>
+      </w:r>
+      <w:r>
+        <w:t>форматом и реализующими похожие функции являются:</w:t>
+      </w:r>
+    </w:p>
+    <w:p>
+      <w:pPr>
+        <w:pStyle w:val="ListParagraph"/>
+        <w:numPr>
+          <w:ilvl w:val="0"/>
+          <w:numId w:val="2"/>
+        </w:numPr>
+      </w:pPr>
+      <w:r>
+        <w:rPr>
+          <w:lang w:val="en-US"/>
+        </w:rPr>
+        <w:t>Obsidian</w:t>
+      </w:r>
+    </w:p>
+    <w:p>
+      <w:pPr>
+        <w:pStyle w:val="ListParagraph"/>
+        <w:numPr>
+          <w:ilvl w:val="0"/>
+          <w:numId w:val="2"/>
+        </w:numPr>
+      </w:pPr>
+      <w:proofErr w:type="spellStart"/>
+      <w:r>
+        <w:rPr>
+          <w:lang w:val="en-US"/>
+        </w:rPr>
+        <w:t>Typora</w:t>
+      </w:r>
+      <w:proofErr w:type="spellEnd"/>
+    </w:p>
+    <w:p>
+      <w:pPr>
+        <w:pStyle w:val="ListParagraph"/>
+        <w:numPr>
+          <w:ilvl w:val="0"/>
+          <w:numId w:val="2"/>
+        </w:numPr>
+      </w:pPr>
+      <w:proofErr w:type="spellStart"/>
+      <w:r>
+        <w:rPr>
+          <w:lang w:val="en-US"/>
+        </w:rPr>
+        <w:t>MarkText</w:t>
+      </w:r>
+      <w:proofErr w:type="spellEnd"/>
+    </w:p>
+    <w:p>
+      <w:r>
+        <w:t>Рассмотрим ключевой функционал каждого из них:</w:t>
+      </w:r>
+    </w:p>
+    <w:p>
+      <w:pPr>
+        <w:pStyle w:val="ListParagraph"/>
+        <w:numPr>
+          <w:ilvl w:val="0"/>
+          <w:numId w:val="11"/>
+        </w:numPr>
+      </w:pPr>
+      <w:r>
+        <w:rPr>
+          <w:lang w:val="en-US"/>
+        </w:rPr>
+        <w:t>Obsidian</w:t>
+      </w:r>
+      <w:r>
+        <w:t xml:space="preserve"> – </w:t>
+      </w:r>
+      <w:r>
+        <w:t xml:space="preserve">является самым близким приложением по задумке реализации – это </w:t>
+      </w:r>
+      <w:r>
+        <w:rPr>
+          <w:lang w:val="en-US"/>
+        </w:rPr>
+        <w:t>Markdown</w:t>
+      </w:r>
+      <w:r>
+        <w:t>-редактор, позиционирующий себя как личную базу знаний. Для пополнения функционалом имеет систему разработки и загрузки плагинов, созданных другими пользователями.</w:t>
+      </w:r>
+    </w:p>
+    <w:p>
+      <w:r>
+        <w:rPr>
+          <w:b/>
+          <w:bCs/>
+        </w:rPr>
+        <w:t xml:space="preserve">Файловая система и хранение заметок </w:t>
+      </w:r>
+      <w:r>
+        <w:t>– заметки хранятся локально, в формате .</w:t>
+      </w:r>
+      <w:r>
+        <w:rPr>
+          <w:lang w:val="en-US"/>
+        </w:rPr>
+        <w:t>md</w:t>
+      </w:r>
+      <w:r>
+        <w:t xml:space="preserve"> </w:t>
+      </w:r>
+      <w:r>
+        <w:t>в специальной папке – хранилище. Содержимое хранилища:</w:t>
+      </w:r>
+    </w:p>
+    <w:p>
+      <w:pPr>
+        <w:pStyle w:val="ListParagraph"/>
+        <w:numPr>
+          <w:ilvl w:val="0"/>
+          <w:numId w:val="2"/>
+        </w:numPr>
+      </w:pPr>
+      <w:r>
+        <w:t xml:space="preserve">Папка, хранящая заметки в чистом виде. Иерархическая система полностью соответствует созданной пользователем в приложении. В папке хранятся файлы </w:t>
+      </w:r>
+      <w:r>
+        <w:t>.</w:t>
+      </w:r>
+      <w:r>
+        <w:rPr>
+          <w:lang w:val="en-US"/>
+        </w:rPr>
+        <w:t>md</w:t>
+      </w:r>
+      <w:r>
+        <w:t>, вставленные картинки и другие локальные данные, созданные или вставленные пользователем</w:t>
+      </w:r>
+    </w:p>
+    <w:p>
+      <w:pPr>
+        <w:pStyle w:val="ListParagraph"/>
+        <w:numPr>
+          <w:ilvl w:val="0"/>
+          <w:numId w:val="2"/>
+        </w:numPr>
+      </w:pPr>
+      <w:r>
+        <w:t xml:space="preserve">Папка </w:t>
+      </w:r>
+      <w:proofErr w:type="gramStart"/>
+      <w:r>
+        <w:t>«</w:t>
+      </w:r>
+      <w:r>
+        <w:t>.</w:t>
+      </w:r>
+      <w:r>
+        <w:rPr>
+          <w:lang w:val="en-US"/>
+        </w:rPr>
+        <w:t>obsidian</w:t>
+      </w:r>
+      <w:proofErr w:type="gramEnd"/>
+      <w:r>
+        <w:t>», содержащая конфигурацию самого приложения, настройки тем, плагинов сообщества.</w:t>
+      </w:r>
+    </w:p>
+    <w:p>
+      <w:r>
+        <w:rPr>
+          <w:b/>
+          <w:bCs/>
+        </w:rPr>
+        <w:t xml:space="preserve">Обработка данных с синтаксической разметкой </w:t>
+      </w:r>
+      <w:r>
+        <w:t>–</w:t>
+      </w:r>
+      <w:r>
+        <w:t xml:space="preserve"> </w:t>
+      </w:r>
+      <w:r>
+        <w:rPr>
+          <w:lang w:val="en-US"/>
+        </w:rPr>
+        <w:t>Obsidian</w:t>
+      </w:r>
+      <w:r>
+        <w:t xml:space="preserve"> </w:t>
+      </w:r>
+      <w:r>
+        <w:t xml:space="preserve">использует редактор </w:t>
+      </w:r>
+      <w:proofErr w:type="spellStart"/>
+      <w:r>
+        <w:rPr>
+          <w:lang w:val="en-US"/>
+        </w:rPr>
+        <w:t>CodeMirror</w:t>
+      </w:r>
+      <w:proofErr w:type="spellEnd"/>
+      <w:r>
+        <w:t xml:space="preserve"> и, соответственно, систему парсинга </w:t>
+      </w:r>
+      <w:r>
+        <w:rPr>
+          <w:lang w:val="en-US"/>
+        </w:rPr>
+        <w:t>Lezer</w:t>
+      </w:r>
+      <w:r>
+        <w:t xml:space="preserve">, </w:t>
+      </w:r>
+      <w:r>
+        <w:t xml:space="preserve">являющуюся частью экосистемы </w:t>
+      </w:r>
+      <w:proofErr w:type="spellStart"/>
+      <w:r>
+        <w:rPr>
+          <w:lang w:val="en-US"/>
+        </w:rPr>
+        <w:t>CodeMirror</w:t>
+      </w:r>
+      <w:proofErr w:type="spellEnd"/>
+      <w:r>
+        <w:t xml:space="preserve"> 6.</w:t>
+      </w:r>
+    </w:p>
+    <w:p/>
     <w:sectPr>
       <w:pgSz w:w="11906" w:h="16838"/>
       <w:pgMar w:top="1440" w:right="1440" w:bottom="1440" w:left="1440" w:header="708" w:footer="708" w:gutter="0"/>
@@ -715,6 +974,95 @@
     </w:lvl>
   </w:abstractNum>
   <w:abstractNum w:abstractNumId="1" w15:restartNumberingAfterBreak="0">
+    <w:nsid w:val="0B9F0B9A"/>
+    <w:multiLevelType w:val="hybridMultilevel"/>
+    <w:tmpl w:val="51523EF6"/>
+    <w:lvl w:ilvl="0" w:tplc="0419000F">
+      <w:start w:val="1"/>
+      <w:numFmt w:val="decimal"/>
+      <w:lvlText w:val="%1."/>
+      <w:lvlJc w:val="left"/>
+      <w:pPr>
+        <w:ind w:left="720" w:hanging="360"/>
+      </w:pPr>
+      <w:rPr>
+        <w:rFonts w:hint="default"/>
+      </w:rPr>
+    </w:lvl>
+    <w:lvl w:ilvl="1" w:tplc="04190019" w:tentative="1">
+      <w:start w:val="1"/>
+      <w:numFmt w:val="lowerLetter"/>
+      <w:lvlText w:val="%2."/>
+      <w:lvlJc w:val="left"/>
+      <w:pPr>
+        <w:ind w:left="1440" w:hanging="360"/>
+      </w:pPr>
+    </w:lvl>
+    <w:lvl w:ilvl="2" w:tplc="0419001B" w:tentative="1">
+      <w:start w:val="1"/>
+      <w:numFmt w:val="lowerRoman"/>
+      <w:lvlText w:val="%3."/>
+      <w:lvlJc w:val="right"/>
+      <w:pPr>
+        <w:ind w:left="2160" w:hanging="180"/>
+      </w:pPr>
+    </w:lvl>
+    <w:lvl w:ilvl="3" w:tplc="0419000F" w:tentative="1">
+      <w:start w:val="1"/>
+      <w:numFmt w:val="decimal"/>
+      <w:lvlText w:val="%4."/>
+      <w:lvlJc w:val="left"/>
+      <w:pPr>
+        <w:ind w:left="2880" w:hanging="360"/>
+      </w:pPr>
+    </w:lvl>
+    <w:lvl w:ilvl="4" w:tplc="04190019" w:tentative="1">
+      <w:start w:val="1"/>
+      <w:numFmt w:val="lowerLetter"/>
+      <w:lvlText w:val="%5."/>
+      <w:lvlJc w:val="left"/>
+      <w:pPr>
+        <w:ind w:left="3600" w:hanging="360"/>
+      </w:pPr>
+    </w:lvl>
+    <w:lvl w:ilvl="5" w:tplc="0419001B" w:tentative="1">
+      <w:start w:val="1"/>
+      <w:numFmt w:val="lowerRoman"/>
+      <w:lvlText w:val="%6."/>
+      <w:lvlJc w:val="right"/>
+      <w:pPr>
+        <w:ind w:left="4320" w:hanging="180"/>
+      </w:pPr>
+    </w:lvl>
+    <w:lvl w:ilvl="6" w:tplc="0419000F" w:tentative="1">
+      <w:start w:val="1"/>
+      <w:numFmt w:val="decimal"/>
+      <w:lvlText w:val="%7."/>
+      <w:lvlJc w:val="left"/>
+      <w:pPr>
+        <w:ind w:left="5040" w:hanging="360"/>
+      </w:pPr>
+    </w:lvl>
+    <w:lvl w:ilvl="7" w:tplc="04190019" w:tentative="1">
+      <w:start w:val="1"/>
+      <w:numFmt w:val="lowerLetter"/>
+      <w:lvlText w:val="%8."/>
+      <w:lvlJc w:val="left"/>
+      <w:pPr>
+        <w:ind w:left="5760" w:hanging="360"/>
+      </w:pPr>
+    </w:lvl>
+    <w:lvl w:ilvl="8" w:tplc="0419001B" w:tentative="1">
+      <w:start w:val="1"/>
+      <w:numFmt w:val="lowerRoman"/>
+      <w:lvlText w:val="%9."/>
+      <w:lvlJc w:val="right"/>
+      <w:pPr>
+        <w:ind w:left="6480" w:hanging="180"/>
+      </w:pPr>
+    </w:lvl>
+  </w:abstractNum>
+  <w:abstractNum w:abstractNumId="2" w15:restartNumberingAfterBreak="0">
     <w:nsid w:val="17E014D7"/>
     <w:multiLevelType w:val="hybridMultilevel"/>
     <w:tmpl w:val="A8E62FD2"/>
@@ -803,7 +1151,7 @@
       </w:pPr>
     </w:lvl>
   </w:abstractNum>
-  <w:abstractNum w:abstractNumId="2" w15:restartNumberingAfterBreak="0">
+  <w:abstractNum w:abstractNumId="3" w15:restartNumberingAfterBreak="0">
     <w:nsid w:val="1A950D3F"/>
     <w:multiLevelType w:val="multilevel"/>
     <w:tmpl w:val="CFCC74EE"/>
@@ -916,7 +1264,7 @@
       </w:rPr>
     </w:lvl>
   </w:abstractNum>
-  <w:abstractNum w:abstractNumId="3" w15:restartNumberingAfterBreak="0">
+  <w:abstractNum w:abstractNumId="4" w15:restartNumberingAfterBreak="0">
     <w:nsid w:val="3E935E57"/>
     <w:multiLevelType w:val="multilevel"/>
     <w:tmpl w:val="11508DA8"/>
@@ -1029,7 +1377,120 @@
       </w:rPr>
     </w:lvl>
   </w:abstractNum>
-  <w:abstractNum w:abstractNumId="4" w15:restartNumberingAfterBreak="0">
+  <w:abstractNum w:abstractNumId="5" w15:restartNumberingAfterBreak="0">
+    <w:nsid w:val="61AB1E30"/>
+    <w:multiLevelType w:val="multilevel"/>
+    <w:tmpl w:val="B6DE0C88"/>
+    <w:lvl w:ilvl="0">
+      <w:start w:val="1"/>
+      <w:numFmt w:val="decimal"/>
+      <w:lvlText w:val="%1."/>
+      <w:lvlJc w:val="left"/>
+      <w:pPr>
+        <w:ind w:left="480" w:hanging="480"/>
+      </w:pPr>
+      <w:rPr>
+        <w:rFonts w:hint="default"/>
+      </w:rPr>
+    </w:lvl>
+    <w:lvl w:ilvl="1">
+      <w:start w:val="1"/>
+      <w:numFmt w:val="decimal"/>
+      <w:lvlText w:val="%1.%2."/>
+      <w:lvlJc w:val="left"/>
+      <w:pPr>
+        <w:ind w:left="720" w:hanging="720"/>
+      </w:pPr>
+      <w:rPr>
+        <w:rFonts w:hint="default"/>
+      </w:rPr>
+    </w:lvl>
+    <w:lvl w:ilvl="2">
+      <w:start w:val="1"/>
+      <w:numFmt w:val="decimal"/>
+      <w:lvlText w:val="%1.%2.%3."/>
+      <w:lvlJc w:val="left"/>
+      <w:pPr>
+        <w:ind w:left="1080" w:hanging="1080"/>
+      </w:pPr>
+      <w:rPr>
+        <w:rFonts w:hint="default"/>
+      </w:rPr>
+    </w:lvl>
+    <w:lvl w:ilvl="3">
+      <w:start w:val="1"/>
+      <w:numFmt w:val="decimal"/>
+      <w:lvlText w:val="%1.%2.%3.%4."/>
+      <w:lvlJc w:val="left"/>
+      <w:pPr>
+        <w:ind w:left="1080" w:hanging="1080"/>
+      </w:pPr>
+      <w:rPr>
+        <w:rFonts w:hint="default"/>
+      </w:rPr>
+    </w:lvl>
+    <w:lvl w:ilvl="4">
+      <w:start w:val="1"/>
+      <w:numFmt w:val="decimal"/>
+      <w:lvlText w:val="%1.%2.%3.%4.%5."/>
+      <w:lvlJc w:val="left"/>
+      <w:pPr>
+        <w:ind w:left="1440" w:hanging="1440"/>
+      </w:pPr>
+      <w:rPr>
+        <w:rFonts w:hint="default"/>
+      </w:rPr>
+    </w:lvl>
+    <w:lvl w:ilvl="5">
+      <w:start w:val="1"/>
+      <w:numFmt w:val="decimal"/>
+      <w:lvlText w:val="%1.%2.%3.%4.%5.%6."/>
+      <w:lvlJc w:val="left"/>
+      <w:pPr>
+        <w:ind w:left="1800" w:hanging="1800"/>
+      </w:pPr>
+      <w:rPr>
+        <w:rFonts w:hint="default"/>
+      </w:rPr>
+    </w:lvl>
+    <w:lvl w:ilvl="6">
+      <w:start w:val="1"/>
+      <w:numFmt w:val="decimal"/>
+      <w:lvlText w:val="%1.%2.%3.%4.%5.%6.%7."/>
+      <w:lvlJc w:val="left"/>
+      <w:pPr>
+        <w:ind w:left="1800" w:hanging="1800"/>
+      </w:pPr>
+      <w:rPr>
+        <w:rFonts w:hint="default"/>
+      </w:rPr>
+    </w:lvl>
+    <w:lvl w:ilvl="7">
+      <w:start w:val="1"/>
+      <w:numFmt w:val="decimal"/>
+      <w:lvlText w:val="%1.%2.%3.%4.%5.%6.%7.%8."/>
+      <w:lvlJc w:val="left"/>
+      <w:pPr>
+        <w:ind w:left="2160" w:hanging="2160"/>
+      </w:pPr>
+      <w:rPr>
+        <w:rFonts w:hint="default"/>
+      </w:rPr>
+    </w:lvl>
+    <w:lvl w:ilvl="8">
+      <w:start w:val="1"/>
+      <w:numFmt w:val="decimal"/>
+      <w:lvlText w:val="%1.%2.%3.%4.%5.%6.%7.%8.%9."/>
+      <w:lvlJc w:val="left"/>
+      <w:pPr>
+        <w:ind w:left="2520" w:hanging="2520"/>
+      </w:pPr>
+      <w:rPr>
+        <w:rFonts w:hint="default"/>
+      </w:rPr>
+    </w:lvl>
+  </w:abstractNum>
+  <w:abstractNum w:abstractNumId="6" w15:restartNumberingAfterBreak="0">
     <w:nsid w:val="64E31645"/>
     <w:multiLevelType w:val="hybridMultilevel"/>
     <w:tmpl w:val="1B307C96"/>
@@ -1118,7 +1579,7 @@
       </w:pPr>
     </w:lvl>
   </w:abstractNum>
-  <w:abstractNum w:abstractNumId="5" w15:restartNumberingAfterBreak="0">
+  <w:abstractNum w:abstractNumId="7" w15:restartNumberingAfterBreak="0">
     <w:nsid w:val="6FE90BBD"/>
     <w:multiLevelType w:val="multilevel"/>
     <w:tmpl w:val="18CA620A"/>
@@ -1231,7 +1692,7 @@
       </w:rPr>
     </w:lvl>
   </w:abstractNum>
-  <w:abstractNum w:abstractNumId="6" w15:restartNumberingAfterBreak="0">
+  <w:abstractNum w:abstractNumId="8" w15:restartNumberingAfterBreak="0">
     <w:nsid w:val="7A0C6653"/>
     <w:multiLevelType w:val="hybridMultilevel"/>
     <w:tmpl w:val="05D65B1E"/>
@@ -1343,7 +1804,7 @@
       </w:rPr>
     </w:lvl>
   </w:abstractNum>
-  <w:abstractNum w:abstractNumId="7" w15:restartNumberingAfterBreak="0">
+  <w:abstractNum w:abstractNumId="9" w15:restartNumberingAfterBreak="0">
     <w:nsid w:val="7A9870C3"/>
     <w:multiLevelType w:val="hybridMultilevel"/>
     <w:tmpl w:val="689A5B82"/>
@@ -1455,7 +1916,7 @@
       </w:rPr>
     </w:lvl>
   </w:abstractNum>
-  <w:abstractNum w:abstractNumId="8" w15:restartNumberingAfterBreak="0">
+  <w:abstractNum w:abstractNumId="10" w15:restartNumberingAfterBreak="0">
     <w:nsid w:val="7BED0C21"/>
     <w:multiLevelType w:val="hybridMultilevel"/>
     <w:tmpl w:val="1DBAE204"/>
@@ -1545,30 +2006,36 @@
     </w:lvl>
   </w:abstractNum>
   <w:num w:numId="1" w16cid:durableId="50275076">
-    <w:abstractNumId w:val="8"/>
+    <w:abstractNumId w:val="10"/>
   </w:num>
   <w:num w:numId="2" w16cid:durableId="862211869">
-    <w:abstractNumId w:val="6"/>
+    <w:abstractNumId w:val="8"/>
   </w:num>
   <w:num w:numId="3" w16cid:durableId="850755467">
     <w:abstractNumId w:val="0"/>
   </w:num>
   <w:num w:numId="4" w16cid:durableId="1606229814">
+    <w:abstractNumId w:val="6"/>
+  </w:num>
+  <w:num w:numId="5" w16cid:durableId="1861312040">
+    <w:abstractNumId w:val="9"/>
+  </w:num>
+  <w:num w:numId="6" w16cid:durableId="1001928035">
+    <w:abstractNumId w:val="7"/>
+  </w:num>
+  <w:num w:numId="7" w16cid:durableId="1690528476">
     <w:abstractNumId w:val="4"/>
   </w:num>
-  <w:num w:numId="5" w16cid:durableId="1861312040">
-    <w:abstractNumId w:val="7"/>
+  <w:num w:numId="8" w16cid:durableId="901671374">
+    <w:abstractNumId w:val="3"/>
   </w:num>
-  <w:num w:numId="6" w16cid:durableId="1001928035">
+  <w:num w:numId="9" w16cid:durableId="795946292">
+    <w:abstractNumId w:val="2"/>
+  </w:num>
+  <w:num w:numId="10" w16cid:durableId="136802771">
     <w:abstractNumId w:val="5"/>
   </w:num>
-  <w:num w:numId="7" w16cid:durableId="1690528476">
-    <w:abstractNumId w:val="3"/>
-  </w:num>
-  <w:num w:numId="8" w16cid:durableId="901671374">
-    <w:abstractNumId w:val="2"/>
-  </w:num>
-  <w:num w:numId="9" w16cid:durableId="795946292">
+  <w:num w:numId="11" w16cid:durableId="2085296193">
     <w:abstractNumId w:val="1"/>
   </w:num>
 </w:numbering>
@@ -1974,6 +2441,7 @@
   <w:style w:type="paragraph" w:default="1" w:styleId="Normal">
     <w:name w:val="Normal"/>
     <w:qFormat/>
+    <w:rsid w:val="00230606"/>
   </w:style>
   <w:style w:type="paragraph" w:styleId="Heading1">
     <w:name w:val="heading 1"/>

</xml_diff>

<commit_message>
docs: add Obsidian app analsys
</commit_message>
<xml_diff>
--- a/Work Doc.docx
+++ b/Work Doc.docx
@@ -734,12 +734,699 @@
       </w:r>
     </w:p>
     <w:p>
+      <w:pPr>
+        <w:pStyle w:val="ListParagraph"/>
+        <w:numPr>
+          <w:ilvl w:val="1"/>
+          <w:numId w:val="11"/>
+        </w:numPr>
+        <w:ind w:left="1712" w:hanging="720"/>
+      </w:pPr>
+      <w:r>
+        <w:t xml:space="preserve">Базовый технологический стек – </w:t>
+      </w:r>
+      <w:r>
+        <w:rPr>
+          <w:lang w:val="en-US"/>
+        </w:rPr>
+        <w:t>Obsidian</w:t>
+      </w:r>
+      <w:r>
+        <w:t xml:space="preserve"> </w:t>
+      </w:r>
+      <w:r>
+        <w:rPr>
+          <w:lang w:val="en-US"/>
+        </w:rPr>
+        <w:t>Desktop</w:t>
+      </w:r>
+      <w:r>
+        <w:t xml:space="preserve"> </w:t>
+      </w:r>
+      <w:r>
+        <w:t xml:space="preserve">разработан на платформе </w:t>
+      </w:r>
+      <w:r>
+        <w:rPr>
+          <w:lang w:val="en-US"/>
+        </w:rPr>
+        <w:t>Electron</w:t>
+      </w:r>
+      <w:r>
+        <w:t xml:space="preserve"> </w:t>
+      </w:r>
+      <w:r>
+        <w:t>–</w:t>
+      </w:r>
+      <w:r>
+        <w:t xml:space="preserve"> </w:t>
+      </w:r>
+      <w:r>
+        <w:t xml:space="preserve">фреймворк с открытым исходным кодом для создания кроссплатформенных десктопных приложений с использованием </w:t>
+      </w:r>
+      <w:r>
+        <w:rPr>
+          <w:lang w:val="en-US"/>
+        </w:rPr>
+        <w:t>JavaScript</w:t>
+      </w:r>
+      <w:r>
+        <w:t xml:space="preserve">, </w:t>
+      </w:r>
+      <w:r>
+        <w:rPr>
+          <w:lang w:val="en-US"/>
+        </w:rPr>
+        <w:t>HTML</w:t>
+      </w:r>
+      <w:r>
+        <w:t xml:space="preserve"> </w:t>
+      </w:r>
+      <w:r>
+        <w:t xml:space="preserve">и </w:t>
+      </w:r>
+      <w:r>
+        <w:rPr>
+          <w:lang w:val="en-US"/>
+        </w:rPr>
+        <w:t>CSS</w:t>
+      </w:r>
+      <w:r>
+        <w:t>.</w:t>
+      </w:r>
+    </w:p>
+    <w:p>
+      <w:pPr>
+        <w:pStyle w:val="ListParagraph"/>
+        <w:numPr>
+          <w:ilvl w:val="1"/>
+          <w:numId w:val="11"/>
+        </w:numPr>
+        <w:ind w:left="1712" w:hanging="720"/>
+      </w:pPr>
+      <w:r>
+        <w:t xml:space="preserve">Редактирование текста – ядро редактора построено на движке </w:t>
+      </w:r>
+      <w:proofErr w:type="spellStart"/>
+      <w:r>
+        <w:rPr>
+          <w:lang w:val="en-US"/>
+        </w:rPr>
+        <w:t>CodeMirror</w:t>
+      </w:r>
+      <w:proofErr w:type="spellEnd"/>
+      <w:r>
+        <w:t xml:space="preserve"> 6, </w:t>
+      </w:r>
+      <w:r>
+        <w:t xml:space="preserve">который в свою очередь предоставляет инкрементальный парсер </w:t>
+      </w:r>
+      <w:r>
+        <w:rPr>
+          <w:lang w:val="en-US"/>
+        </w:rPr>
+        <w:t>Lezer</w:t>
+      </w:r>
+      <w:r>
+        <w:t>.</w:t>
+      </w:r>
+    </w:p>
+    <w:p>
+      <w:pPr>
+        <w:pStyle w:val="ListParagraph"/>
+        <w:numPr>
+          <w:ilvl w:val="1"/>
+          <w:numId w:val="11"/>
+        </w:numPr>
+        <w:ind w:left="1712" w:hanging="720"/>
+      </w:pPr>
+      <w:r>
+        <w:t xml:space="preserve">Обработка файла </w:t>
+      </w:r>
+      <w:r>
+        <w:rPr>
+          <w:lang w:val="en-US"/>
+        </w:rPr>
+        <w:t>Markdown</w:t>
+      </w:r>
+      <w:r>
+        <w:t xml:space="preserve"> – </w:t>
+      </w:r>
+      <w:r>
+        <w:t xml:space="preserve">обработка проводится при помощи </w:t>
+      </w:r>
+      <w:r>
+        <w:rPr>
+          <w:lang w:val="en-US"/>
+        </w:rPr>
+        <w:t>remark</w:t>
+      </w:r>
+      <w:r>
+        <w:t xml:space="preserve"> </w:t>
+      </w:r>
+      <w:r>
+        <w:t>–</w:t>
+      </w:r>
+      <w:r>
+        <w:t xml:space="preserve"> </w:t>
+      </w:r>
+      <w:r>
+        <w:t xml:space="preserve">процессора </w:t>
+      </w:r>
+      <w:r>
+        <w:rPr>
+          <w:lang w:val="en-US"/>
+        </w:rPr>
+        <w:t>markdown</w:t>
+      </w:r>
+      <w:r>
+        <w:t xml:space="preserve">, </w:t>
+      </w:r>
+      <w:r>
+        <w:t xml:space="preserve">позволяющий преобразовывать текст в абстрактное синтаксическое дерево, трансформировать содержимое в соответствии с поддерживаемыми </w:t>
+      </w:r>
+      <w:r>
+        <w:rPr>
+          <w:lang w:val="en-US"/>
+        </w:rPr>
+        <w:t>CommonMark</w:t>
+      </w:r>
+      <w:r>
+        <w:t xml:space="preserve"> </w:t>
+      </w:r>
+      <w:r>
+        <w:t xml:space="preserve">и </w:t>
+      </w:r>
+      <w:r>
+        <w:rPr>
+          <w:lang w:val="en-US"/>
+        </w:rPr>
+        <w:t>GitHub</w:t>
+      </w:r>
+      <w:r>
+        <w:t xml:space="preserve"> </w:t>
+      </w:r>
+      <w:r>
+        <w:rPr>
+          <w:lang w:val="en-US"/>
+        </w:rPr>
+        <w:t>Flavored</w:t>
+      </w:r>
+      <w:r>
+        <w:t xml:space="preserve"> </w:t>
+      </w:r>
+      <w:r>
+        <w:rPr>
+          <w:lang w:val="en-US"/>
+        </w:rPr>
+        <w:t>markdown</w:t>
+      </w:r>
+      <w:r>
+        <w:t>-</w:t>
+      </w:r>
+      <w:r>
+        <w:t>диалектами. Также поддерживает</w:t>
+      </w:r>
+      <w:r>
+        <w:rPr>
+          <w:lang w:val="en-US"/>
+        </w:rPr>
+        <w:t xml:space="preserve"> </w:t>
+      </w:r>
+      <w:r>
+        <w:t>пользовательские расширения.</w:t>
+      </w:r>
+    </w:p>
+    <w:p>
+      <w:pPr>
+        <w:ind w:left="1752"/>
+      </w:pPr>
+      <w:r>
+        <w:t xml:space="preserve">Также используется библиотека </w:t>
+      </w:r>
+      <w:r>
+        <w:rPr>
+          <w:lang w:val="en-US"/>
+        </w:rPr>
+        <w:t>YAML</w:t>
+      </w:r>
+      <w:r>
+        <w:t xml:space="preserve"> </w:t>
+      </w:r>
+      <w:r>
+        <w:t xml:space="preserve">для парсинга </w:t>
+      </w:r>
+      <w:proofErr w:type="spellStart"/>
+      <w:r>
+        <w:t>фронтматтера</w:t>
+      </w:r>
+      <w:proofErr w:type="spellEnd"/>
+      <w:r>
+        <w:t xml:space="preserve"> в начале </w:t>
+      </w:r>
+      <w:r>
+        <w:rPr>
+          <w:lang w:val="en-US"/>
+        </w:rPr>
+        <w:t>Markdown</w:t>
+      </w:r>
+      <w:r>
+        <w:t xml:space="preserve"> </w:t>
+      </w:r>
+      <w:r>
+        <w:t xml:space="preserve">файлов. </w:t>
+      </w:r>
+    </w:p>
+    <w:p>
+      <w:pPr>
+        <w:pStyle w:val="ListParagraph"/>
+        <w:numPr>
+          <w:ilvl w:val="1"/>
+          <w:numId w:val="11"/>
+        </w:numPr>
+        <w:ind w:left="1712" w:hanging="720"/>
+      </w:pPr>
+      <w:r>
+        <w:t xml:space="preserve">Реализация отображения текста – </w:t>
+      </w:r>
+      <w:r>
+        <w:rPr>
+          <w:lang w:val="en-US"/>
+        </w:rPr>
+        <w:t>Obsidian</w:t>
+      </w:r>
+      <w:r>
+        <w:t xml:space="preserve"> </w:t>
+      </w:r>
+      <w:r>
+        <w:t xml:space="preserve">поддерживает режим </w:t>
+      </w:r>
+      <w:r>
+        <w:rPr>
+          <w:lang w:val="en-US"/>
+        </w:rPr>
+        <w:t>Live</w:t>
+      </w:r>
+      <w:r>
+        <w:t xml:space="preserve"> </w:t>
+      </w:r>
+      <w:r>
+        <w:rPr>
+          <w:lang w:val="en-US"/>
+        </w:rPr>
+        <w:t>Preview</w:t>
+      </w:r>
+      <w:r>
+        <w:t xml:space="preserve">, </w:t>
+      </w:r>
+      <w:r>
+        <w:t xml:space="preserve">который является режимом по умолчанию при редактировании заметки. Реализован через декорации </w:t>
+      </w:r>
+      <w:proofErr w:type="spellStart"/>
+      <w:proofErr w:type="gramStart"/>
+      <w:r>
+        <w:rPr>
+          <w:lang w:val="en-US"/>
+        </w:rPr>
+        <w:t>CodeMirror</w:t>
+      </w:r>
+      <w:proofErr w:type="spellEnd"/>
+      <w:r>
+        <w:t xml:space="preserve">  -</w:t>
+      </w:r>
+      <w:proofErr w:type="gramEnd"/>
+      <w:r>
+        <w:t xml:space="preserve"> </w:t>
+      </w:r>
+      <w:r>
+        <w:t>систему, позволяющую изменять внешний вид текста в редакторе без изменения исходных строк.</w:t>
+      </w:r>
+      <w:r>
+        <w:t xml:space="preserve"> </w:t>
+      </w:r>
+    </w:p>
+    <w:p>
+      <w:pPr>
+        <w:ind w:left="1080"/>
+      </w:pPr>
+    </w:p>
+    <w:p>
+      <w:pPr>
+        <w:ind w:left="1080"/>
+      </w:pPr>
+    </w:p>
+    <w:p>
+      <w:pPr>
+        <w:ind w:left="1376" w:firstLine="336"/>
+      </w:pPr>
+      <w:r>
+        <w:lastRenderedPageBreak/>
+        <w:t xml:space="preserve">В </w:t>
+      </w:r>
+      <w:proofErr w:type="spellStart"/>
+      <w:r>
+        <w:rPr>
+          <w:lang w:val="en-US"/>
+        </w:rPr>
+        <w:t>CodeMirror</w:t>
+      </w:r>
+      <w:proofErr w:type="spellEnd"/>
+      <w:r>
+        <w:t xml:space="preserve"> 6 </w:t>
+      </w:r>
+      <w:r>
+        <w:t>присутствуют несколько видов декораций:</w:t>
+      </w:r>
+    </w:p>
+    <w:p>
+      <w:pPr>
+        <w:pStyle w:val="ListParagraph"/>
+        <w:numPr>
+          <w:ilvl w:val="2"/>
+          <w:numId w:val="2"/>
+        </w:numPr>
+        <w:ind w:left="2770"/>
+      </w:pPr>
+      <w:r>
+        <w:rPr>
+          <w:lang w:val="en-US"/>
+        </w:rPr>
+        <w:t>Mark</w:t>
+      </w:r>
+      <w:r>
+        <w:t xml:space="preserve"> </w:t>
+      </w:r>
+      <w:r>
+        <w:rPr>
+          <w:lang w:val="en-US"/>
+        </w:rPr>
+        <w:t>Decoration</w:t>
+      </w:r>
+      <w:r>
+        <w:t xml:space="preserve"> – </w:t>
+      </w:r>
+      <w:r>
+        <w:t>стилизует существующие элементы (подсветка синтаксиса, подсветка активной строки и т.д.).</w:t>
+      </w:r>
+    </w:p>
+    <w:p>
+      <w:pPr>
+        <w:pStyle w:val="ListParagraph"/>
+        <w:numPr>
+          <w:ilvl w:val="2"/>
+          <w:numId w:val="2"/>
+        </w:numPr>
+        <w:ind w:left="2770"/>
+      </w:pPr>
+      <w:r>
+        <w:rPr>
+          <w:lang w:val="en-US"/>
+        </w:rPr>
+        <w:t>Widget</w:t>
+      </w:r>
+      <w:r>
+        <w:t xml:space="preserve"> </w:t>
+      </w:r>
+      <w:r>
+        <w:rPr>
+          <w:lang w:val="en-US"/>
+        </w:rPr>
+        <w:t>Decoration</w:t>
+      </w:r>
+      <w:r>
+        <w:t xml:space="preserve"> – </w:t>
+      </w:r>
+      <w:r>
+        <w:t>вставляют</w:t>
+      </w:r>
+      <w:r>
+        <w:t xml:space="preserve"> </w:t>
+      </w:r>
+      <w:r>
+        <w:t>новый</w:t>
+      </w:r>
+      <w:r>
+        <w:t xml:space="preserve"> </w:t>
+      </w:r>
+      <w:r>
+        <w:rPr>
+          <w:lang w:val="en-US"/>
+        </w:rPr>
+        <w:t>DOM</w:t>
+      </w:r>
+      <w:r>
+        <w:t xml:space="preserve"> </w:t>
+      </w:r>
+      <w:r>
+        <w:t>элемент в содержимое редактора (отображение встроенных изображений, таблиц</w:t>
+      </w:r>
+      <w:r>
+        <w:t>;</w:t>
+      </w:r>
+      <w:r>
+        <w:t xml:space="preserve"> виджеты рядом с текстом).</w:t>
+      </w:r>
+    </w:p>
+    <w:p>
+      <w:pPr>
+        <w:pStyle w:val="ListParagraph"/>
+        <w:numPr>
+          <w:ilvl w:val="2"/>
+          <w:numId w:val="2"/>
+        </w:numPr>
+        <w:ind w:left="2770"/>
+      </w:pPr>
+      <w:r>
+        <w:rPr>
+          <w:lang w:val="en-US"/>
+        </w:rPr>
+        <w:t>Replacing</w:t>
+      </w:r>
+      <w:r>
+        <w:t xml:space="preserve"> </w:t>
+      </w:r>
+      <w:r>
+        <w:rPr>
+          <w:lang w:val="en-US"/>
+        </w:rPr>
+        <w:t>Decoration</w:t>
+      </w:r>
+      <w:r>
+        <w:t xml:space="preserve"> – </w:t>
+      </w:r>
+      <w:r>
+        <w:t>декорация</w:t>
+      </w:r>
+      <w:r>
+        <w:t xml:space="preserve">, </w:t>
+      </w:r>
+      <w:r>
+        <w:t>которая</w:t>
+      </w:r>
+      <w:r>
+        <w:t xml:space="preserve"> </w:t>
+      </w:r>
+      <w:r>
+        <w:t>прячет определенный отрывок текста (замена элемента в тексте чем-либо, сворачивание текста в блоке кода).</w:t>
+      </w:r>
+    </w:p>
+    <w:p>
+      <w:pPr>
+        <w:pStyle w:val="ListParagraph"/>
+        <w:numPr>
+          <w:ilvl w:val="2"/>
+          <w:numId w:val="2"/>
+        </w:numPr>
+        <w:ind w:left="2770"/>
+      </w:pPr>
+      <w:r>
+        <w:rPr>
+          <w:lang w:val="en-US"/>
+        </w:rPr>
+        <w:t>Line</w:t>
+      </w:r>
+      <w:r>
+        <w:t xml:space="preserve"> </w:t>
+      </w:r>
+      <w:r>
+        <w:rPr>
+          <w:lang w:val="en-US"/>
+        </w:rPr>
+        <w:t>Decoration</w:t>
+      </w:r>
+      <w:r>
+        <w:t xml:space="preserve"> – </w:t>
+      </w:r>
+      <w:r>
+        <w:t xml:space="preserve">декорация, которая при постановке в начале строки влияет на стиль и применение </w:t>
+      </w:r>
+      <w:r>
+        <w:rPr>
+          <w:lang w:val="en-US"/>
+        </w:rPr>
+        <w:t>DOM</w:t>
+      </w:r>
+      <w:r>
+        <w:t xml:space="preserve"> </w:t>
+      </w:r>
+      <w:r>
+        <w:t>обертки ко всей строке.</w:t>
+      </w:r>
+    </w:p>
+    <w:p>
+      <w:pPr>
+        <w:ind w:left="708" w:firstLine="708"/>
+      </w:pPr>
+      <w:r>
+        <w:t xml:space="preserve"> Логика работы </w:t>
+      </w:r>
+      <w:r>
+        <w:rPr>
+          <w:lang w:val="en-US"/>
+        </w:rPr>
+        <w:t>Live</w:t>
+      </w:r>
+      <w:r>
+        <w:t xml:space="preserve"> </w:t>
+      </w:r>
+      <w:r>
+        <w:rPr>
+          <w:lang w:val="en-US"/>
+        </w:rPr>
+        <w:t>Preview</w:t>
+      </w:r>
+      <w:r>
+        <w:t xml:space="preserve"> </w:t>
+      </w:r>
+      <w:r>
+        <w:t>описывается следующим образом:</w:t>
+      </w:r>
+    </w:p>
+    <w:p>
+      <w:pPr>
+        <w:pStyle w:val="ListParagraph"/>
+        <w:numPr>
+          <w:ilvl w:val="2"/>
+          <w:numId w:val="2"/>
+        </w:numPr>
+        <w:ind w:left="2770"/>
+      </w:pPr>
+      <w:r>
+        <w:t xml:space="preserve">Строка анализируется при помощи инкрементального парсера, строится синтаксическое дерево. </w:t>
+      </w:r>
+    </w:p>
+    <w:p>
+      <w:pPr>
+        <w:pStyle w:val="ListParagraph"/>
+        <w:numPr>
+          <w:ilvl w:val="2"/>
+          <w:numId w:val="2"/>
+        </w:numPr>
+        <w:ind w:left="2770"/>
+      </w:pPr>
+      <w:r>
+        <w:t>Определяются узлы, к которым должны быть применены особые типы отображения.</w:t>
+      </w:r>
+    </w:p>
+    <w:p>
+      <w:pPr>
+        <w:pStyle w:val="ListParagraph"/>
+        <w:numPr>
+          <w:ilvl w:val="2"/>
+          <w:numId w:val="2"/>
+        </w:numPr>
+        <w:ind w:left="2770"/>
+      </w:pPr>
+      <w:r>
+        <w:t>Проверяется, находится ли курсор в пределах этого узла.</w:t>
+      </w:r>
+    </w:p>
+    <w:p>
+      <w:pPr>
+        <w:pStyle w:val="ListParagraph"/>
+        <w:numPr>
+          <w:ilvl w:val="2"/>
+          <w:numId w:val="2"/>
+        </w:numPr>
+        <w:ind w:left="2770"/>
+      </w:pPr>
+      <w:r>
+        <w:t xml:space="preserve">Если курсор вне слова – применяются </w:t>
+      </w:r>
+      <w:r>
+        <w:rPr>
+          <w:lang w:val="en-US"/>
+        </w:rPr>
+        <w:t>Replace</w:t>
+      </w:r>
+      <w:r>
+        <w:t xml:space="preserve"> </w:t>
+      </w:r>
+      <w:r>
+        <w:rPr>
+          <w:lang w:val="en-US"/>
+        </w:rPr>
+        <w:t>Decorations</w:t>
+      </w:r>
+      <w:r>
+        <w:t xml:space="preserve"> </w:t>
+      </w:r>
+      <w:r>
+        <w:t>к символам синтаксической разметки – замена производится на пробел с нулевой шириной.</w:t>
+      </w:r>
+    </w:p>
+    <w:p>
+      <w:pPr>
+        <w:pStyle w:val="ListParagraph"/>
+        <w:numPr>
+          <w:ilvl w:val="2"/>
+          <w:numId w:val="2"/>
+        </w:numPr>
+        <w:ind w:left="2770"/>
+      </w:pPr>
+      <w:r>
+        <w:t xml:space="preserve">Если курсор находится в пределах узла, </w:t>
+      </w:r>
+      <w:r>
+        <w:rPr>
+          <w:lang w:val="en-US"/>
+        </w:rPr>
+        <w:t>Replace</w:t>
+      </w:r>
+      <w:r>
+        <w:t xml:space="preserve"> </w:t>
+      </w:r>
+      <w:r>
+        <w:rPr>
+          <w:lang w:val="en-US"/>
+        </w:rPr>
+        <w:t>Decorations</w:t>
+      </w:r>
+      <w:r>
+        <w:t xml:space="preserve"> </w:t>
+      </w:r>
+      <w:r>
+        <w:t>перестают применяться.</w:t>
+      </w:r>
+    </w:p>
+    <w:p>
+      <w:pPr>
+        <w:pStyle w:val="ListParagraph"/>
+        <w:numPr>
+          <w:ilvl w:val="1"/>
+          <w:numId w:val="11"/>
+        </w:numPr>
+        <w:ind w:left="1712" w:hanging="720"/>
+      </w:pPr>
+      <w:r>
+        <w:t>Файловая система и хранение заметок</w:t>
+      </w:r>
       <w:r>
         <w:rPr>
           <w:b/>
           <w:bCs/>
         </w:rPr>
-        <w:t xml:space="preserve">Файловая система и хранение заметок </w:t>
+        <w:t xml:space="preserve"> </w:t>
       </w:r>
       <w:r>
         <w:t>– заметки хранятся локально, в формате .</w:t>
@@ -755,6 +1442,386 @@
       </w:r>
       <w:r>
         <w:t>в специальной папке – хранилище. Содержимое хранилища:</w:t>
+      </w:r>
+    </w:p>
+    <w:p>
+      <w:pPr>
+        <w:pStyle w:val="ListParagraph"/>
+        <w:numPr>
+          <w:ilvl w:val="2"/>
+          <w:numId w:val="2"/>
+        </w:numPr>
+        <w:ind w:left="2770"/>
+      </w:pPr>
+      <w:r>
+        <w:t xml:space="preserve">Папка, хранящая заметки в чистом виде. Иерархическая система полностью соответствует созданной пользователем в приложении. В папке хранятся файлы </w:t>
+      </w:r>
+      <w:r>
+        <w:t>.</w:t>
+      </w:r>
+      <w:r>
+        <w:rPr>
+          <w:lang w:val="en-US"/>
+        </w:rPr>
+        <w:t>md</w:t>
+      </w:r>
+      <w:r>
+        <w:t>, вставленные картинки и другие локальные данные, созданные или вставленные пользователем</w:t>
+      </w:r>
+    </w:p>
+    <w:p>
+      <w:pPr>
+        <w:pStyle w:val="ListParagraph"/>
+        <w:numPr>
+          <w:ilvl w:val="2"/>
+          <w:numId w:val="2"/>
+        </w:numPr>
+        <w:ind w:left="2770"/>
+      </w:pPr>
+      <w:r>
+        <w:t xml:space="preserve">Папка </w:t>
+      </w:r>
+      <w:proofErr w:type="gramStart"/>
+      <w:r>
+        <w:t>«</w:t>
+      </w:r>
+      <w:r>
+        <w:t>.</w:t>
+      </w:r>
+      <w:r>
+        <w:rPr>
+          <w:lang w:val="en-US"/>
+        </w:rPr>
+        <w:t>obsidian</w:t>
+      </w:r>
+      <w:proofErr w:type="gramEnd"/>
+      <w:r>
+        <w:t>», содержащая конфигурацию самого приложения, настройки тем, плагинов сообщества.</w:t>
+      </w:r>
+    </w:p>
+    <w:p>
+      <w:pPr>
+        <w:pStyle w:val="ListParagraph"/>
+        <w:numPr>
+          <w:ilvl w:val="1"/>
+          <w:numId w:val="11"/>
+        </w:numPr>
+        <w:ind w:left="1712" w:hanging="720"/>
+      </w:pPr>
+      <w:r>
+        <w:rPr>
+          <w:lang w:val="en-US"/>
+        </w:rPr>
+        <w:t>UI</w:t>
+      </w:r>
+      <w:r>
+        <w:t xml:space="preserve"> </w:t>
+      </w:r>
+      <w:r>
+        <w:t xml:space="preserve">элементы – одна из главных особенностей отображения в </w:t>
+      </w:r>
+      <w:r>
+        <w:rPr>
+          <w:lang w:val="en-US"/>
+        </w:rPr>
+        <w:t>Obsidian</w:t>
+      </w:r>
+      <w:r>
+        <w:t xml:space="preserve"> </w:t>
+      </w:r>
+      <w:r>
+        <w:t>–</w:t>
+      </w:r>
+      <w:r>
+        <w:t xml:space="preserve"> </w:t>
+      </w:r>
+      <w:r>
+        <w:t xml:space="preserve">наличие графа связей между заметками. В данной карте учитываются ссылки между заметками, их принадлежность к определенным тегам, отображается направление связей, имеется визуальное (цветовое) разделение по ряду признаков </w:t>
+      </w:r>
+      <w:r>
+        <w:lastRenderedPageBreak/>
+        <w:t>(местонахождение файла, тег, родительская заметка, по совпадению в тексте). Возможно отображение локального графа для каждой отдельной заметки.</w:t>
+      </w:r>
+    </w:p>
+    <w:p>
+      <w:pPr>
+        <w:ind w:left="1712"/>
+      </w:pPr>
+      <w:r>
+        <w:t xml:space="preserve">Также в </w:t>
+      </w:r>
+      <w:r>
+        <w:rPr>
+          <w:lang w:val="en-US"/>
+        </w:rPr>
+        <w:t>Obsidian</w:t>
+      </w:r>
+      <w:r>
+        <w:t xml:space="preserve"> </w:t>
+      </w:r>
+      <w:r>
+        <w:t xml:space="preserve">реализованы функции быстрого поиска заметок по названию, фильтр по тэгам, задающимся внутри заметок, разделение рабочей области и </w:t>
+      </w:r>
+      <w:proofErr w:type="gramStart"/>
+      <w:r>
+        <w:t>т.д.</w:t>
+      </w:r>
+      <w:proofErr w:type="gramEnd"/>
+    </w:p>
+    <w:p>
+      <w:pPr>
+        <w:pStyle w:val="ListParagraph"/>
+        <w:numPr>
+          <w:ilvl w:val="1"/>
+          <w:numId w:val="11"/>
+        </w:numPr>
+        <w:ind w:left="1712" w:hanging="720"/>
+      </w:pPr>
+      <w:r>
+        <w:t xml:space="preserve">Дополнительные возможности – </w:t>
+      </w:r>
+      <w:r>
+        <w:rPr>
+          <w:lang w:val="en-US"/>
+        </w:rPr>
+        <w:t>Obsidian</w:t>
+      </w:r>
+      <w:r>
+        <w:t xml:space="preserve"> </w:t>
+      </w:r>
+      <w:r>
+        <w:t>является гибкой платформой для ведения заметок благодаря широкому выбору пользовательских плагинов, позволяющих настроить внешний вид и функционал приложения.</w:t>
+      </w:r>
+    </w:p>
+    <w:p>
+      <w:pPr>
+        <w:ind w:left="1712"/>
+      </w:pPr>
+      <w:r>
+        <w:t>Также есть возможность подключения функции синхронизации заметок между устройствами с одной учетной записью, данная функция является платной.</w:t>
+      </w:r>
+    </w:p>
+    <w:p/>
+    <w:p/>
+    <w:p/>
+    <w:p>
+      <w:pPr>
+        <w:rPr>
+          <w:b/>
+          <w:bCs/>
+        </w:rPr>
+      </w:pPr>
+      <w:r>
+        <w:rPr>
+          <w:b/>
+          <w:bCs/>
+        </w:rPr>
+        <w:t>Достоинства:</w:t>
+      </w:r>
+    </w:p>
+    <w:p>
+      <w:r>
+        <w:rPr>
+          <w:lang w:val="en-US"/>
+        </w:rPr>
+        <w:t>Obsidian</w:t>
+      </w:r>
+      <w:r>
+        <w:t xml:space="preserve"> </w:t>
+      </w:r>
+      <w:r>
+        <w:t>является универсальной программой для ведения заметок, ее главной сильной стороной является упор на функционал базы знаний и работу с системой внутренних ссылок.  Программа обладает ярко выраженным наглядным стилем – вводит граф связей с быстрым доступом к заметкам через узлы, вводит панель быстрого доступа, закрепление файлов, быстрый поиск для навигации по большой базе записей.</w:t>
+      </w:r>
+    </w:p>
+    <w:p>
+      <w:r>
+        <w:t xml:space="preserve">Также большим достоинством </w:t>
+      </w:r>
+      <w:r>
+        <w:rPr>
+          <w:lang w:val="en-US"/>
+        </w:rPr>
+        <w:t>Obsidian</w:t>
+      </w:r>
+      <w:r>
+        <w:t xml:space="preserve"> </w:t>
+      </w:r>
+      <w:r>
+        <w:t xml:space="preserve">является полная </w:t>
+      </w:r>
+      <w:proofErr w:type="spellStart"/>
+      <w:r>
+        <w:t>персонализируемость</w:t>
+      </w:r>
+      <w:proofErr w:type="spellEnd"/>
+      <w:r>
+        <w:t xml:space="preserve"> и расширяемость функционала за счёт внутреннего установщика пользовательских плагинов и тем.</w:t>
+      </w:r>
+    </w:p>
+    <w:p>
+      <w:pPr>
+        <w:rPr>
+          <w:b/>
+          <w:bCs/>
+        </w:rPr>
+      </w:pPr>
+      <w:r>
+        <w:rPr>
+          <w:b/>
+          <w:bCs/>
+        </w:rPr>
+        <w:t>Недостатки:</w:t>
+      </w:r>
+    </w:p>
+    <w:p>
+      <w:r>
+        <w:rPr>
+          <w:lang w:val="en-US"/>
+        </w:rPr>
+        <w:t>Obsidian</w:t>
+      </w:r>
+      <w:r>
+        <w:t xml:space="preserve"> </w:t>
+      </w:r>
+      <w:r>
+        <w:t xml:space="preserve">отличается скудным функционалом без введения пользовательских плагинов, многие из которых требую подключения к сети не только для установки, но и для корректной работы. Также при работе с приложением крайне важно знать синтаксис </w:t>
+      </w:r>
+      <w:r>
+        <w:rPr>
+          <w:lang w:val="en-US"/>
+        </w:rPr>
+        <w:t>markdown</w:t>
+      </w:r>
+      <w:r>
+        <w:t xml:space="preserve"> </w:t>
+      </w:r>
+      <w:r>
+        <w:t>для полного управления форматированием содержимого.</w:t>
+      </w:r>
+    </w:p>
+    <w:p>
+      <w:r>
+        <w:rPr>
+          <w:lang w:val="en-US"/>
+        </w:rPr>
+        <w:t>Live</w:t>
+      </w:r>
+      <w:r>
+        <w:t xml:space="preserve"> </w:t>
+      </w:r>
+      <w:r>
+        <w:rPr>
+          <w:lang w:val="en-US"/>
+        </w:rPr>
+        <w:t>Preview</w:t>
+      </w:r>
+      <w:r>
+        <w:t xml:space="preserve"> </w:t>
+      </w:r>
+      <w:r>
+        <w:t>в</w:t>
+      </w:r>
+      <w:r>
+        <w:t xml:space="preserve"> </w:t>
+      </w:r>
+      <w:r>
+        <w:rPr>
+          <w:lang w:val="en-US"/>
+        </w:rPr>
+        <w:t>Obsidian</w:t>
+      </w:r>
+      <w:r>
+        <w:t xml:space="preserve"> </w:t>
+      </w:r>
+      <w:r>
+        <w:t>всегда</w:t>
+      </w:r>
+      <w:r>
+        <w:t xml:space="preserve"> </w:t>
+      </w:r>
+      <w:r>
+        <w:t xml:space="preserve">полностью разворачивает </w:t>
+      </w:r>
+      <w:r>
+        <w:rPr>
+          <w:lang w:val="en-US"/>
+        </w:rPr>
+        <w:t>RAW</w:t>
+      </w:r>
+      <w:r>
+        <w:t xml:space="preserve">-вид отрывка текста, если на него поставлен курсор, что может быть проблематично при навигации по тексту, например, любая таблица с использованием популярного плагина </w:t>
+      </w:r>
+      <w:proofErr w:type="spellStart"/>
+      <w:r>
+        <w:rPr>
+          <w:lang w:val="en-US"/>
+        </w:rPr>
+        <w:lastRenderedPageBreak/>
+        <w:t>DataView</w:t>
+      </w:r>
+      <w:proofErr w:type="spellEnd"/>
+      <w:r>
+        <w:t xml:space="preserve"> может при вводе курсора в область ее разметки показать исходный код, который удается скрыть добавлением строк или переходом в режим чтения.</w:t>
+      </w:r>
+    </w:p>
+    <w:p>
+      <w:pPr>
+        <w:rPr>
+          <w:b/>
+          <w:bCs/>
+        </w:rPr>
+      </w:pPr>
+      <w:r>
+        <w:rPr>
+          <w:b/>
+          <w:bCs/>
+        </w:rPr>
+        <w:t xml:space="preserve">Сравнение </w:t>
+      </w:r>
+      <w:proofErr w:type="gramStart"/>
+      <w:r>
+        <w:rPr>
+          <w:b/>
+          <w:bCs/>
+        </w:rPr>
+        <w:t>с  моим</w:t>
+      </w:r>
+      <w:proofErr w:type="gramEnd"/>
+      <w:r>
+        <w:rPr>
+          <w:b/>
+          <w:bCs/>
+        </w:rPr>
+        <w:t xml:space="preserve"> проектом:</w:t>
+      </w:r>
+    </w:p>
+    <w:p>
+      <w:r>
+        <w:rPr>
+          <w:lang w:val="en-US"/>
+        </w:rPr>
+        <w:t>Obsidian</w:t>
+      </w:r>
+      <w:r>
+        <w:t xml:space="preserve"> </w:t>
+      </w:r>
+      <w:r>
+        <w:t xml:space="preserve">является наиболее близким по задумке проектом из существующих, однако </w:t>
+      </w:r>
+      <w:r>
+        <w:rPr>
+          <w:lang w:val="en-US"/>
+        </w:rPr>
+        <w:t>Salvager</w:t>
+      </w:r>
+      <w:r>
+        <w:t xml:space="preserve"> </w:t>
+      </w:r>
+      <w:r>
+        <w:t>будет делать упор на следующие задачи</w:t>
+      </w:r>
+      <w:r>
+        <w:t>:</w:t>
       </w:r>
     </w:p>
     <w:p>
@@ -766,19 +1833,34 @@
         </w:numPr>
       </w:pPr>
       <w:r>
-        <w:t xml:space="preserve">Папка, хранящая заметки в чистом виде. Иерархическая система полностью соответствует созданной пользователем в приложении. В папке хранятся файлы </w:t>
+        <w:t xml:space="preserve">Улучшение читаемости и отображения </w:t>
+      </w:r>
+      <w:r>
+        <w:rPr>
+          <w:lang w:val="en-US"/>
+        </w:rPr>
+        <w:t>markdown</w:t>
+      </w:r>
+      <w:r>
+        <w:t xml:space="preserve">-синтаксиса в </w:t>
+      </w:r>
+      <w:r>
+        <w:rPr>
+          <w:lang w:val="en-US"/>
+        </w:rPr>
+        <w:t>Live</w:t>
+      </w:r>
+      <w:r>
+        <w:t xml:space="preserve"> </w:t>
+      </w:r>
+      <w:r>
+        <w:rPr>
+          <w:lang w:val="en-US"/>
+        </w:rPr>
+        <w:t>Preview</w:t>
       </w:r>
       <w:r>
         <w:t>.</w:t>
-      </w:r>
-      <w:r>
-        <w:rPr>
-          <w:lang w:val="en-US"/>
-        </w:rPr>
-        <w:t>md</w:t>
-      </w:r>
-      <w:r>
-        <w:t>, вставленные картинки и другие локальные данные, созданные или вставленные пользователем</w:t>
       </w:r>
     </w:p>
     <w:p>
@@ -790,33 +1872,85 @@
         </w:numPr>
       </w:pPr>
       <w:r>
-        <w:t xml:space="preserve">Папка </w:t>
-      </w:r>
-      <w:proofErr w:type="gramStart"/>
-      <w:r>
-        <w:t>«</w:t>
+        <w:t xml:space="preserve">Введение для однородности единого, однозначного канонического диалекта </w:t>
+      </w:r>
+      <w:r>
+        <w:rPr>
+          <w:lang w:val="en-US"/>
+        </w:rPr>
+        <w:t>markdown</w:t>
       </w:r>
       <w:r>
         <w:t>.</w:t>
       </w:r>
-      <w:r>
-        <w:rPr>
-          <w:lang w:val="en-US"/>
-        </w:rPr>
-        <w:t>obsidian</w:t>
-      </w:r>
-      <w:proofErr w:type="gramEnd"/>
-      <w:r>
-        <w:t>», содержащая конфигурацию самого приложения, настройки тем, плагинов сообщества.</w:t>
-      </w:r>
-    </w:p>
-    <w:p>
-      <w:r>
-        <w:rPr>
-          <w:b/>
-          <w:bCs/>
-        </w:rPr>
-        <w:t xml:space="preserve">Обработка данных с синтаксической разметкой </w:t>
+    </w:p>
+    <w:p>
+      <w:pPr>
+        <w:pStyle w:val="ListParagraph"/>
+        <w:numPr>
+          <w:ilvl w:val="0"/>
+          <w:numId w:val="2"/>
+        </w:numPr>
+      </w:pPr>
+      <w:r>
+        <w:t>Реализация понятного и полного меню форматирования текста.</w:t>
+      </w:r>
+    </w:p>
+    <w:p>
+      <w:pPr>
+        <w:pStyle w:val="ListParagraph"/>
+        <w:numPr>
+          <w:ilvl w:val="0"/>
+          <w:numId w:val="2"/>
+        </w:numPr>
+      </w:pPr>
+      <w:r>
+        <w:t>Отказ от реализации базового функционала пользовательскими плагинами.</w:t>
+      </w:r>
+    </w:p>
+    <w:p>
+      <w:pPr>
+        <w:pStyle w:val="ListParagraph"/>
+        <w:numPr>
+          <w:ilvl w:val="0"/>
+          <w:numId w:val="2"/>
+        </w:numPr>
+      </w:pPr>
+      <w:r>
+        <w:t>Введение функционала быстрой вставки внешних ссылок без сворачивания приложения.</w:t>
+      </w:r>
+    </w:p>
+    <w:p>
+      <w:pPr>
+        <w:pStyle w:val="ListParagraph"/>
+        <w:numPr>
+          <w:ilvl w:val="0"/>
+          <w:numId w:val="2"/>
+        </w:numPr>
+      </w:pPr>
+      <w:r>
+        <w:t>Введение собственной системы связей.</w:t>
+      </w:r>
+    </w:p>
+    <w:p>
+      <w:pPr>
+        <w:pStyle w:val="ListParagraph"/>
+        <w:numPr>
+          <w:ilvl w:val="0"/>
+          <w:numId w:val="2"/>
+        </w:numPr>
+      </w:pPr>
+      <w:r>
+        <w:t xml:space="preserve">Полностью иное оформление и философия </w:t>
+      </w:r>
+      <w:r>
+        <w:rPr>
+          <w:lang w:val="en-US"/>
+        </w:rPr>
+        <w:t>UI</w:t>
+      </w:r>
+      <w:r>
+        <w:t xml:space="preserve"> </w:t>
       </w:r>
       <w:r>
         <w:t>–</w:t>
@@ -825,53 +1959,15 @@
         <w:t xml:space="preserve"> </w:t>
       </w:r>
       <w:r>
-        <w:rPr>
-          <w:lang w:val="en-US"/>
-        </w:rPr>
-        <w:t>Obsidian</w:t>
-      </w:r>
-      <w:r>
-        <w:t xml:space="preserve"> </w:t>
-      </w:r>
-      <w:r>
-        <w:t xml:space="preserve">использует редактор </w:t>
-      </w:r>
-      <w:proofErr w:type="spellStart"/>
-      <w:r>
-        <w:rPr>
-          <w:lang w:val="en-US"/>
-        </w:rPr>
-        <w:t>CodeMirror</w:t>
-      </w:r>
-      <w:proofErr w:type="spellEnd"/>
-      <w:r>
-        <w:t xml:space="preserve"> и, соответственно, систему парсинга </w:t>
-      </w:r>
-      <w:r>
-        <w:rPr>
-          <w:lang w:val="en-US"/>
-        </w:rPr>
-        <w:t>Lezer</w:t>
-      </w:r>
-      <w:r>
-        <w:t xml:space="preserve">, </w:t>
-      </w:r>
-      <w:r>
-        <w:t xml:space="preserve">являющуюся частью экосистемы </w:t>
-      </w:r>
-      <w:proofErr w:type="spellStart"/>
-      <w:r>
-        <w:rPr>
-          <w:lang w:val="en-US"/>
-        </w:rPr>
-        <w:t>CodeMirror</w:t>
-      </w:r>
-      <w:proofErr w:type="spellEnd"/>
-      <w:r>
-        <w:t xml:space="preserve"> 6.</w:t>
-      </w:r>
-    </w:p>
-    <w:p/>
+        <w:t>геймификация, тактильность и иммерсивность против утилитарности и профессиональности.</w:t>
+      </w:r>
+    </w:p>
+    <w:p>
+      <w:pPr>
+        <w:pStyle w:val="Heading1"/>
+        <w:jc w:val="center"/>
+      </w:pPr>
+    </w:p>
     <w:sectPr>
       <w:pgSz w:w="11906" w:h="16838"/>
       <w:pgMar w:top="1440" w:right="1440" w:bottom="1440" w:left="1440" w:header="708" w:footer="708" w:gutter="0"/>
@@ -989,7 +2085,7 @@
         <w:rFonts w:hint="default"/>
       </w:rPr>
     </w:lvl>
-    <w:lvl w:ilvl="1" w:tplc="04190019" w:tentative="1">
+    <w:lvl w:ilvl="1" w:tplc="04190019">
       <w:start w:val="1"/>
       <w:numFmt w:val="lowerLetter"/>
       <w:lvlText w:val="%2."/>
@@ -1719,7 +2815,7 @@
         <w:rFonts w:ascii="Courier New" w:hAnsi="Courier New" w:cs="Courier New" w:hint="default"/>
       </w:rPr>
     </w:lvl>
-    <w:lvl w:ilvl="2" w:tplc="04190005" w:tentative="1">
+    <w:lvl w:ilvl="2" w:tplc="04190005">
       <w:start w:val="1"/>
       <w:numFmt w:val="bullet"/>
       <w:lvlText w:val=""/>

</xml_diff>

<commit_message>
docs: fixes for lists fromatting
</commit_message>
<xml_diff>
--- a/Work Doc.docx
+++ b/Work Doc.docx
@@ -948,9 +948,6 @@
         <w:t>диалектами. Также поддерживает</w:t>
       </w:r>
       <w:r>
-        <w:rPr>
-          <w:lang w:val="en-US"/>
-        </w:rPr>
         <w:t xml:space="preserve"> </w:t>
       </w:r>
       <w:r>
@@ -1601,9 +1598,13 @@
         <w:t>Также есть возможность подключения функции синхронизации заметок между устройствами с одной учетной записью, данная функция является платной.</w:t>
       </w:r>
     </w:p>
-    <w:p/>
-    <w:p/>
-    <w:p/>
+    <w:p>
+      <w:pPr>
+        <w:rPr>
+          <w:lang w:val="en-US"/>
+        </w:rPr>
+      </w:pPr>
+    </w:p>
     <w:p>
       <w:pPr>
         <w:rPr>
@@ -1700,6 +1701,11 @@
       </w:r>
     </w:p>
     <w:p>
+      <w:pPr>
+        <w:rPr>
+          <w:lang w:val="en-US"/>
+        </w:rPr>
+      </w:pPr>
       <w:r>
         <w:rPr>
           <w:lang w:val="en-US"/>
@@ -1756,13 +1762,19 @@
         <w:rPr>
           <w:lang w:val="en-US"/>
         </w:rPr>
-        <w:lastRenderedPageBreak/>
         <w:t>DataView</w:t>
       </w:r>
       <w:proofErr w:type="spellEnd"/>
       <w:r>
         <w:t xml:space="preserve"> может при вводе курсора в область ее разметки показать исходный код, который удается скрыть добавлением строк или переходом в режим чтения.</w:t>
       </w:r>
+    </w:p>
+    <w:p>
+      <w:pPr>
+        <w:rPr>
+          <w:lang w:val="en-US"/>
+        </w:rPr>
+      </w:pPr>
     </w:p>
     <w:p>
       <w:pPr>
@@ -1776,6 +1788,7 @@
           <w:b/>
           <w:bCs/>
         </w:rPr>
+        <w:lastRenderedPageBreak/>
         <w:t xml:space="preserve">Сравнение </w:t>
       </w:r>
       <w:proofErr w:type="gramStart"/>
@@ -2072,7 +2085,7 @@
   <w:abstractNum w:abstractNumId="1" w15:restartNumberingAfterBreak="0">
     <w:nsid w:val="0B9F0B9A"/>
     <w:multiLevelType w:val="hybridMultilevel"/>
-    <w:tmpl w:val="51523EF6"/>
+    <w:tmpl w:val="55783AFC"/>
     <w:lvl w:ilvl="0" w:tplc="0419000F">
       <w:start w:val="1"/>
       <w:numFmt w:val="decimal"/>
@@ -2085,10 +2098,10 @@
         <w:rFonts w:hint="default"/>
       </w:rPr>
     </w:lvl>
-    <w:lvl w:ilvl="1" w:tplc="04190019">
-      <w:start w:val="1"/>
-      <w:numFmt w:val="lowerLetter"/>
-      <w:lvlText w:val="%2."/>
+    <w:lvl w:ilvl="1" w:tplc="04190011">
+      <w:start w:val="1"/>
+      <w:numFmt w:val="decimal"/>
+      <w:lvlText w:val="%2)"/>
       <w:lvlJc w:val="left"/>
       <w:pPr>
         <w:ind w:left="1440" w:hanging="360"/>

</xml_diff>

<commit_message>
docs: add more about Obsidian, add about typora and start toadd about MarkText
</commit_message>
<xml_diff>
--- a/Work Doc.docx
+++ b/Work Doc.docx
@@ -468,15 +468,7 @@
         </w:numPr>
       </w:pPr>
       <w:r>
-        <w:t xml:space="preserve">Реализовать </w:t>
-      </w:r>
-      <w:proofErr w:type="spellStart"/>
-      <w:r>
-        <w:t>сериализатор</w:t>
-      </w:r>
-      <w:proofErr w:type="spellEnd"/>
-      <w:r>
-        <w:t>, обеспечивающий запись в едином формате.</w:t>
+        <w:t>Реализовать сериализатор, обеспечивающий запись в едином формате.</w:t>
       </w:r>
     </w:p>
     <w:p>
@@ -672,14 +664,12 @@
           <w:numId w:val="2"/>
         </w:numPr>
       </w:pPr>
-      <w:proofErr w:type="spellStart"/>
       <w:r>
         <w:rPr>
           <w:lang w:val="en-US"/>
         </w:rPr>
         <w:t>Typora</w:t>
       </w:r>
-      <w:proofErr w:type="spellEnd"/>
     </w:p>
     <w:p>
       <w:pPr>
@@ -689,14 +679,12 @@
           <w:numId w:val="2"/>
         </w:numPr>
       </w:pPr>
-      <w:proofErr w:type="spellStart"/>
       <w:r>
         <w:rPr>
           <w:lang w:val="en-US"/>
         </w:rPr>
         <w:t>MarkText</w:t>
       </w:r>
-      <w:proofErr w:type="spellEnd"/>
     </w:p>
     <w:p>
       <w:r>
@@ -710,9 +698,12 @@
           <w:ilvl w:val="0"/>
           <w:numId w:val="11"/>
         </w:numPr>
-      </w:pPr>
-      <w:r>
-        <w:rPr>
+        <w:ind w:left="643"/>
+      </w:pPr>
+      <w:r>
+        <w:rPr>
+          <w:b/>
+          <w:bCs/>
           <w:lang w:val="en-US"/>
         </w:rPr>
         <w:t>Obsidian</w:t>
@@ -740,7 +731,7 @@
           <w:ilvl w:val="1"/>
           <w:numId w:val="11"/>
         </w:numPr>
-        <w:ind w:left="1712" w:hanging="720"/>
+        <w:ind w:left="1429" w:hanging="720"/>
       </w:pPr>
       <w:r>
         <w:t xml:space="preserve">Базовый технологический стек – </w:t>
@@ -822,19 +813,17 @@
           <w:ilvl w:val="1"/>
           <w:numId w:val="11"/>
         </w:numPr>
-        <w:ind w:left="1712" w:hanging="720"/>
+        <w:ind w:left="1429" w:hanging="720"/>
       </w:pPr>
       <w:r>
         <w:t xml:space="preserve">Редактирование текста – ядро редактора построено на движке </w:t>
       </w:r>
-      <w:proofErr w:type="spellStart"/>
       <w:r>
         <w:rPr>
           <w:lang w:val="en-US"/>
         </w:rPr>
         <w:t>CodeMirror</w:t>
       </w:r>
-      <w:proofErr w:type="spellEnd"/>
       <w:r>
         <w:t xml:space="preserve"> 6, </w:t>
       </w:r>
@@ -858,7 +847,7 @@
           <w:ilvl w:val="1"/>
           <w:numId w:val="11"/>
         </w:numPr>
-        <w:ind w:left="1712" w:hanging="720"/>
+        <w:ind w:left="1429" w:hanging="720"/>
       </w:pPr>
       <w:r>
         <w:t xml:space="preserve">Обработка файла </w:t>
@@ -948,6 +937,9 @@
         <w:t>диалектами. Также поддерживает</w:t>
       </w:r>
       <w:r>
+        <w:rPr>
+          <w:lang w:val="en-US"/>
+        </w:rPr>
         <w:t xml:space="preserve"> </w:t>
       </w:r>
       <w:r>
@@ -971,15 +963,7 @@
         <w:t xml:space="preserve"> </w:t>
       </w:r>
       <w:r>
-        <w:t xml:space="preserve">для парсинга </w:t>
-      </w:r>
-      <w:proofErr w:type="spellStart"/>
-      <w:r>
-        <w:t>фронтматтера</w:t>
-      </w:r>
-      <w:proofErr w:type="spellEnd"/>
-      <w:r>
-        <w:t xml:space="preserve"> в начале </w:t>
+        <w:t xml:space="preserve">для парсинга фронтматтера в начале </w:t>
       </w:r>
       <w:r>
         <w:rPr>
@@ -1001,7 +985,7 @@
           <w:ilvl w:val="1"/>
           <w:numId w:val="11"/>
         </w:numPr>
-        <w:ind w:left="1712" w:hanging="720"/>
+        <w:ind w:left="1429" w:hanging="720"/>
       </w:pPr>
       <w:r>
         <w:t xml:space="preserve">Реализация отображения текста – </w:t>
@@ -1039,21 +1023,14 @@
       <w:r>
         <w:t xml:space="preserve">который является режимом по умолчанию при редактировании заметки. Реализован через декорации </w:t>
       </w:r>
-      <w:proofErr w:type="spellStart"/>
-      <w:proofErr w:type="gramStart"/>
       <w:r>
         <w:rPr>
           <w:lang w:val="en-US"/>
         </w:rPr>
         <w:t>CodeMirror</w:t>
       </w:r>
-      <w:proofErr w:type="spellEnd"/>
-      <w:r>
-        <w:t xml:space="preserve">  -</w:t>
-      </w:r>
-      <w:proofErr w:type="gramEnd"/>
-      <w:r>
-        <w:t xml:space="preserve"> </w:t>
+      <w:r>
+        <w:t xml:space="preserve">  - </w:t>
       </w:r>
       <w:r>
         <w:t>систему, позволяющую изменять внешний вид текста в редакторе без изменения исходных строк.</w:t>
@@ -1080,14 +1057,12 @@
         <w:lastRenderedPageBreak/>
         <w:t xml:space="preserve">В </w:t>
       </w:r>
-      <w:proofErr w:type="spellStart"/>
       <w:r>
         <w:rPr>
           <w:lang w:val="en-US"/>
         </w:rPr>
         <w:t>CodeMirror</w:t>
       </w:r>
-      <w:proofErr w:type="spellEnd"/>
       <w:r>
         <w:t xml:space="preserve"> 6 </w:t>
       </w:r>
@@ -1413,7 +1388,7 @@
           <w:ilvl w:val="1"/>
           <w:numId w:val="11"/>
         </w:numPr>
-        <w:ind w:left="1712" w:hanging="720"/>
+        <w:ind w:left="1429" w:hanging="720"/>
       </w:pPr>
       <w:r>
         <w:t>Файловая система и хранение заметок</w:t>
@@ -1476,11 +1451,7 @@
         <w:ind w:left="2770"/>
       </w:pPr>
       <w:r>
-        <w:t xml:space="preserve">Папка </w:t>
-      </w:r>
-      <w:proofErr w:type="gramStart"/>
-      <w:r>
-        <w:t>«</w:t>
+        <w:t>Папка «</w:t>
       </w:r>
       <w:r>
         <w:t>.</w:t>
@@ -1491,7 +1462,6 @@
         </w:rPr>
         <w:t>obsidian</w:t>
       </w:r>
-      <w:proofErr w:type="gramEnd"/>
       <w:r>
         <w:t>», содержащая конфигурацию самого приложения, настройки тем, плагинов сообщества.</w:t>
       </w:r>
@@ -1503,7 +1473,7 @@
           <w:ilvl w:val="1"/>
           <w:numId w:val="11"/>
         </w:numPr>
-        <w:ind w:left="1712" w:hanging="720"/>
+        <w:ind w:left="1429" w:hanging="720"/>
       </w:pPr>
       <w:r>
         <w:rPr>
@@ -1542,8 +1512,47 @@
     </w:p>
     <w:p>
       <w:pPr>
+        <w:pStyle w:val="ListParagraph"/>
         <w:ind w:left="1712"/>
       </w:pPr>
+    </w:p>
+    <w:p>
+      <w:pPr>
+        <w:pStyle w:val="ListParagraph"/>
+        <w:ind w:left="1712"/>
+      </w:pPr>
+      <w:r>
+        <w:t xml:space="preserve">В </w:t>
+      </w:r>
+      <w:r>
+        <w:rPr>
+          <w:lang w:val="en-US"/>
+        </w:rPr>
+        <w:t>Obsidian</w:t>
+      </w:r>
+      <w:r>
+        <w:t xml:space="preserve"> </w:t>
+      </w:r>
+      <w:r>
+        <w:t xml:space="preserve">присутствует встроенный холст </w:t>
+      </w:r>
+      <w:r>
+        <w:rPr>
+          <w:lang w:val="en-US"/>
+        </w:rPr>
+        <w:t>Canvas</w:t>
+      </w:r>
+      <w:r>
+        <w:t xml:space="preserve">, </w:t>
+      </w:r>
+      <w:r>
+        <w:t>представляющий собой бесконечное полотно, на котором можно размещать заметки, изображения, карточки и строить между ними связи.</w:t>
+      </w:r>
+    </w:p>
+    <w:p>
+      <w:pPr>
+        <w:ind w:left="1712"/>
+      </w:pPr>
       <w:r>
         <w:t xml:space="preserve">Также в </w:t>
       </w:r>
@@ -1557,13 +1566,8 @@
         <w:t xml:space="preserve"> </w:t>
       </w:r>
       <w:r>
-        <w:t xml:space="preserve">реализованы функции быстрого поиска заметок по названию, фильтр по тэгам, задающимся внутри заметок, разделение рабочей области и </w:t>
-      </w:r>
-      <w:proofErr w:type="gramStart"/>
-      <w:r>
-        <w:t>т.д.</w:t>
-      </w:r>
-      <w:proofErr w:type="gramEnd"/>
+        <w:t>реализованы функции быстрого поиска заметок по названию, фильтр по тэгам, задающимся внутри заметок, разделение рабочей области и т.д.</w:t>
+      </w:r>
     </w:p>
     <w:p>
       <w:pPr>
@@ -1572,7 +1576,7 @@
           <w:ilvl w:val="1"/>
           <w:numId w:val="11"/>
         </w:numPr>
-        <w:ind w:left="1712" w:hanging="720"/>
+        <w:ind w:left="1429" w:hanging="720"/>
       </w:pPr>
       <w:r>
         <w:t xml:space="preserve">Дополнительные возможности – </w:t>
@@ -1595,15 +1599,17 @@
         <w:ind w:left="1712"/>
       </w:pPr>
       <w:r>
-        <w:t>Также есть возможность подключения функции синхронизации заметок между устройствами с одной учетной записью, данная функция является платной.</w:t>
-      </w:r>
-    </w:p>
-    <w:p>
-      <w:pPr>
-        <w:rPr>
-          <w:lang w:val="en-US"/>
-        </w:rPr>
-      </w:pPr>
+        <w:t xml:space="preserve">Также есть возможность подключения функции синхронизации заметок между устройствами с одной учетной записью, данная функция является платной. Однако есть возможность бесплатно синхронизировать свои записи при помощи пользовательских плагинов (например, через </w:t>
+      </w:r>
+      <w:r>
+        <w:rPr>
+          <w:lang w:val="en-US"/>
+        </w:rPr>
+        <w:t>git</w:t>
+      </w:r>
+      <w:r>
+        <w:t>).</w:t>
+      </w:r>
     </w:p>
     <w:p>
       <w:pPr>
@@ -1648,15 +1654,7 @@
         <w:t xml:space="preserve"> </w:t>
       </w:r>
       <w:r>
-        <w:t xml:space="preserve">является полная </w:t>
-      </w:r>
-      <w:proofErr w:type="spellStart"/>
-      <w:r>
-        <w:t>персонализируемость</w:t>
-      </w:r>
-      <w:proofErr w:type="spellEnd"/>
-      <w:r>
-        <w:t xml:space="preserve"> и расширяемость функционала за счёт внутреннего установщика пользовательских плагинов и тем.</w:t>
+        <w:t>является полная персонализируемость и расширяемость функционала за счёт внутреннего установщика пользовательских плагинов и тем.</w:t>
       </w:r>
     </w:p>
     <w:p>
@@ -1701,11 +1699,6 @@
       </w:r>
     </w:p>
     <w:p>
-      <w:pPr>
-        <w:rPr>
-          <w:lang w:val="en-US"/>
-        </w:rPr>
-      </w:pPr>
       <w:r>
         <w:rPr>
           <w:lang w:val="en-US"/>
@@ -1755,27 +1748,23 @@
         <w:t>RAW</w:t>
       </w:r>
       <w:r>
-        <w:t xml:space="preserve">-вид отрывка текста, если на него поставлен курсор, что может быть проблематично при навигации по тексту, например, любая таблица с использованием популярного плагина </w:t>
-      </w:r>
-      <w:proofErr w:type="spellStart"/>
+        <w:t xml:space="preserve">-вид отрывка текста, если на него поставлен курсор, что может быть проблематично при навигации по </w:t>
+      </w:r>
+      <w:r>
+        <w:lastRenderedPageBreak/>
+        <w:t xml:space="preserve">тексту, например, любая таблица с использованием популярного плагина </w:t>
+      </w:r>
       <w:r>
         <w:rPr>
           <w:lang w:val="en-US"/>
         </w:rPr>
         <w:t>DataView</w:t>
       </w:r>
-      <w:proofErr w:type="spellEnd"/>
       <w:r>
         <w:t xml:space="preserve"> может при вводе курсора в область ее разметки показать исходный код, который удается скрыть добавлением строк или переходом в режим чтения.</w:t>
       </w:r>
     </w:p>
-    <w:p>
-      <w:pPr>
-        <w:rPr>
-          <w:lang w:val="en-US"/>
-        </w:rPr>
-      </w:pPr>
-    </w:p>
+    <w:p/>
     <w:p>
       <w:pPr>
         <w:rPr>
@@ -1788,27 +1777,561 @@
           <w:b/>
           <w:bCs/>
         </w:rPr>
-        <w:lastRenderedPageBreak/>
-        <w:t xml:space="preserve">Сравнение </w:t>
-      </w:r>
-      <w:proofErr w:type="gramStart"/>
+        <w:t xml:space="preserve">Различия </w:t>
+      </w:r>
       <w:r>
         <w:rPr>
           <w:b/>
           <w:bCs/>
-        </w:rPr>
-        <w:t>с  моим</w:t>
-      </w:r>
-      <w:proofErr w:type="gramEnd"/>
+          <w:lang w:val="en-US"/>
+        </w:rPr>
+        <w:t>Obsidian</w:t>
+      </w:r>
       <w:r>
         <w:rPr>
           <w:b/>
           <w:bCs/>
         </w:rPr>
-        <w:t xml:space="preserve"> проектом:</w:t>
-      </w:r>
-    </w:p>
-    <w:p>
+        <w:t xml:space="preserve"> </w:t>
+      </w:r>
+      <w:r>
+        <w:rPr>
+          <w:b/>
+          <w:bCs/>
+        </w:rPr>
+        <w:t>и моего проекта</w:t>
+      </w:r>
+    </w:p>
+    <w:tbl>
+      <w:tblPr>
+        <w:tblStyle w:val="TableGrid"/>
+        <w:tblW w:w="0" w:type="auto"/>
+        <w:tblLook w:val="04A0" w:firstRow="1" w:lastRow="0" w:firstColumn="1" w:lastColumn="0" w:noHBand="0" w:noVBand="1"/>
+      </w:tblPr>
+      <w:tblGrid>
+        <w:gridCol w:w="3005"/>
+        <w:gridCol w:w="3005"/>
+        <w:gridCol w:w="3006"/>
+      </w:tblGrid>
+      <w:tr>
+        <w:tc>
+          <w:tcPr>
+            <w:tcW w:w="3005" w:type="dxa"/>
+          </w:tcPr>
+          <w:p>
+            <w:pPr>
+              <w:rPr>
+                <w:b/>
+                <w:bCs/>
+              </w:rPr>
+            </w:pPr>
+            <w:r>
+              <w:rPr>
+                <w:b/>
+                <w:bCs/>
+              </w:rPr>
+              <w:t>Критерий</w:t>
+            </w:r>
+          </w:p>
+        </w:tc>
+        <w:tc>
+          <w:tcPr>
+            <w:tcW w:w="3005" w:type="dxa"/>
+          </w:tcPr>
+          <w:p>
+            <w:pPr>
+              <w:rPr>
+                <w:b/>
+                <w:bCs/>
+                <w:lang w:val="en-US"/>
+              </w:rPr>
+            </w:pPr>
+            <w:r>
+              <w:rPr>
+                <w:b/>
+                <w:bCs/>
+                <w:lang w:val="en-US"/>
+              </w:rPr>
+              <w:t>Obsidian</w:t>
+            </w:r>
+          </w:p>
+        </w:tc>
+        <w:tc>
+          <w:tcPr>
+            <w:tcW w:w="3006" w:type="dxa"/>
+          </w:tcPr>
+          <w:p>
+            <w:pPr>
+              <w:rPr>
+                <w:b/>
+                <w:bCs/>
+              </w:rPr>
+            </w:pPr>
+            <w:r>
+              <w:rPr>
+                <w:b/>
+                <w:bCs/>
+                <w:lang w:val="en-US"/>
+              </w:rPr>
+              <w:t>Salvager</w:t>
+            </w:r>
+            <w:r>
+              <w:rPr>
+                <w:b/>
+                <w:bCs/>
+              </w:rPr>
+              <w:t xml:space="preserve"> (мой проект)</w:t>
+            </w:r>
+          </w:p>
+        </w:tc>
+      </w:tr>
+      <w:tr>
+        <w:tc>
+          <w:tcPr>
+            <w:tcW w:w="3005" w:type="dxa"/>
+          </w:tcPr>
+          <w:p>
+            <w:r>
+              <w:t>Назначение</w:t>
+            </w:r>
+          </w:p>
+        </w:tc>
+        <w:tc>
+          <w:tcPr>
+            <w:tcW w:w="3005" w:type="dxa"/>
+          </w:tcPr>
+          <w:p>
+            <w:r>
+              <w:t>Личная база знаний, рабочая записная книжка</w:t>
+            </w:r>
+          </w:p>
+        </w:tc>
+        <w:tc>
+          <w:tcPr>
+            <w:tcW w:w="3006" w:type="dxa"/>
+          </w:tcPr>
+          <w:p>
+            <w:r>
+              <w:t>Стилизованная личная энциклопедия</w:t>
+            </w:r>
+          </w:p>
+        </w:tc>
+      </w:tr>
+      <w:tr>
+        <w:tc>
+          <w:tcPr>
+            <w:tcW w:w="3005" w:type="dxa"/>
+          </w:tcPr>
+          <w:p>
+            <w:pPr>
+              <w:rPr>
+                <w:lang w:val="en-US"/>
+              </w:rPr>
+            </w:pPr>
+            <w:r>
+              <w:t>Отображение синтаксиса</w:t>
+            </w:r>
+          </w:p>
+        </w:tc>
+        <w:tc>
+          <w:tcPr>
+            <w:tcW w:w="3005" w:type="dxa"/>
+          </w:tcPr>
+          <w:p>
+            <w:r>
+              <w:t>Полноразмерное при помещении курсора рядом с форматированным текстом</w:t>
+            </w:r>
+          </w:p>
+        </w:tc>
+        <w:tc>
+          <w:tcPr>
+            <w:tcW w:w="3006" w:type="dxa"/>
+          </w:tcPr>
+          <w:p>
+            <w:r>
+              <w:t>Более скрытое и уменьшенное по сравнению с основным текстом</w:t>
+            </w:r>
+          </w:p>
+        </w:tc>
+      </w:tr>
+      <w:tr>
+        <w:tc>
+          <w:tcPr>
+            <w:tcW w:w="3005" w:type="dxa"/>
+          </w:tcPr>
+          <w:p>
+            <w:r>
+              <w:t>Нормализация синтаксиса</w:t>
+            </w:r>
+          </w:p>
+        </w:tc>
+        <w:tc>
+          <w:tcPr>
+            <w:tcW w:w="3005" w:type="dxa"/>
+          </w:tcPr>
+          <w:p>
+            <w:r>
+              <w:t>Принудительная нормализация отсутствует</w:t>
+            </w:r>
+          </w:p>
+        </w:tc>
+        <w:tc>
+          <w:tcPr>
+            <w:tcW w:w="3006" w:type="dxa"/>
+          </w:tcPr>
+          <w:p>
+            <w:r>
+              <w:t>Динамическое приведение синтаксиса к единому формату</w:t>
+            </w:r>
+          </w:p>
+        </w:tc>
+      </w:tr>
+      <w:tr>
+        <w:tc>
+          <w:tcPr>
+            <w:tcW w:w="3005" w:type="dxa"/>
+          </w:tcPr>
+          <w:p>
+            <w:r>
+              <w:t>Форматирование текста</w:t>
+            </w:r>
+          </w:p>
+        </w:tc>
+        <w:tc>
+          <w:tcPr>
+            <w:tcW w:w="3005" w:type="dxa"/>
+          </w:tcPr>
+          <w:p>
+            <w:r>
+              <w:t xml:space="preserve">Часть функций присутствует в </w:t>
+            </w:r>
+            <w:r>
+              <w:rPr>
+                <w:lang w:val="en-US"/>
+              </w:rPr>
+              <w:t>dropdown</w:t>
+            </w:r>
+            <w:r>
+              <w:t>-</w:t>
+            </w:r>
+            <w:r>
+              <w:rPr>
+                <w:lang w:val="en-US"/>
+              </w:rPr>
+              <w:t>menu</w:t>
+            </w:r>
+            <w:r>
+              <w:t>, горячие клавиши, ручной ввод синтаксиса часть функций реализована плагинами</w:t>
+            </w:r>
+          </w:p>
+        </w:tc>
+        <w:tc>
+          <w:tcPr>
+            <w:tcW w:w="3006" w:type="dxa"/>
+          </w:tcPr>
+          <w:p>
+            <w:r>
+              <w:t>Полная панель инструментов, система сочетаний клавиш и введение синтаксиса вручную</w:t>
+            </w:r>
+          </w:p>
+        </w:tc>
+      </w:tr>
+      <w:tr>
+        <w:tc>
+          <w:tcPr>
+            <w:tcW w:w="3005" w:type="dxa"/>
+          </w:tcPr>
+          <w:p>
+            <w:r>
+              <w:t>Плагины</w:t>
+            </w:r>
+          </w:p>
+        </w:tc>
+        <w:tc>
+          <w:tcPr>
+            <w:tcW w:w="3005" w:type="dxa"/>
+          </w:tcPr>
+          <w:p>
+            <w:r>
+              <w:t>Развитая система пользовательских плагинов. Многий функционал реализован с помощью них</w:t>
+            </w:r>
+          </w:p>
+        </w:tc>
+        <w:tc>
+          <w:tcPr>
+            <w:tcW w:w="3006" w:type="dxa"/>
+          </w:tcPr>
+          <w:p>
+            <w:r>
+              <w:t>Отказ от плагинов, предоставление функционала по умолчанию</w:t>
+            </w:r>
+          </w:p>
+        </w:tc>
+      </w:tr>
+      <w:tr>
+        <w:tc>
+          <w:tcPr>
+            <w:tcW w:w="3005" w:type="dxa"/>
+          </w:tcPr>
+          <w:p>
+            <w:r>
+              <w:t>Работа с внешними ссылками</w:t>
+            </w:r>
+          </w:p>
+        </w:tc>
+        <w:tc>
+          <w:tcPr>
+            <w:tcW w:w="3005" w:type="dxa"/>
+          </w:tcPr>
+          <w:p>
+            <w:r>
+              <w:t>Вставка скопированных ссылок из браузера</w:t>
+            </w:r>
+          </w:p>
+        </w:tc>
+        <w:tc>
+          <w:tcPr>
+            <w:tcW w:w="3006" w:type="dxa"/>
+          </w:tcPr>
+          <w:p>
+            <w:r>
+              <w:t>Быстрая вставка ссылок из интернета через встроенный поиск</w:t>
+            </w:r>
+          </w:p>
+        </w:tc>
+      </w:tr>
+      <w:tr>
+        <w:tc>
+          <w:tcPr>
+            <w:tcW w:w="3005" w:type="dxa"/>
+          </w:tcPr>
+          <w:p>
+            <w:r>
+              <w:t>Работа с внутренними ссылками</w:t>
+            </w:r>
+          </w:p>
+        </w:tc>
+        <w:tc>
+          <w:tcPr>
+            <w:tcW w:w="3005" w:type="dxa"/>
+          </w:tcPr>
+          <w:p>
+            <w:r>
+              <w:t>Ссылки на файлы и блоки текста из файлов внутри папки хранилища</w:t>
+            </w:r>
+          </w:p>
+        </w:tc>
+        <w:tc>
+          <w:tcPr>
+            <w:tcW w:w="3006" w:type="dxa"/>
+          </w:tcPr>
+          <w:p>
+            <w:r>
+              <w:t>Быстрая вставка ссылок на файлы из локальных папок</w:t>
+            </w:r>
+          </w:p>
+        </w:tc>
+      </w:tr>
+      <w:tr>
+        <w:tc>
+          <w:tcPr>
+            <w:tcW w:w="3005" w:type="dxa"/>
+          </w:tcPr>
+          <w:p>
+            <w:r>
+              <w:t>Синхронизация</w:t>
+            </w:r>
+          </w:p>
+        </w:tc>
+        <w:tc>
+          <w:tcPr>
+            <w:tcW w:w="3005" w:type="dxa"/>
+          </w:tcPr>
+          <w:p>
+            <w:r>
+              <w:t xml:space="preserve">Платно через официальную синхронизацию, также возможна настройка синхронизации через плагины (например, </w:t>
+            </w:r>
+            <w:r>
+              <w:rPr>
+                <w:lang w:val="en-US"/>
+              </w:rPr>
+              <w:t>git</w:t>
+            </w:r>
+            <w:r>
+              <w:t>)</w:t>
+            </w:r>
+          </w:p>
+        </w:tc>
+        <w:tc>
+          <w:tcPr>
+            <w:tcW w:w="3006" w:type="dxa"/>
+          </w:tcPr>
+          <w:p>
+            <w:r>
+              <w:t>Локальное хранение файлов без встроенных функций синхронизации</w:t>
+            </w:r>
+          </w:p>
+        </w:tc>
+      </w:tr>
+      <w:tr>
+        <w:tc>
+          <w:tcPr>
+            <w:tcW w:w="3005" w:type="dxa"/>
+          </w:tcPr>
+          <w:p>
+            <w:pPr>
+              <w:rPr>
+                <w:lang w:val="en-US"/>
+              </w:rPr>
+            </w:pPr>
+            <w:r>
+              <w:rPr>
+                <w:lang w:val="en-US"/>
+              </w:rPr>
+              <w:t>UI/UX</w:t>
+            </w:r>
+          </w:p>
+        </w:tc>
+        <w:tc>
+          <w:tcPr>
+            <w:tcW w:w="3005" w:type="dxa"/>
+          </w:tcPr>
+          <w:p>
+            <w:r>
+              <w:t>Профессиональный, настраиваемый и утилитарный</w:t>
+            </w:r>
+          </w:p>
+        </w:tc>
+        <w:tc>
+          <w:tcPr>
+            <w:tcW w:w="3006" w:type="dxa"/>
+          </w:tcPr>
+          <w:p>
+            <w:r>
+              <w:t>Тактильный и иммерсивный</w:t>
+            </w:r>
+          </w:p>
+        </w:tc>
+      </w:tr>
+      <w:tr>
+        <w:tc>
+          <w:tcPr>
+            <w:tcW w:w="3005" w:type="dxa"/>
+          </w:tcPr>
+          <w:p>
+            <w:r>
+              <w:lastRenderedPageBreak/>
+              <w:t>Система связей</w:t>
+            </w:r>
+          </w:p>
+        </w:tc>
+        <w:tc>
+          <w:tcPr>
+            <w:tcW w:w="3005" w:type="dxa"/>
+          </w:tcPr>
+          <w:p>
+            <w:r>
+              <w:rPr>
+                <w:lang w:val="en-US"/>
+              </w:rPr>
+              <w:t>Wiki</w:t>
+            </w:r>
+            <w:r>
+              <w:t>-</w:t>
+            </w:r>
+            <w:r>
+              <w:t xml:space="preserve">ссылки между файлами, </w:t>
+            </w:r>
+            <w:r>
+              <w:rPr>
+                <w:lang w:val="en-US"/>
+              </w:rPr>
+              <w:t>backlinks</w:t>
+            </w:r>
+            <w:r>
+              <w:t>, теги</w:t>
+            </w:r>
+          </w:p>
+        </w:tc>
+        <w:tc>
+          <w:tcPr>
+            <w:tcW w:w="3006" w:type="dxa"/>
+          </w:tcPr>
+          <w:p>
+            <w:r>
+              <w:rPr>
+                <w:lang w:val="en-US"/>
+              </w:rPr>
+              <w:t>Wiki</w:t>
+            </w:r>
+            <w:r>
+              <w:t>-</w:t>
+            </w:r>
+            <w:r>
+              <w:t>ссылки, теги, папки как узлы связи</w:t>
+            </w:r>
+          </w:p>
+        </w:tc>
+      </w:tr>
+      <w:tr>
+        <w:tc>
+          <w:tcPr>
+            <w:tcW w:w="3005" w:type="dxa"/>
+          </w:tcPr>
+          <w:p>
+            <w:r>
+              <w:t>Геймификация</w:t>
+            </w:r>
+          </w:p>
+        </w:tc>
+        <w:tc>
+          <w:tcPr>
+            <w:tcW w:w="3005" w:type="dxa"/>
+          </w:tcPr>
+          <w:p>
+            <w:r>
+              <w:t>Отсутствует</w:t>
+            </w:r>
+          </w:p>
+        </w:tc>
+        <w:tc>
+          <w:tcPr>
+            <w:tcW w:w="3006" w:type="dxa"/>
+          </w:tcPr>
+          <w:p>
+            <w:r>
+              <w:t>Представлена через интерфейс как мотиватор для ведения заметок</w:t>
+            </w:r>
+          </w:p>
+        </w:tc>
+      </w:tr>
+    </w:tbl>
+    <w:p/>
+    <w:p>
+      <w:r>
+        <w:t xml:space="preserve">Таким образом, мое приложение </w:t>
+      </w:r>
+      <w:r>
+        <w:rPr>
+          <w:lang w:val="en-US"/>
+        </w:rPr>
+        <w:t>Salvager</w:t>
+      </w:r>
+      <w:r>
+        <w:t xml:space="preserve"> </w:t>
+      </w:r>
+      <w:r>
+        <w:t xml:space="preserve">призвано решать проблему отсутствия легких и наглядных методов форматирования текста, отображения разметки </w:t>
+      </w:r>
+      <w:r>
+        <w:rPr>
+          <w:lang w:val="en-US"/>
+        </w:rPr>
+        <w:t>markdown</w:t>
+      </w:r>
+      <w:r>
+        <w:t xml:space="preserve">, а также, в отличие от </w:t>
+      </w:r>
       <w:r>
         <w:rPr>
           <w:lang w:val="en-US"/>
@@ -1816,37 +2339,112 @@
         <w:t>Obsidian</w:t>
       </w:r>
       <w:r>
-        <w:t xml:space="preserve"> </w:t>
-      </w:r>
-      <w:r>
-        <w:t xml:space="preserve">является наиболее близким по задумке проектом из существующих, однако </w:t>
-      </w:r>
-      <w:r>
-        <w:rPr>
-          <w:lang w:val="en-US"/>
-        </w:rPr>
-        <w:t>Salvager</w:t>
-      </w:r>
-      <w:r>
-        <w:t xml:space="preserve"> </w:t>
-      </w:r>
-      <w:r>
-        <w:t>будет делать упор на следующие задачи</w:t>
-      </w:r>
-      <w:r>
-        <w:t>:</w:t>
-      </w:r>
-    </w:p>
+        <w:t>, не будет иметь систему плагинов, что позволит пользователю иметь весь функционал приложения сразу после установки, без настройки.</w:t>
+      </w:r>
+    </w:p>
+    <w:p/>
     <w:p>
       <w:pPr>
         <w:pStyle w:val="ListParagraph"/>
         <w:numPr>
           <w:ilvl w:val="0"/>
-          <w:numId w:val="2"/>
-        </w:numPr>
-      </w:pPr>
-      <w:r>
-        <w:t xml:space="preserve">Улучшение читаемости и отображения </w:t>
+          <w:numId w:val="11"/>
+        </w:numPr>
+        <w:ind w:left="643"/>
+      </w:pPr>
+      <w:r>
+        <w:rPr>
+          <w:b/>
+          <w:bCs/>
+          <w:lang w:val="en-US"/>
+        </w:rPr>
+        <w:t>Typora</w:t>
+      </w:r>
+      <w:r>
+        <w:rPr>
+          <w:b/>
+          <w:bCs/>
+        </w:rPr>
+        <w:t xml:space="preserve"> </w:t>
+      </w:r>
+      <w:r>
+        <w:t xml:space="preserve">– позиционируется как приложение для комфортного написания и чтения текста в минималистичном редакторе. </w:t>
+      </w:r>
+      <w:r>
+        <w:rPr>
+          <w:lang w:val="en-US"/>
+        </w:rPr>
+        <w:t>Typora</w:t>
+      </w:r>
+      <w:r>
+        <w:t xml:space="preserve"> </w:t>
+      </w:r>
+      <w:r>
+        <w:t xml:space="preserve">реализует бесшовный </w:t>
+      </w:r>
+      <w:r>
+        <w:rPr>
+          <w:lang w:val="en-US"/>
+        </w:rPr>
+        <w:t>Live</w:t>
+      </w:r>
+      <w:r>
+        <w:t xml:space="preserve"> </w:t>
+      </w:r>
+      <w:r>
+        <w:rPr>
+          <w:lang w:val="en-US"/>
+        </w:rPr>
+        <w:t>Preview</w:t>
+      </w:r>
+      <w:r>
+        <w:t xml:space="preserve">, </w:t>
+      </w:r>
+      <w:r>
+        <w:t xml:space="preserve">который работает по принципу быстрого скрытия </w:t>
+      </w:r>
+      <w:r>
+        <w:rPr>
+          <w:lang w:val="en-US"/>
+        </w:rPr>
+        <w:t>Markdown</w:t>
+      </w:r>
+      <w:r>
+        <w:t>.</w:t>
+      </w:r>
+    </w:p>
+    <w:p>
+      <w:pPr>
+        <w:pStyle w:val="ListParagraph"/>
+        <w:ind w:left="643"/>
+        <w:rPr>
+          <w:b/>
+          <w:bCs/>
+        </w:rPr>
+      </w:pPr>
+    </w:p>
+    <w:p>
+      <w:pPr>
+        <w:pStyle w:val="ListParagraph"/>
+        <w:ind w:left="643"/>
+        <w:rPr>
+          <w:lang w:val="en-US"/>
+        </w:rPr>
+      </w:pPr>
+      <w:r>
+        <w:t>В</w:t>
+      </w:r>
+      <w:r>
+        <w:t xml:space="preserve"> </w:t>
+      </w:r>
+      <w:r>
+        <w:rPr>
+          <w:lang w:val="en-US"/>
+        </w:rPr>
+        <w:t>Typora</w:t>
+      </w:r>
+      <w:r>
+        <w:t xml:space="preserve"> </w:t>
       </w:r>
       <w:r>
         <w:rPr>
@@ -1855,7 +2453,46 @@
         <w:t>markdown</w:t>
       </w:r>
       <w:r>
-        <w:t xml:space="preserve">-синтаксиса в </w:t>
+        <w:t xml:space="preserve"> </w:t>
+      </w:r>
+      <w:r>
+        <w:t>синтаксис</w:t>
+      </w:r>
+      <w:r>
+        <w:t xml:space="preserve">, </w:t>
+      </w:r>
+      <w:r>
+        <w:t>так же,</w:t>
+      </w:r>
+      <w:r>
+        <w:t xml:space="preserve"> </w:t>
+      </w:r>
+      <w:r>
+        <w:t>как</w:t>
+      </w:r>
+      <w:r>
+        <w:t xml:space="preserve"> </w:t>
+      </w:r>
+      <w:r>
+        <w:t>и</w:t>
+      </w:r>
+      <w:r>
+        <w:t xml:space="preserve"> </w:t>
+      </w:r>
+      <w:r>
+        <w:t>в</w:t>
+      </w:r>
+      <w:r>
+        <w:t xml:space="preserve"> </w:t>
+      </w:r>
+      <w:r>
+        <w:rPr>
+          <w:lang w:val="en-US"/>
+        </w:rPr>
+        <w:t>Obsidian</w:t>
+      </w:r>
+      <w:r>
+        <w:t xml:space="preserve"> </w:t>
       </w:r>
       <w:r>
         <w:rPr>
@@ -1873,114 +2510,1092 @@
         <w:t>Preview</w:t>
       </w:r>
       <w:r>
+        <w:t xml:space="preserve">, </w:t>
+      </w:r>
+      <w:r>
+        <w:rPr>
+          <w:lang w:val="en-US"/>
+        </w:rPr>
+        <w:t>markdown</w:t>
+      </w:r>
+      <w:r>
+        <w:t xml:space="preserve"> </w:t>
+      </w:r>
+      <w:r>
+        <w:t>синтаксис отображается, когда курсор находится в поле действия стиля. Однако есть визуальная минимизация разметки – отображается прозрачнее остального текста.</w:t>
+      </w:r>
+    </w:p>
+    <w:p>
+      <w:pPr>
+        <w:pStyle w:val="ListParagraph"/>
+        <w:ind w:left="643"/>
+        <w:rPr>
+          <w:lang w:val="en-US"/>
+        </w:rPr>
+      </w:pPr>
+    </w:p>
+    <w:p>
+      <w:pPr>
+        <w:pStyle w:val="ListParagraph"/>
+        <w:numPr>
+          <w:ilvl w:val="1"/>
+          <w:numId w:val="11"/>
+        </w:numPr>
+        <w:ind w:left="1429" w:hanging="720"/>
+      </w:pPr>
+      <w:r>
+        <w:t xml:space="preserve">Технологический стек – как и </w:t>
+      </w:r>
+      <w:r>
+        <w:rPr>
+          <w:lang w:val="en-US"/>
+        </w:rPr>
+        <w:t>Obsidian</w:t>
+      </w:r>
+      <w:r>
+        <w:t>,</w:t>
+      </w:r>
+      <w:r>
+        <w:t xml:space="preserve"> приложение</w:t>
+      </w:r>
+      <w:r>
+        <w:t xml:space="preserve"> </w:t>
+      </w:r>
+      <w:r>
+        <w:t xml:space="preserve">разработано на платформе </w:t>
+      </w:r>
+      <w:r>
+        <w:rPr>
+          <w:lang w:val="en-US"/>
+        </w:rPr>
+        <w:t>Electron</w:t>
+      </w:r>
+      <w:r>
         <w:t>.</w:t>
       </w:r>
     </w:p>
     <w:p>
       <w:pPr>
         <w:pStyle w:val="ListParagraph"/>
+        <w:ind w:left="1425"/>
+      </w:pPr>
+      <w:r>
+        <w:t xml:space="preserve">Редактирование текста и обработка </w:t>
+      </w:r>
+      <w:r>
+        <w:rPr>
+          <w:lang w:val="en-US"/>
+        </w:rPr>
+        <w:t>Markdown</w:t>
+      </w:r>
+      <w:r>
+        <w:t xml:space="preserve"> </w:t>
+      </w:r>
+      <w:r>
+        <w:t>–</w:t>
+      </w:r>
+      <w:r>
+        <w:t xml:space="preserve"> </w:t>
+      </w:r>
+      <w:r>
+        <w:t xml:space="preserve">ядро редактора построено на </w:t>
+      </w:r>
+      <w:r>
+        <w:rPr>
+          <w:lang w:val="en-US"/>
+        </w:rPr>
+        <w:t>CodeMirror</w:t>
+      </w:r>
+      <w:r>
+        <w:t xml:space="preserve">. При вводе текст преобразуется в </w:t>
+      </w:r>
+      <w:r>
+        <w:rPr>
+          <w:lang w:val="en-US"/>
+        </w:rPr>
+        <w:t>AST</w:t>
+      </w:r>
+      <w:r>
+        <w:t xml:space="preserve">, на его основе строится визуальное отображение документа. </w:t>
+      </w:r>
+      <w:r>
+        <w:rPr>
+          <w:lang w:val="en-US"/>
+        </w:rPr>
+        <w:t>Typora</w:t>
+      </w:r>
+      <w:r>
+        <w:t xml:space="preserve"> </w:t>
+      </w:r>
+      <w:r>
+        <w:t xml:space="preserve">следует спецификации </w:t>
+      </w:r>
+      <w:r>
+        <w:rPr>
+          <w:lang w:val="en-US"/>
+        </w:rPr>
+        <w:t>GitHub</w:t>
+      </w:r>
+      <w:r>
+        <w:t xml:space="preserve"> </w:t>
+      </w:r>
+      <w:r>
+        <w:rPr>
+          <w:lang w:val="en-US"/>
+        </w:rPr>
+        <w:t>Flavored</w:t>
+      </w:r>
+      <w:r>
+        <w:t xml:space="preserve"> </w:t>
+      </w:r>
+      <w:r>
+        <w:rPr>
+          <w:lang w:val="en-US"/>
+        </w:rPr>
+        <w:t>Markdown</w:t>
+      </w:r>
+      <w:r>
+        <w:t>.</w:t>
+      </w:r>
+    </w:p>
+    <w:p>
+      <w:pPr>
+        <w:pStyle w:val="ListParagraph"/>
+        <w:numPr>
+          <w:ilvl w:val="1"/>
+          <w:numId w:val="11"/>
+        </w:numPr>
+        <w:ind w:left="1429" w:hanging="720"/>
+      </w:pPr>
+      <w:r>
+        <w:t xml:space="preserve">Отображение текста – в </w:t>
+      </w:r>
+      <w:r>
+        <w:rPr>
+          <w:lang w:val="en-US"/>
+        </w:rPr>
+        <w:t>Typora</w:t>
+      </w:r>
+      <w:r>
+        <w:t xml:space="preserve">, </w:t>
+      </w:r>
+      <w:r>
+        <w:t xml:space="preserve">как и в </w:t>
+      </w:r>
+      <w:r>
+        <w:rPr>
+          <w:lang w:val="en-US"/>
+        </w:rPr>
+        <w:t>Live</w:t>
+      </w:r>
+      <w:r>
+        <w:t xml:space="preserve"> </w:t>
+      </w:r>
+      <w:r>
+        <w:rPr>
+          <w:lang w:val="en-US"/>
+        </w:rPr>
+        <w:t>Preview</w:t>
+      </w:r>
+      <w:r>
+        <w:t xml:space="preserve"> </w:t>
+      </w:r>
+      <w:r>
+        <w:rPr>
+          <w:lang w:val="en-US"/>
+        </w:rPr>
+        <w:t>Obsidian</w:t>
+      </w:r>
+      <w:r>
+        <w:t xml:space="preserve">, </w:t>
+      </w:r>
+      <w:r>
+        <w:t xml:space="preserve">реализован </w:t>
+      </w:r>
+      <w:r>
+        <w:rPr>
+          <w:lang w:val="en-US"/>
+        </w:rPr>
+        <w:t>WYSIWYG</w:t>
+      </w:r>
+      <w:r>
+        <w:t xml:space="preserve"> </w:t>
+      </w:r>
+      <w:r>
+        <w:t xml:space="preserve">механизм отображения текста. Весь синтаксис скрывается в неактивных узлах абстрактного дерева при помощи </w:t>
+      </w:r>
+      <w:r>
+        <w:rPr>
+          <w:lang w:val="en-US"/>
+        </w:rPr>
+        <w:t>CodeMirror</w:t>
+      </w:r>
+      <w:r>
+        <w:t xml:space="preserve">-декораций. </w:t>
+      </w:r>
+    </w:p>
+    <w:p>
+      <w:pPr>
+        <w:ind w:left="1416"/>
+      </w:pPr>
+      <w:r>
+        <w:t>Также присутствует режим отображения исходного текста, режим</w:t>
+      </w:r>
+      <w:r>
+        <w:t xml:space="preserve"> </w:t>
+      </w:r>
+      <w:r>
+        <w:t>«Печатной машинки», который отображает текущую строку посередине документа, пролистывая его, и режим «Фокус», который выделяет текущий блок</w:t>
+      </w:r>
+      <w:r>
+        <w:t>/</w:t>
+      </w:r>
+      <w:r>
+        <w:t>строку, а оставшийся текст становится полупрозрачным.</w:t>
+      </w:r>
+    </w:p>
+    <w:p>
+      <w:pPr>
+        <w:pStyle w:val="ListParagraph"/>
+        <w:numPr>
+          <w:ilvl w:val="1"/>
+          <w:numId w:val="11"/>
+        </w:numPr>
+        <w:ind w:left="1429" w:hanging="720"/>
+      </w:pPr>
+      <w:r>
+        <w:t xml:space="preserve">Файловая система и хранение заметок – </w:t>
+      </w:r>
+      <w:r>
+        <w:rPr>
+          <w:lang w:val="en-US"/>
+        </w:rPr>
+        <w:t>Typora</w:t>
+      </w:r>
+      <w:r>
+        <w:t xml:space="preserve"> </w:t>
+      </w:r>
+      <w:r>
+        <w:t xml:space="preserve">работает с локальными файлами без использования конкретной внутренней системы хранения. Файлы сохраняются как обычные текстовые на </w:t>
+      </w:r>
+      <w:r>
+        <w:lastRenderedPageBreak/>
+        <w:t xml:space="preserve">локальной машине. Вставляемые картинки сохраняются в указанной в настройках папке, а ссылки на них в </w:t>
+      </w:r>
+      <w:r>
+        <w:rPr>
+          <w:lang w:val="en-US"/>
+        </w:rPr>
+        <w:t>Markdown</w:t>
+      </w:r>
+      <w:r>
+        <w:t>-формате генерируются автоматически.</w:t>
+      </w:r>
+    </w:p>
+    <w:p>
+      <w:pPr>
+        <w:pStyle w:val="ListParagraph"/>
+        <w:numPr>
+          <w:ilvl w:val="1"/>
+          <w:numId w:val="11"/>
+        </w:numPr>
+        <w:ind w:left="1429" w:hanging="720"/>
+      </w:pPr>
+      <w:r>
+        <w:t xml:space="preserve">Дополнительные возможности – поддержка </w:t>
+      </w:r>
+      <w:r>
+        <w:rPr>
+          <w:lang w:val="en-US"/>
+        </w:rPr>
+        <w:t>LaTeX</w:t>
+      </w:r>
+      <w:r>
+        <w:t>-</w:t>
+      </w:r>
+      <w:r>
+        <w:t xml:space="preserve">формул, диаграмм, блок схем через вспомогательные библиотеки </w:t>
+      </w:r>
+      <w:r>
+        <w:rPr>
+          <w:lang w:val="en-US"/>
+        </w:rPr>
+        <w:t>MathJax</w:t>
+      </w:r>
+      <w:r>
+        <w:t xml:space="preserve">, </w:t>
+      </w:r>
+      <w:r>
+        <w:rPr>
+          <w:lang w:val="en-US"/>
+        </w:rPr>
+        <w:t>Mermaid</w:t>
+      </w:r>
+      <w:r>
+        <w:t>.</w:t>
+      </w:r>
+      <w:r>
+        <w:rPr>
+          <w:lang w:val="en-US"/>
+        </w:rPr>
+        <w:t>js</w:t>
+      </w:r>
+      <w:r>
+        <w:t xml:space="preserve">. </w:t>
+      </w:r>
+      <w:r>
+        <w:t xml:space="preserve">Таблицы есть возможность изменять посредством использования </w:t>
+      </w:r>
+      <w:r>
+        <w:rPr>
+          <w:lang w:val="en-US"/>
+        </w:rPr>
+        <w:t>GUI</w:t>
+      </w:r>
+      <w:r>
+        <w:t xml:space="preserve">-элементов. Возможен экспорт в сторонние форматы при помощи </w:t>
+      </w:r>
+      <w:r>
+        <w:rPr>
+          <w:lang w:val="en-US"/>
+        </w:rPr>
+        <w:t>Pandoc.</w:t>
+      </w:r>
+    </w:p>
+    <w:p>
+      <w:pPr>
+        <w:pStyle w:val="ListParagraph"/>
+        <w:ind w:left="420"/>
+        <w:rPr>
+          <w:lang w:val="en-US"/>
+        </w:rPr>
+      </w:pPr>
+    </w:p>
+    <w:p>
+      <w:pPr>
+        <w:rPr>
+          <w:b/>
+          <w:bCs/>
+        </w:rPr>
+      </w:pPr>
+      <w:r>
+        <w:rPr>
+          <w:b/>
+          <w:bCs/>
+        </w:rPr>
+        <w:t>Достоинства:</w:t>
+      </w:r>
+    </w:p>
+    <w:p>
+      <w:r>
+        <w:rPr>
+          <w:lang w:val="en-US"/>
+        </w:rPr>
+        <w:t>Typora</w:t>
+      </w:r>
+      <w:r>
+        <w:t xml:space="preserve"> </w:t>
+      </w:r>
+      <w:r>
+        <w:t xml:space="preserve">является очень легковесной программой для ведения независимых заметок и в целом для написания текста. Обладает минималистичным дизайном, эффективно скрывает синтаксис </w:t>
+      </w:r>
+      <w:r>
+        <w:rPr>
+          <w:lang w:val="en-US"/>
+        </w:rPr>
+        <w:t>Markdown</w:t>
+      </w:r>
+      <w:r>
+        <w:t>.</w:t>
+      </w:r>
+    </w:p>
+    <w:p>
+      <w:r>
+        <w:t>Без использования сторонних плагинов имеет весь необходимый функционал. Есть поддержка формул, диаграмм, таблиц и экспорта в сторонние форматы, по умолчанию таблицы обладают удобной и понятной системой редактирования.</w:t>
+      </w:r>
+    </w:p>
+    <w:p>
+      <w:pPr>
+        <w:rPr>
+          <w:b/>
+          <w:bCs/>
+        </w:rPr>
+      </w:pPr>
+      <w:r>
+        <w:rPr>
+          <w:b/>
+          <w:bCs/>
+        </w:rPr>
+        <w:t>Недостатки:</w:t>
+      </w:r>
+    </w:p>
+    <w:p>
+      <w:r>
+        <w:rPr>
+          <w:lang w:val="en-US"/>
+        </w:rPr>
+        <w:t>Typora</w:t>
+      </w:r>
+      <w:r>
+        <w:t xml:space="preserve"> – </w:t>
+      </w:r>
+      <w:r>
+        <w:t xml:space="preserve">коммерческий продукт с разовой оплатой и с закрытым кодом. У приложения полностью отсутствует официальная система поддержки плагинов, однако существуют проекты, работающие по принципу перехвата выполнения кода оригинала, в связи с этим расширение ограничено. </w:t>
+      </w:r>
+    </w:p>
+    <w:p>
+      <w:r>
+        <w:t xml:space="preserve">Отсутствует, ввиду назначения программы, система ссылок между заметками – </w:t>
+      </w:r>
+      <w:r>
+        <w:rPr>
+          <w:lang w:val="en-US"/>
+        </w:rPr>
+        <w:t>Typora</w:t>
+      </w:r>
+      <w:r>
+        <w:t xml:space="preserve"> </w:t>
+      </w:r>
+      <w:r>
+        <w:t>работает с независимыми друг от друга документами, так как это писательский инструмент.</w:t>
+      </w:r>
+    </w:p>
+    <w:p/>
+    <w:p>
+      <w:pPr>
+        <w:rPr>
+          <w:b/>
+          <w:bCs/>
+        </w:rPr>
+      </w:pPr>
+      <w:r>
+        <w:rPr>
+          <w:b/>
+          <w:bCs/>
+        </w:rPr>
+        <w:t xml:space="preserve">Различия </w:t>
+      </w:r>
+      <w:r>
+        <w:rPr>
+          <w:b/>
+          <w:bCs/>
+          <w:lang w:val="en-US"/>
+        </w:rPr>
+        <w:t>Typora</w:t>
+      </w:r>
+      <w:r>
+        <w:rPr>
+          <w:b/>
+          <w:bCs/>
+        </w:rPr>
+        <w:t xml:space="preserve"> </w:t>
+      </w:r>
+      <w:r>
+        <w:rPr>
+          <w:b/>
+          <w:bCs/>
+        </w:rPr>
+        <w:t>и моего проекта</w:t>
+      </w:r>
+    </w:p>
+    <w:tbl>
+      <w:tblPr>
+        <w:tblStyle w:val="TableGrid"/>
+        <w:tblW w:w="0" w:type="auto"/>
+        <w:tblLook w:val="04A0" w:firstRow="1" w:lastRow="0" w:firstColumn="1" w:lastColumn="0" w:noHBand="0" w:noVBand="1"/>
+      </w:tblPr>
+      <w:tblGrid>
+        <w:gridCol w:w="3005"/>
+        <w:gridCol w:w="3005"/>
+        <w:gridCol w:w="3006"/>
+      </w:tblGrid>
+      <w:tr>
+        <w:tc>
+          <w:tcPr>
+            <w:tcW w:w="3005" w:type="dxa"/>
+          </w:tcPr>
+          <w:p>
+            <w:pPr>
+              <w:rPr>
+                <w:b/>
+                <w:bCs/>
+              </w:rPr>
+            </w:pPr>
+            <w:r>
+              <w:rPr>
+                <w:b/>
+                <w:bCs/>
+              </w:rPr>
+              <w:t>Критерий</w:t>
+            </w:r>
+          </w:p>
+        </w:tc>
+        <w:tc>
+          <w:tcPr>
+            <w:tcW w:w="3005" w:type="dxa"/>
+          </w:tcPr>
+          <w:p>
+            <w:pPr>
+              <w:rPr>
+                <w:b/>
+                <w:bCs/>
+                <w:lang w:val="en-US"/>
+              </w:rPr>
+            </w:pPr>
+            <w:r>
+              <w:rPr>
+                <w:b/>
+                <w:bCs/>
+                <w:lang w:val="en-US"/>
+              </w:rPr>
+              <w:t>Typora</w:t>
+            </w:r>
+          </w:p>
+        </w:tc>
+        <w:tc>
+          <w:tcPr>
+            <w:tcW w:w="3006" w:type="dxa"/>
+          </w:tcPr>
+          <w:p>
+            <w:pPr>
+              <w:rPr>
+                <w:b/>
+                <w:bCs/>
+              </w:rPr>
+            </w:pPr>
+            <w:r>
+              <w:rPr>
+                <w:b/>
+                <w:bCs/>
+                <w:lang w:val="en-US"/>
+              </w:rPr>
+              <w:t>Salvager</w:t>
+            </w:r>
+            <w:r>
+              <w:rPr>
+                <w:b/>
+                <w:bCs/>
+              </w:rPr>
+              <w:t xml:space="preserve"> (мой проект)</w:t>
+            </w:r>
+          </w:p>
+        </w:tc>
+      </w:tr>
+      <w:tr>
+        <w:tc>
+          <w:tcPr>
+            <w:tcW w:w="3005" w:type="dxa"/>
+          </w:tcPr>
+          <w:p>
+            <w:r>
+              <w:t>Назначение</w:t>
+            </w:r>
+          </w:p>
+        </w:tc>
+        <w:tc>
+          <w:tcPr>
+            <w:tcW w:w="3005" w:type="dxa"/>
+          </w:tcPr>
+          <w:p>
+            <w:r>
+              <w:t>Инструмент для писателей, работа с отдельными текстовыми файлами</w:t>
+            </w:r>
+          </w:p>
+        </w:tc>
+        <w:tc>
+          <w:tcPr>
+            <w:tcW w:w="3006" w:type="dxa"/>
+          </w:tcPr>
+          <w:p>
+            <w:r>
+              <w:t>Стилизованная личная энциклопедия</w:t>
+            </w:r>
+          </w:p>
+        </w:tc>
+      </w:tr>
+      <w:tr>
+        <w:tc>
+          <w:tcPr>
+            <w:tcW w:w="3005" w:type="dxa"/>
+          </w:tcPr>
+          <w:p>
+            <w:pPr>
+              <w:rPr>
+                <w:lang w:val="en-US"/>
+              </w:rPr>
+            </w:pPr>
+            <w:r>
+              <w:t>Отображение синтаксиса</w:t>
+            </w:r>
+          </w:p>
+        </w:tc>
+        <w:tc>
+          <w:tcPr>
+            <w:tcW w:w="3005" w:type="dxa"/>
+          </w:tcPr>
+          <w:p>
+            <w:r>
+              <w:t>Минимизированное - при помещении курсора рядом с форматированным текстом</w:t>
+            </w:r>
+          </w:p>
+        </w:tc>
+        <w:tc>
+          <w:tcPr>
+            <w:tcW w:w="3006" w:type="dxa"/>
+          </w:tcPr>
+          <w:p>
+            <w:r>
+              <w:t>Более скрытое и уменьшенное по сравнению с основным текстом</w:t>
+            </w:r>
+          </w:p>
+        </w:tc>
+      </w:tr>
+      <w:tr>
+        <w:tc>
+          <w:tcPr>
+            <w:tcW w:w="3005" w:type="dxa"/>
+          </w:tcPr>
+          <w:p>
+            <w:r>
+              <w:lastRenderedPageBreak/>
+              <w:t>Нормализация синтаксиса</w:t>
+            </w:r>
+          </w:p>
+        </w:tc>
+        <w:tc>
+          <w:tcPr>
+            <w:tcW w:w="3005" w:type="dxa"/>
+          </w:tcPr>
+          <w:p>
+            <w:r>
+              <w:t>Принудительная нормализация отсутствует</w:t>
+            </w:r>
+          </w:p>
+        </w:tc>
+        <w:tc>
+          <w:tcPr>
+            <w:tcW w:w="3006" w:type="dxa"/>
+          </w:tcPr>
+          <w:p>
+            <w:r>
+              <w:t>Динамическое приведение синтаксиса к единому формату</w:t>
+            </w:r>
+          </w:p>
+        </w:tc>
+      </w:tr>
+      <w:tr>
+        <w:tc>
+          <w:tcPr>
+            <w:tcW w:w="3005" w:type="dxa"/>
+          </w:tcPr>
+          <w:p>
+            <w:r>
+              <w:t>Форматирование текста</w:t>
+            </w:r>
+          </w:p>
+        </w:tc>
+        <w:tc>
+          <w:tcPr>
+            <w:tcW w:w="3005" w:type="dxa"/>
+          </w:tcPr>
+          <w:p>
+            <w:r>
+              <w:t xml:space="preserve">Часть функций присутствует в </w:t>
+            </w:r>
+            <w:r>
+              <w:rPr>
+                <w:lang w:val="en-US"/>
+              </w:rPr>
+              <w:t>dropdown</w:t>
+            </w:r>
+            <w:r>
+              <w:t>-</w:t>
+            </w:r>
+            <w:r>
+              <w:rPr>
+                <w:lang w:val="en-US"/>
+              </w:rPr>
+              <w:t>menu</w:t>
+            </w:r>
+            <w:r>
+              <w:t>, горячие клавиши, ручной ввод синтаксиса часть функций реализована плагинами</w:t>
+            </w:r>
+          </w:p>
+        </w:tc>
+        <w:tc>
+          <w:tcPr>
+            <w:tcW w:w="3006" w:type="dxa"/>
+          </w:tcPr>
+          <w:p>
+            <w:r>
+              <w:t>Полная панель инструментов, система сочетаний клавиш и введение синтаксиса вручную</w:t>
+            </w:r>
+          </w:p>
+        </w:tc>
+      </w:tr>
+      <w:tr>
+        <w:tc>
+          <w:tcPr>
+            <w:tcW w:w="3005" w:type="dxa"/>
+          </w:tcPr>
+          <w:p>
+            <w:r>
+              <w:t>Плагины</w:t>
+            </w:r>
+          </w:p>
+        </w:tc>
+        <w:tc>
+          <w:tcPr>
+            <w:tcW w:w="3005" w:type="dxa"/>
+          </w:tcPr>
+          <w:p>
+            <w:pPr>
+              <w:rPr>
+                <w:lang w:val="en-US"/>
+              </w:rPr>
+            </w:pPr>
+            <w:r>
+              <w:t>Официальная поддержка плагинов отсутствует</w:t>
+            </w:r>
+          </w:p>
+        </w:tc>
+        <w:tc>
+          <w:tcPr>
+            <w:tcW w:w="3006" w:type="dxa"/>
+          </w:tcPr>
+          <w:p>
+            <w:r>
+              <w:t>Отказ от плагинов, предоставление функционала по умолчанию</w:t>
+            </w:r>
+          </w:p>
+        </w:tc>
+      </w:tr>
+      <w:tr>
+        <w:tc>
+          <w:tcPr>
+            <w:tcW w:w="3005" w:type="dxa"/>
+          </w:tcPr>
+          <w:p>
+            <w:r>
+              <w:t>Работа с внешними ссылками</w:t>
+            </w:r>
+          </w:p>
+        </w:tc>
+        <w:tc>
+          <w:tcPr>
+            <w:tcW w:w="3005" w:type="dxa"/>
+          </w:tcPr>
+          <w:p>
+            <w:r>
+              <w:t>Вставка скопированных ссылок из браузера</w:t>
+            </w:r>
+          </w:p>
+        </w:tc>
+        <w:tc>
+          <w:tcPr>
+            <w:tcW w:w="3006" w:type="dxa"/>
+          </w:tcPr>
+          <w:p>
+            <w:r>
+              <w:t>Быстрая вставка ссылок из интернета через встроенный поиск</w:t>
+            </w:r>
+          </w:p>
+        </w:tc>
+      </w:tr>
+      <w:tr>
+        <w:tc>
+          <w:tcPr>
+            <w:tcW w:w="3005" w:type="dxa"/>
+          </w:tcPr>
+          <w:p>
+            <w:r>
+              <w:t>Работа с внутренними ссылками</w:t>
+            </w:r>
+          </w:p>
+        </w:tc>
+        <w:tc>
+          <w:tcPr>
+            <w:tcW w:w="3005" w:type="dxa"/>
+          </w:tcPr>
+          <w:p>
+            <w:r>
+              <w:t>Отсутствует</w:t>
+            </w:r>
+          </w:p>
+        </w:tc>
+        <w:tc>
+          <w:tcPr>
+            <w:tcW w:w="3006" w:type="dxa"/>
+          </w:tcPr>
+          <w:p>
+            <w:r>
+              <w:t>Быстрая вставка ссылок на файлы из локальных папок</w:t>
+            </w:r>
+          </w:p>
+        </w:tc>
+      </w:tr>
+      <w:tr>
+        <w:tc>
+          <w:tcPr>
+            <w:tcW w:w="3005" w:type="dxa"/>
+          </w:tcPr>
+          <w:p>
+            <w:r>
+              <w:t>Синхронизация</w:t>
+            </w:r>
+          </w:p>
+        </w:tc>
+        <w:tc>
+          <w:tcPr>
+            <w:tcW w:w="3005" w:type="dxa"/>
+          </w:tcPr>
+          <w:p>
+            <w:r>
+              <w:t>Отсутствует</w:t>
+            </w:r>
+          </w:p>
+        </w:tc>
+        <w:tc>
+          <w:tcPr>
+            <w:tcW w:w="3006" w:type="dxa"/>
+          </w:tcPr>
+          <w:p>
+            <w:r>
+              <w:t>Локальное хранение файлов без встроенных функций синхронизации</w:t>
+            </w:r>
+          </w:p>
+        </w:tc>
+      </w:tr>
+      <w:tr>
+        <w:tc>
+          <w:tcPr>
+            <w:tcW w:w="3005" w:type="dxa"/>
+          </w:tcPr>
+          <w:p>
+            <w:pPr>
+              <w:rPr>
+                <w:lang w:val="en-US"/>
+              </w:rPr>
+            </w:pPr>
+            <w:r>
+              <w:rPr>
+                <w:lang w:val="en-US"/>
+              </w:rPr>
+              <w:t>UI/UX</w:t>
+            </w:r>
+          </w:p>
+        </w:tc>
+        <w:tc>
+          <w:tcPr>
+            <w:tcW w:w="3005" w:type="dxa"/>
+          </w:tcPr>
+          <w:p>
+            <w:r>
+              <w:t>Минималистичный и наглядный</w:t>
+            </w:r>
+          </w:p>
+        </w:tc>
+        <w:tc>
+          <w:tcPr>
+            <w:tcW w:w="3006" w:type="dxa"/>
+          </w:tcPr>
+          <w:p>
+            <w:r>
+              <w:t>Тактильный и иммерсивный</w:t>
+            </w:r>
+          </w:p>
+        </w:tc>
+      </w:tr>
+      <w:tr>
+        <w:tc>
+          <w:tcPr>
+            <w:tcW w:w="3005" w:type="dxa"/>
+          </w:tcPr>
+          <w:p>
+            <w:r>
+              <w:t>Система связей</w:t>
+            </w:r>
+          </w:p>
+        </w:tc>
+        <w:tc>
+          <w:tcPr>
+            <w:tcW w:w="3005" w:type="dxa"/>
+          </w:tcPr>
+          <w:p>
+            <w:pPr>
+              <w:rPr>
+                <w:lang w:val="en-US"/>
+              </w:rPr>
+            </w:pPr>
+            <w:r>
+              <w:t>Отсутствует</w:t>
+            </w:r>
+          </w:p>
+        </w:tc>
+        <w:tc>
+          <w:tcPr>
+            <w:tcW w:w="3006" w:type="dxa"/>
+          </w:tcPr>
+          <w:p>
+            <w:r>
+              <w:rPr>
+                <w:lang w:val="en-US"/>
+              </w:rPr>
+              <w:t>Wiki</w:t>
+            </w:r>
+            <w:r>
+              <w:t>-</w:t>
+            </w:r>
+            <w:r>
+              <w:t>ссылки, теги, папки как узлы связи</w:t>
+            </w:r>
+          </w:p>
+        </w:tc>
+      </w:tr>
+      <w:tr>
+        <w:tc>
+          <w:tcPr>
+            <w:tcW w:w="3005" w:type="dxa"/>
+          </w:tcPr>
+          <w:p>
+            <w:r>
+              <w:t>Геймификация</w:t>
+            </w:r>
+          </w:p>
+        </w:tc>
+        <w:tc>
+          <w:tcPr>
+            <w:tcW w:w="3005" w:type="dxa"/>
+          </w:tcPr>
+          <w:p>
+            <w:r>
+              <w:t>Отсутствует</w:t>
+            </w:r>
+          </w:p>
+        </w:tc>
+        <w:tc>
+          <w:tcPr>
+            <w:tcW w:w="3006" w:type="dxa"/>
+          </w:tcPr>
+          <w:p>
+            <w:r>
+              <w:t>Представлена через интерфейс как мотиватор для ведения заметок</w:t>
+            </w:r>
+          </w:p>
+        </w:tc>
+      </w:tr>
+    </w:tbl>
+    <w:p>
+      <w:pPr>
+        <w:pStyle w:val="ListParagraph"/>
+        <w:ind w:left="643"/>
+      </w:pPr>
+    </w:p>
+    <w:p>
+      <w:pPr>
+        <w:pStyle w:val="ListParagraph"/>
+        <w:ind w:left="643"/>
+      </w:pPr>
+    </w:p>
+    <w:p>
+      <w:pPr>
+        <w:pStyle w:val="ListParagraph"/>
         <w:numPr>
           <w:ilvl w:val="0"/>
-          <w:numId w:val="2"/>
-        </w:numPr>
-      </w:pPr>
-      <w:r>
-        <w:t xml:space="preserve">Введение для однородности единого, однозначного канонического диалекта </w:t>
-      </w:r>
-      <w:r>
-        <w:rPr>
-          <w:lang w:val="en-US"/>
-        </w:rPr>
-        <w:t>markdown</w:t>
-      </w:r>
-      <w:r>
-        <w:t>.</w:t>
-      </w:r>
-    </w:p>
-    <w:p>
-      <w:pPr>
-        <w:pStyle w:val="ListParagraph"/>
-        <w:numPr>
-          <w:ilvl w:val="0"/>
-          <w:numId w:val="2"/>
-        </w:numPr>
-      </w:pPr>
-      <w:r>
-        <w:t>Реализация понятного и полного меню форматирования текста.</w:t>
-      </w:r>
-    </w:p>
-    <w:p>
-      <w:pPr>
-        <w:pStyle w:val="ListParagraph"/>
-        <w:numPr>
-          <w:ilvl w:val="0"/>
-          <w:numId w:val="2"/>
-        </w:numPr>
-      </w:pPr>
-      <w:r>
-        <w:t>Отказ от реализации базового функционала пользовательскими плагинами.</w:t>
-      </w:r>
-    </w:p>
-    <w:p>
-      <w:pPr>
-        <w:pStyle w:val="ListParagraph"/>
-        <w:numPr>
-          <w:ilvl w:val="0"/>
-          <w:numId w:val="2"/>
-        </w:numPr>
-      </w:pPr>
-      <w:r>
-        <w:t>Введение функционала быстрой вставки внешних ссылок без сворачивания приложения.</w:t>
-      </w:r>
-    </w:p>
-    <w:p>
-      <w:pPr>
-        <w:pStyle w:val="ListParagraph"/>
-        <w:numPr>
-          <w:ilvl w:val="0"/>
-          <w:numId w:val="2"/>
-        </w:numPr>
-      </w:pPr>
-      <w:r>
-        <w:t>Введение собственной системы связей.</w:t>
-      </w:r>
-    </w:p>
-    <w:p>
-      <w:pPr>
-        <w:pStyle w:val="ListParagraph"/>
-        <w:numPr>
-          <w:ilvl w:val="0"/>
-          <w:numId w:val="2"/>
-        </w:numPr>
-      </w:pPr>
-      <w:r>
-        <w:t xml:space="preserve">Полностью иное оформление и философия </w:t>
-      </w:r>
-      <w:r>
-        <w:rPr>
-          <w:lang w:val="en-US"/>
-        </w:rPr>
-        <w:t>UI</w:t>
-      </w:r>
-      <w:r>
-        <w:t xml:space="preserve"> </w:t>
-      </w:r>
-      <w:r>
-        <w:t>–</w:t>
-      </w:r>
-      <w:r>
-        <w:t xml:space="preserve"> </w:t>
-      </w:r>
-      <w:r>
-        <w:t>геймификация, тактильность и иммерсивность против утилитарности и профессиональности.</w:t>
-      </w:r>
-    </w:p>
-    <w:p>
-      <w:pPr>
-        <w:pStyle w:val="Heading1"/>
-        <w:jc w:val="center"/>
-      </w:pPr>
-    </w:p>
+          <w:numId w:val="11"/>
+        </w:numPr>
+        <w:ind w:left="643"/>
+      </w:pPr>
+      <w:r>
+        <w:rPr>
+          <w:b/>
+          <w:bCs/>
+          <w:lang w:val="en-US"/>
+        </w:rPr>
+        <w:t>MarkText</w:t>
+      </w:r>
+      <w:r>
+        <w:rPr>
+          <w:b/>
+          <w:bCs/>
+        </w:rPr>
+        <w:t xml:space="preserve"> </w:t>
+      </w:r>
+      <w:r>
+        <w:t xml:space="preserve">– </w:t>
+      </w:r>
+      <w:r>
+        <w:t xml:space="preserve">бесплатный редактор </w:t>
+      </w:r>
+      <w:r>
+        <w:rPr>
+          <w:lang w:val="en-US"/>
+        </w:rPr>
+        <w:t>Markdown</w:t>
+      </w:r>
+      <w:r>
+        <w:t xml:space="preserve"> с открытым кодом, распространяющийся как альтернатива </w:t>
+      </w:r>
+      <w:r>
+        <w:rPr>
+          <w:lang w:val="en-US"/>
+        </w:rPr>
+        <w:t>Typora</w:t>
+      </w:r>
+      <w:r>
+        <w:t xml:space="preserve">, с коей имеет много схожестей. Обладает такой же системой отображения </w:t>
+      </w:r>
+      <w:r>
+        <w:rPr>
+          <w:lang w:val="en-US"/>
+        </w:rPr>
+        <w:t>Markdown-</w:t>
+      </w:r>
+      <w:r>
+        <w:t>синтаксиса.</w:t>
+      </w:r>
+    </w:p>
+    <w:p>
+      <w:pPr>
+        <w:pStyle w:val="ListParagraph"/>
+        <w:ind w:left="643"/>
+      </w:pPr>
+    </w:p>
+    <w:p>
+      <w:pPr>
+        <w:pStyle w:val="ListParagraph"/>
+        <w:numPr>
+          <w:ilvl w:val="1"/>
+          <w:numId w:val="11"/>
+        </w:numPr>
+        <w:ind w:left="1429" w:hanging="720"/>
+      </w:pPr>
+    </w:p>
+    <w:p>
+      <w:pPr>
+        <w:rPr>
+          <w:b/>
+          <w:bCs/>
+        </w:rPr>
+      </w:pPr>
+    </w:p>
+    <w:p>
+      <w:pPr>
+        <w:rPr>
+          <w:b/>
+          <w:bCs/>
+        </w:rPr>
+      </w:pPr>
+    </w:p>
+    <w:p>
+      <w:pPr>
+        <w:rPr>
+          <w:b/>
+          <w:bCs/>
+        </w:rPr>
+      </w:pPr>
+    </w:p>
+    <w:p/>
     <w:sectPr>
       <w:pgSz w:w="11906" w:h="16838"/>
       <w:pgMar w:top="1440" w:right="1440" w:bottom="1440" w:left="1440" w:header="708" w:footer="708" w:gutter="0"/>
@@ -3550,7 +5165,7 @@
   <w:style w:type="paragraph" w:default="1" w:styleId="Normal">
     <w:name w:val="Normal"/>
     <w:qFormat/>
-    <w:rsid w:val="00230606"/>
+    <w:rsid w:val="004711FA"/>
   </w:style>
   <w:style w:type="paragraph" w:styleId="Heading1">
     <w:name w:val="heading 1"/>
@@ -4066,6 +5681,25 @@
       <w:spacing w:val="5"/>
     </w:rPr>
   </w:style>
+  <w:style w:type="table" w:styleId="TableGrid">
+    <w:name w:val="Table Grid"/>
+    <w:basedOn w:val="TableNormal"/>
+    <w:uiPriority w:val="39"/>
+    <w:rsid w:val="004711FA"/>
+    <w:pPr>
+      <w:spacing w:after="0" w:line="240" w:lineRule="auto"/>
+    </w:pPr>
+    <w:tblPr>
+      <w:tblBorders>
+        <w:top w:val="single" w:sz="4" w:space="0" w:color="auto"/>
+        <w:left w:val="single" w:sz="4" w:space="0" w:color="auto"/>
+        <w:bottom w:val="single" w:sz="4" w:space="0" w:color="auto"/>
+        <w:right w:val="single" w:sz="4" w:space="0" w:color="auto"/>
+        <w:insideH w:val="single" w:sz="4" w:space="0" w:color="auto"/>
+        <w:insideV w:val="single" w:sz="4" w:space="0" w:color="auto"/>
+      </w:tblBorders>
+    </w:tblPr>
+  </w:style>
 </w:styles>
 </file>
 

</xml_diff>

<commit_message>
docs: add info about stack choice
</commit_message>
<xml_diff>
--- a/Work Doc.docx
+++ b/Work Doc.docx
@@ -957,7 +957,9 @@
         </w:rPr>
       </w:pPr>
       <w:r>
-        <w:rPr/>
+        <w:rPr>
+          <w:rFonts w:ascii="Times New Roman" w:hAnsi="Times New Roman"/>
+        </w:rPr>
       </w:r>
     </w:p>
     <w:p>
@@ -969,7 +971,9 @@
         </w:rPr>
       </w:pPr>
       <w:r>
-        <w:rPr/>
+        <w:rPr>
+          <w:rFonts w:ascii="Times New Roman" w:hAnsi="Times New Roman"/>
+        </w:rPr>
       </w:r>
     </w:p>
     <w:p>
@@ -981,7 +985,9 @@
         </w:rPr>
       </w:pPr>
       <w:r>
-        <w:rPr/>
+        <w:rPr>
+          <w:rFonts w:ascii="Times New Roman" w:hAnsi="Times New Roman"/>
+        </w:rPr>
       </w:r>
     </w:p>
     <w:p>
@@ -4206,9 +4212,9 @@
       </w:tblPr>
       <w:tblGrid>
         <w:gridCol w:w="1803"/>
-        <w:gridCol w:w="1801"/>
+        <w:gridCol w:w="1800"/>
         <w:gridCol w:w="1803"/>
-        <w:gridCol w:w="1803"/>
+        <w:gridCol w:w="1804"/>
         <w:gridCol w:w="1806"/>
       </w:tblGrid>
       <w:tr>
@@ -4251,7 +4257,7 @@
         </w:tc>
         <w:tc>
           <w:tcPr>
-            <w:tcW w:w="1801" w:type="dxa"/>
+            <w:tcW w:w="1800" w:type="dxa"/>
             <w:tcBorders/>
           </w:tcPr>
           <w:p>
@@ -4323,7 +4329,7 @@
         </w:tc>
         <w:tc>
           <w:tcPr>
-            <w:tcW w:w="1803" w:type="dxa"/>
+            <w:tcW w:w="1804" w:type="dxa"/>
             <w:tcBorders/>
           </w:tcPr>
           <w:p>
@@ -4442,7 +4448,7 @@
         </w:tc>
         <w:tc>
           <w:tcPr>
-            <w:tcW w:w="1801" w:type="dxa"/>
+            <w:tcW w:w="1800" w:type="dxa"/>
             <w:tcBorders/>
           </w:tcPr>
           <w:p>
@@ -4508,7 +4514,7 @@
         </w:tc>
         <w:tc>
           <w:tcPr>
-            <w:tcW w:w="1803" w:type="dxa"/>
+            <w:tcW w:w="1804" w:type="dxa"/>
             <w:tcBorders/>
           </w:tcPr>
           <w:p>
@@ -4629,7 +4635,7 @@
         </w:tc>
         <w:tc>
           <w:tcPr>
-            <w:tcW w:w="1801" w:type="dxa"/>
+            <w:tcW w:w="1800" w:type="dxa"/>
             <w:tcBorders/>
           </w:tcPr>
           <w:p>
@@ -4695,7 +4701,7 @@
         </w:tc>
         <w:tc>
           <w:tcPr>
-            <w:tcW w:w="1803" w:type="dxa"/>
+            <w:tcW w:w="1804" w:type="dxa"/>
             <w:tcBorders/>
           </w:tcPr>
           <w:p>
@@ -4796,7 +4802,7 @@
         </w:tc>
         <w:tc>
           <w:tcPr>
-            <w:tcW w:w="1801" w:type="dxa"/>
+            <w:tcW w:w="1800" w:type="dxa"/>
             <w:tcBorders/>
           </w:tcPr>
           <w:p>
@@ -4862,7 +4868,7 @@
         </w:tc>
         <w:tc>
           <w:tcPr>
-            <w:tcW w:w="1803" w:type="dxa"/>
+            <w:tcW w:w="1804" w:type="dxa"/>
             <w:tcBorders/>
           </w:tcPr>
           <w:p>
@@ -4963,7 +4969,7 @@
         </w:tc>
         <w:tc>
           <w:tcPr>
-            <w:tcW w:w="1801" w:type="dxa"/>
+            <w:tcW w:w="1800" w:type="dxa"/>
             <w:tcBorders/>
           </w:tcPr>
           <w:p>
@@ -5089,7 +5095,7 @@
         </w:tc>
         <w:tc>
           <w:tcPr>
-            <w:tcW w:w="1803" w:type="dxa"/>
+            <w:tcW w:w="1804" w:type="dxa"/>
             <w:tcBorders/>
           </w:tcPr>
           <w:p>
@@ -5210,7 +5216,7 @@
         </w:tc>
         <w:tc>
           <w:tcPr>
-            <w:tcW w:w="1801" w:type="dxa"/>
+            <w:tcW w:w="1800" w:type="dxa"/>
             <w:tcBorders/>
           </w:tcPr>
           <w:p>
@@ -5276,7 +5282,7 @@
         </w:tc>
         <w:tc>
           <w:tcPr>
-            <w:tcW w:w="1803" w:type="dxa"/>
+            <w:tcW w:w="1804" w:type="dxa"/>
             <w:tcBorders/>
           </w:tcPr>
           <w:p>
@@ -5377,7 +5383,7 @@
         </w:tc>
         <w:tc>
           <w:tcPr>
-            <w:tcW w:w="1801" w:type="dxa"/>
+            <w:tcW w:w="1800" w:type="dxa"/>
             <w:tcBorders/>
           </w:tcPr>
           <w:p>
@@ -5443,7 +5449,7 @@
         </w:tc>
         <w:tc>
           <w:tcPr>
-            <w:tcW w:w="1803" w:type="dxa"/>
+            <w:tcW w:w="1804" w:type="dxa"/>
             <w:tcBorders/>
           </w:tcPr>
           <w:p>
@@ -5544,7 +5550,7 @@
         </w:tc>
         <w:tc>
           <w:tcPr>
-            <w:tcW w:w="1801" w:type="dxa"/>
+            <w:tcW w:w="1800" w:type="dxa"/>
             <w:tcBorders/>
           </w:tcPr>
           <w:p>
@@ -5610,7 +5616,7 @@
         </w:tc>
         <w:tc>
           <w:tcPr>
-            <w:tcW w:w="1803" w:type="dxa"/>
+            <w:tcW w:w="1804" w:type="dxa"/>
             <w:tcBorders/>
           </w:tcPr>
           <w:p>
@@ -5711,7 +5717,7 @@
         </w:tc>
         <w:tc>
           <w:tcPr>
-            <w:tcW w:w="1801" w:type="dxa"/>
+            <w:tcW w:w="1800" w:type="dxa"/>
             <w:tcBorders/>
           </w:tcPr>
           <w:p>
@@ -5797,7 +5803,7 @@
         </w:tc>
         <w:tc>
           <w:tcPr>
-            <w:tcW w:w="1803" w:type="dxa"/>
+            <w:tcW w:w="1804" w:type="dxa"/>
             <w:tcBorders/>
           </w:tcPr>
           <w:p>
@@ -5898,7 +5904,7 @@
         </w:tc>
         <w:tc>
           <w:tcPr>
-            <w:tcW w:w="1801" w:type="dxa"/>
+            <w:tcW w:w="1800" w:type="dxa"/>
             <w:tcBorders/>
           </w:tcPr>
           <w:p>
@@ -5964,7 +5970,7 @@
         </w:tc>
         <w:tc>
           <w:tcPr>
-            <w:tcW w:w="1803" w:type="dxa"/>
+            <w:tcW w:w="1804" w:type="dxa"/>
             <w:tcBorders/>
           </w:tcPr>
           <w:p>
@@ -6065,7 +6071,7 @@
         </w:tc>
         <w:tc>
           <w:tcPr>
-            <w:tcW w:w="1801" w:type="dxa"/>
+            <w:tcW w:w="1800" w:type="dxa"/>
             <w:tcBorders/>
           </w:tcPr>
           <w:p>
@@ -6161,7 +6167,7 @@
         </w:tc>
         <w:tc>
           <w:tcPr>
-            <w:tcW w:w="1803" w:type="dxa"/>
+            <w:tcW w:w="1804" w:type="dxa"/>
             <w:tcBorders/>
           </w:tcPr>
           <w:p>
@@ -6272,7 +6278,7 @@
         </w:tc>
         <w:tc>
           <w:tcPr>
-            <w:tcW w:w="1801" w:type="dxa"/>
+            <w:tcW w:w="1800" w:type="dxa"/>
             <w:tcBorders/>
           </w:tcPr>
           <w:p>
@@ -6338,7 +6344,7 @@
         </w:tc>
         <w:tc>
           <w:tcPr>
-            <w:tcW w:w="1803" w:type="dxa"/>
+            <w:tcW w:w="1804" w:type="dxa"/>
             <w:tcBorders/>
           </w:tcPr>
           <w:p>
@@ -6573,6 +6579,158 @@
           <w:lang w:val="ru-RU"/>
         </w:rPr>
         <w:t>также кардинально отличается от перечисленных приложений - действия в меню будут геймифицированы при помощи тактильного и детализированного интерфейса, состоящего из симулируемых тумблеров, переключателей и др.</w:t>
+      </w:r>
+    </w:p>
+    <w:p>
+      <w:pPr>
+        <w:pStyle w:val="Normal"/>
+        <w:rPr>
+          <w:rFonts w:ascii="Times New Roman" w:hAnsi="Times New Roman"/>
+        </w:rPr>
+      </w:pPr>
+      <w:r>
+        <w:rPr/>
+      </w:r>
+    </w:p>
+    <w:p>
+      <w:pPr>
+        <w:pStyle w:val="Heading2"/>
+        <w:jc w:val="center"/>
+        <w:rPr/>
+      </w:pPr>
+      <w:r>
+        <w:rPr/>
+        <w:t>Выбор технологического стека приложения</w:t>
+      </w:r>
+    </w:p>
+    <w:p>
+      <w:pPr>
+        <w:pStyle w:val="Normal"/>
+        <w:jc w:val="left"/>
+        <w:rPr/>
+      </w:pPr>
+      <w:r>
+        <w:rPr/>
+        <w:t xml:space="preserve">Для разработки приложения и решения поставленных задач решено использовать технологический стек на основе </w:t>
+      </w:r>
+      <w:r>
+        <w:rPr>
+          <w:lang w:val="en-US"/>
+        </w:rPr>
+        <w:t>.NET 10</w:t>
+      </w:r>
+      <w:r>
+        <w:rPr>
+          <w:lang w:val="ru-RU"/>
+        </w:rPr>
+        <w:t xml:space="preserve"> с фреймворком </w:t>
+      </w:r>
+      <w:r>
+        <w:rPr>
+          <w:lang w:val="en-US"/>
+        </w:rPr>
+        <w:t xml:space="preserve">Avalonia UI. </w:t>
+      </w:r>
+    </w:p>
+    <w:p>
+      <w:pPr>
+        <w:pStyle w:val="Normal"/>
+        <w:jc w:val="left"/>
+        <w:rPr>
+          <w:lang w:val="ru-RU"/>
+        </w:rPr>
+      </w:pPr>
+      <w:r>
+        <w:rPr>
+          <w:lang w:val="ru-RU"/>
+        </w:rPr>
+        <w:t xml:space="preserve">Платформа </w:t>
+      </w:r>
+      <w:r>
+        <w:rPr>
+          <w:lang w:val="en-US"/>
+        </w:rPr>
+        <w:t xml:space="preserve">.NET </w:t>
+      </w:r>
+      <w:r>
+        <w:rPr>
+          <w:lang w:val="ru-RU"/>
+        </w:rPr>
+        <w:t xml:space="preserve">10 заточена под создание приложений, в том числе десктопных. Она предоставляет современные возможности языка </w:t>
+      </w:r>
+      <w:r>
+        <w:rPr>
+          <w:lang w:val="en-US"/>
+        </w:rPr>
+        <w:t>C#</w:t>
+      </w:r>
+      <w:r>
+        <w:rPr>
+          <w:lang w:val="ru-RU"/>
+        </w:rPr>
+        <w:t>, которые облегчают процесс разработки.</w:t>
+      </w:r>
+    </w:p>
+    <w:p>
+      <w:pPr>
+        <w:pStyle w:val="Normal"/>
+        <w:jc w:val="left"/>
+        <w:rPr>
+          <w:lang w:val="ru-RU"/>
+        </w:rPr>
+      </w:pPr>
+      <w:r>
+        <w:rPr>
+          <w:lang w:val="ru-RU"/>
+        </w:rPr>
+        <w:t xml:space="preserve">Выбор фреймфорка для разработки - </w:t>
+      </w:r>
+      <w:r>
+        <w:rPr>
+          <w:lang w:val="en-US"/>
+        </w:rPr>
+        <w:t>Avalonia UI</w:t>
+      </w:r>
+      <w:r>
+        <w:rPr>
+          <w:lang w:val="ru-RU"/>
+        </w:rPr>
+        <w:t xml:space="preserve">, так как он на данный момент является современным, обновляемым и эффективным решением, работающим с паттерном </w:t>
+      </w:r>
+      <w:r>
+        <w:rPr>
+          <w:lang w:val="en-US"/>
+        </w:rPr>
+        <w:t xml:space="preserve">Model, View, View Model (MVVM). Avalonia UI </w:t>
+      </w:r>
+      <w:r>
+        <w:rPr>
+          <w:lang w:val="ru-RU"/>
+        </w:rPr>
+        <w:t xml:space="preserve">также предоставляет возможность в будущем портировать приложение с той же кодовой базой на любую ОС благодаря технологии независимой отрисовки </w:t>
+      </w:r>
+      <w:r>
+        <w:rPr>
+          <w:lang w:val="en-US"/>
+        </w:rPr>
+        <w:t>UI</w:t>
+      </w:r>
+      <w:r>
+        <w:rPr>
+          <w:lang w:val="ru-RU"/>
+        </w:rPr>
+        <w:t>.</w:t>
+      </w:r>
+    </w:p>
+    <w:p>
+      <w:pPr>
+        <w:pStyle w:val="Normal"/>
+        <w:rPr>
+          <w:rFonts w:ascii="Times New Roman" w:hAnsi="Times New Roman"/>
+        </w:rPr>
+      </w:pPr>
+      <w:r>
+        <w:rPr/>
       </w:r>
     </w:p>
     <w:p>

</xml_diff>

<commit_message>
docs: add more info about stack choice
</commit_message>
<xml_diff>
--- a/Work Doc.docx
+++ b/Work Doc.docx
@@ -4212,9 +4212,9 @@
       </w:tblPr>
       <w:tblGrid>
         <w:gridCol w:w="1803"/>
-        <w:gridCol w:w="1800"/>
+        <w:gridCol w:w="1799"/>
         <w:gridCol w:w="1803"/>
-        <w:gridCol w:w="1804"/>
+        <w:gridCol w:w="1805"/>
         <w:gridCol w:w="1806"/>
       </w:tblGrid>
       <w:tr>
@@ -4257,7 +4257,7 @@
         </w:tc>
         <w:tc>
           <w:tcPr>
-            <w:tcW w:w="1800" w:type="dxa"/>
+            <w:tcW w:w="1799" w:type="dxa"/>
             <w:tcBorders/>
           </w:tcPr>
           <w:p>
@@ -4329,7 +4329,7 @@
         </w:tc>
         <w:tc>
           <w:tcPr>
-            <w:tcW w:w="1804" w:type="dxa"/>
+            <w:tcW w:w="1805" w:type="dxa"/>
             <w:tcBorders/>
           </w:tcPr>
           <w:p>
@@ -4448,7 +4448,7 @@
         </w:tc>
         <w:tc>
           <w:tcPr>
-            <w:tcW w:w="1800" w:type="dxa"/>
+            <w:tcW w:w="1799" w:type="dxa"/>
             <w:tcBorders/>
           </w:tcPr>
           <w:p>
@@ -4514,7 +4514,7 @@
         </w:tc>
         <w:tc>
           <w:tcPr>
-            <w:tcW w:w="1804" w:type="dxa"/>
+            <w:tcW w:w="1805" w:type="dxa"/>
             <w:tcBorders/>
           </w:tcPr>
           <w:p>
@@ -4635,7 +4635,7 @@
         </w:tc>
         <w:tc>
           <w:tcPr>
-            <w:tcW w:w="1800" w:type="dxa"/>
+            <w:tcW w:w="1799" w:type="dxa"/>
             <w:tcBorders/>
           </w:tcPr>
           <w:p>
@@ -4701,7 +4701,7 @@
         </w:tc>
         <w:tc>
           <w:tcPr>
-            <w:tcW w:w="1804" w:type="dxa"/>
+            <w:tcW w:w="1805" w:type="dxa"/>
             <w:tcBorders/>
           </w:tcPr>
           <w:p>
@@ -4802,7 +4802,7 @@
         </w:tc>
         <w:tc>
           <w:tcPr>
-            <w:tcW w:w="1800" w:type="dxa"/>
+            <w:tcW w:w="1799" w:type="dxa"/>
             <w:tcBorders/>
           </w:tcPr>
           <w:p>
@@ -4868,7 +4868,7 @@
         </w:tc>
         <w:tc>
           <w:tcPr>
-            <w:tcW w:w="1804" w:type="dxa"/>
+            <w:tcW w:w="1805" w:type="dxa"/>
             <w:tcBorders/>
           </w:tcPr>
           <w:p>
@@ -4969,7 +4969,7 @@
         </w:tc>
         <w:tc>
           <w:tcPr>
-            <w:tcW w:w="1800" w:type="dxa"/>
+            <w:tcW w:w="1799" w:type="dxa"/>
             <w:tcBorders/>
           </w:tcPr>
           <w:p>
@@ -5095,7 +5095,7 @@
         </w:tc>
         <w:tc>
           <w:tcPr>
-            <w:tcW w:w="1804" w:type="dxa"/>
+            <w:tcW w:w="1805" w:type="dxa"/>
             <w:tcBorders/>
           </w:tcPr>
           <w:p>
@@ -5216,7 +5216,7 @@
         </w:tc>
         <w:tc>
           <w:tcPr>
-            <w:tcW w:w="1800" w:type="dxa"/>
+            <w:tcW w:w="1799" w:type="dxa"/>
             <w:tcBorders/>
           </w:tcPr>
           <w:p>
@@ -5282,7 +5282,7 @@
         </w:tc>
         <w:tc>
           <w:tcPr>
-            <w:tcW w:w="1804" w:type="dxa"/>
+            <w:tcW w:w="1805" w:type="dxa"/>
             <w:tcBorders/>
           </w:tcPr>
           <w:p>
@@ -5383,7 +5383,7 @@
         </w:tc>
         <w:tc>
           <w:tcPr>
-            <w:tcW w:w="1800" w:type="dxa"/>
+            <w:tcW w:w="1799" w:type="dxa"/>
             <w:tcBorders/>
           </w:tcPr>
           <w:p>
@@ -5449,7 +5449,7 @@
         </w:tc>
         <w:tc>
           <w:tcPr>
-            <w:tcW w:w="1804" w:type="dxa"/>
+            <w:tcW w:w="1805" w:type="dxa"/>
             <w:tcBorders/>
           </w:tcPr>
           <w:p>
@@ -5550,7 +5550,7 @@
         </w:tc>
         <w:tc>
           <w:tcPr>
-            <w:tcW w:w="1800" w:type="dxa"/>
+            <w:tcW w:w="1799" w:type="dxa"/>
             <w:tcBorders/>
           </w:tcPr>
           <w:p>
@@ -5616,7 +5616,7 @@
         </w:tc>
         <w:tc>
           <w:tcPr>
-            <w:tcW w:w="1804" w:type="dxa"/>
+            <w:tcW w:w="1805" w:type="dxa"/>
             <w:tcBorders/>
           </w:tcPr>
           <w:p>
@@ -5717,7 +5717,7 @@
         </w:tc>
         <w:tc>
           <w:tcPr>
-            <w:tcW w:w="1800" w:type="dxa"/>
+            <w:tcW w:w="1799" w:type="dxa"/>
             <w:tcBorders/>
           </w:tcPr>
           <w:p>
@@ -5803,7 +5803,7 @@
         </w:tc>
         <w:tc>
           <w:tcPr>
-            <w:tcW w:w="1804" w:type="dxa"/>
+            <w:tcW w:w="1805" w:type="dxa"/>
             <w:tcBorders/>
           </w:tcPr>
           <w:p>
@@ -5904,7 +5904,7 @@
         </w:tc>
         <w:tc>
           <w:tcPr>
-            <w:tcW w:w="1800" w:type="dxa"/>
+            <w:tcW w:w="1799" w:type="dxa"/>
             <w:tcBorders/>
           </w:tcPr>
           <w:p>
@@ -5970,7 +5970,7 @@
         </w:tc>
         <w:tc>
           <w:tcPr>
-            <w:tcW w:w="1804" w:type="dxa"/>
+            <w:tcW w:w="1805" w:type="dxa"/>
             <w:tcBorders/>
           </w:tcPr>
           <w:p>
@@ -6071,7 +6071,7 @@
         </w:tc>
         <w:tc>
           <w:tcPr>
-            <w:tcW w:w="1800" w:type="dxa"/>
+            <w:tcW w:w="1799" w:type="dxa"/>
             <w:tcBorders/>
           </w:tcPr>
           <w:p>
@@ -6167,7 +6167,7 @@
         </w:tc>
         <w:tc>
           <w:tcPr>
-            <w:tcW w:w="1804" w:type="dxa"/>
+            <w:tcW w:w="1805" w:type="dxa"/>
             <w:tcBorders/>
           </w:tcPr>
           <w:p>
@@ -6278,7 +6278,7 @@
         </w:tc>
         <w:tc>
           <w:tcPr>
-            <w:tcW w:w="1800" w:type="dxa"/>
+            <w:tcW w:w="1799" w:type="dxa"/>
             <w:tcBorders/>
           </w:tcPr>
           <w:p>
@@ -6344,7 +6344,7 @@
         </w:tc>
         <w:tc>
           <w:tcPr>
-            <w:tcW w:w="1804" w:type="dxa"/>
+            <w:tcW w:w="1805" w:type="dxa"/>
             <w:tcBorders/>
           </w:tcPr>
           <w:p>
@@ -6589,7 +6589,9 @@
         </w:rPr>
       </w:pPr>
       <w:r>
-        <w:rPr/>
+        <w:rPr>
+          <w:rFonts w:ascii="Times New Roman" w:hAnsi="Times New Roman"/>
+        </w:rPr>
       </w:r>
     </w:p>
     <w:p>
@@ -6600,6 +6602,10 @@
       </w:pPr>
       <w:r>
         <w:rPr/>
+        <w:t xml:space="preserve">1.2. </w:t>
+      </w:r>
+      <w:r>
+        <w:rPr/>
         <w:t>Выбор технологического стека приложения</w:t>
       </w:r>
     </w:p>
@@ -6656,7 +6662,55 @@
         <w:rPr>
           <w:lang w:val="ru-RU"/>
         </w:rPr>
-        <w:t xml:space="preserve">10 заточена под создание приложений, в том числе десктопных. Она предоставляет современные возможности языка </w:t>
+        <w:t>10</w:t>
+      </w:r>
+      <w:r>
+        <w:rPr>
+          <w:lang w:val="ru-RU"/>
+        </w:rPr>
+        <w:t xml:space="preserve"> представляет новейший релиз</w:t>
+      </w:r>
+      <w:r>
+        <w:rPr>
+          <w:lang w:val="en-US"/>
+        </w:rPr>
+        <w:t xml:space="preserve"> .NET</w:t>
+      </w:r>
+      <w:r>
+        <w:rPr>
+          <w:lang w:val="ru-RU"/>
+        </w:rPr>
+        <w:t xml:space="preserve"> с</w:t>
+      </w:r>
+      <w:r>
+        <w:rPr>
+          <w:lang w:val="en-US"/>
+        </w:rPr>
+        <w:t xml:space="preserve"> LTS</w:t>
+      </w:r>
+      <w:r>
+        <w:rPr>
+          <w:lang w:val="ru-RU"/>
+        </w:rPr>
+        <w:t xml:space="preserve"> поддержкой.</w:t>
+      </w:r>
+      <w:r>
+        <w:rPr>
+          <w:lang w:val="ru-RU"/>
+        </w:rPr>
+        <w:t xml:space="preserve"> </w:t>
+      </w:r>
+      <w:r>
+        <w:rPr>
+          <w:lang w:val="ru-RU"/>
+        </w:rPr>
+        <w:t xml:space="preserve">Платформа </w:t>
+      </w:r>
+      <w:r>
+        <w:rPr>
+          <w:lang w:val="ru-RU"/>
+        </w:rPr>
+        <w:t xml:space="preserve">заточена под создание приложений, в том числе десктопных. Она предоставляет современные возможности языка </w:t>
       </w:r>
       <w:r>
         <w:rPr>
@@ -6695,13 +6749,76 @@
         <w:rPr>
           <w:lang w:val="ru-RU"/>
         </w:rPr>
-        <w:t xml:space="preserve">, так как он на данный момент является современным, обновляемым и эффективным решением, работающим с паттерном </w:t>
-      </w:r>
-      <w:r>
-        <w:rPr>
-          <w:lang w:val="en-US"/>
-        </w:rPr>
-        <w:t xml:space="preserve">Model, View, View Model (MVVM). Avalonia UI </w:t>
+        <w:t xml:space="preserve">, так как он на данный момент является современным, </w:t>
+      </w:r>
+      <w:r>
+        <w:rPr>
+          <w:lang w:val="ru-RU"/>
+        </w:rPr>
+        <w:t>активно развивающимся</w:t>
+      </w:r>
+      <w:r>
+        <w:rPr>
+          <w:lang w:val="ru-RU"/>
+        </w:rPr>
+        <w:t xml:space="preserve"> и эффективным решением, работающим с паттерном </w:t>
+      </w:r>
+      <w:r>
+        <w:rPr>
+          <w:lang w:val="en-US"/>
+        </w:rPr>
+        <w:t>Model, View, View Model (MVVM)</w:t>
+      </w:r>
+      <w:r>
+        <w:rPr>
+          <w:lang w:val="ru-RU"/>
+        </w:rPr>
+        <w:t xml:space="preserve">, для реализации которого </w:t>
+      </w:r>
+      <w:r>
+        <w:rPr>
+          <w:lang w:val="en-US"/>
+        </w:rPr>
+        <w:t xml:space="preserve">Avalonia </w:t>
+      </w:r>
+      <w:r>
+        <w:rPr>
+          <w:lang w:val="ru-RU"/>
+        </w:rPr>
+        <w:t>предоставляет интегрированный фреймворк "</w:t>
+      </w:r>
+      <w:r>
+        <w:rPr>
+          <w:lang w:val="en-US"/>
+        </w:rPr>
+        <w:t>CommunityToolkit.Mvvm</w:t>
+      </w:r>
+      <w:r>
+        <w:rPr>
+          <w:lang w:val="ru-RU"/>
+        </w:rPr>
+        <w:t>", который позволяет не писать большой объем шаблонного кода и защищает от ошибок в этом коде.</w:t>
+      </w:r>
+    </w:p>
+    <w:p>
+      <w:pPr>
+        <w:pStyle w:val="Normal"/>
+        <w:jc w:val="left"/>
+        <w:rPr>
+          <w:lang w:val="ru-RU"/>
+        </w:rPr>
+      </w:pPr>
+      <w:r>
+        <w:rPr>
+          <w:lang w:val="en-US"/>
+        </w:rPr>
+        <w:t xml:space="preserve"> </w:t>
+      </w:r>
+      <w:r>
+        <w:rPr>
+          <w:lang w:val="en-US"/>
+        </w:rPr>
+        <w:t xml:space="preserve">Avalonia UI </w:t>
       </w:r>
       <w:r>
         <w:rPr>
@@ -6721,13 +6838,75 @@
         </w:rPr>
         <w:t>.</w:t>
       </w:r>
+      <w:r>
+        <w:rPr>
+          <w:lang w:val="ru-RU"/>
+        </w:rPr>
+        <w:t xml:space="preserve"> </w:t>
+      </w:r>
+      <w:r>
+        <w:rPr>
+          <w:lang w:val="en-US"/>
+        </w:rPr>
+        <w:t xml:space="preserve">Avalonia </w:t>
+      </w:r>
+      <w:r>
+        <w:rPr>
+          <w:lang w:val="ru-RU"/>
+        </w:rPr>
+        <w:t xml:space="preserve">обеспечивает одинаковый внешний вид приложения на всех платформах благодаря собственному движку рендеринга. </w:t>
+      </w:r>
     </w:p>
     <w:p>
       <w:pPr>
         <w:pStyle w:val="Normal"/>
-        <w:rPr>
-          <w:rFonts w:ascii="Times New Roman" w:hAnsi="Times New Roman"/>
-        </w:rPr>
+        <w:jc w:val="left"/>
+        <w:rPr>
+          <w:lang w:val="ru-RU"/>
+        </w:rPr>
+      </w:pPr>
+      <w:r>
+        <w:rPr>
+          <w:lang w:val="ru-RU"/>
+        </w:rPr>
+        <w:t>Т</w:t>
+      </w:r>
+      <w:r>
+        <w:rPr>
+          <w:lang w:val="ru-RU"/>
+        </w:rPr>
+        <w:t>акже отсутствие зависимости от какой-либо ОС являеытся важным критерием выбора для стилизованного интерфейса, для которого важно отсутствие налагаемых системой ограничений.</w:t>
+      </w:r>
+    </w:p>
+    <w:p>
+      <w:pPr>
+        <w:pStyle w:val="Normal"/>
+        <w:rPr>
+          <w:rFonts w:ascii="Times New Roman" w:hAnsi="Times New Roman"/>
+        </w:rPr>
+      </w:pPr>
+      <w:r>
+        <w:rPr>
+          <w:rFonts w:ascii="Times New Roman" w:hAnsi="Times New Roman"/>
+        </w:rPr>
+      </w:r>
+    </w:p>
+    <w:p>
+      <w:pPr>
+        <w:pStyle w:val="Heading2"/>
+        <w:jc w:val="center"/>
+        <w:rPr/>
+      </w:pPr>
+      <w:r>
+        <w:rPr/>
+        <w:t>1.3. Архитектура приложения</w:t>
+      </w:r>
+    </w:p>
+    <w:p>
+      <w:pPr>
+        <w:pStyle w:val="Normal"/>
+        <w:jc w:val="center"/>
+        <w:rPr/>
       </w:pPr>
       <w:r>
         <w:rPr/>

</xml_diff>

<commit_message>
docs: add about SaveNote and LoadNote
</commit_message>
<xml_diff>
--- a/Work Doc.docx
+++ b/Work Doc.docx
@@ -5926,11 +5926,6 @@
     <w:p/>
     <w:p/>
     <w:p>
-      <w:pPr>
-        <w:rPr>
-          <w:lang w:val="en-US"/>
-        </w:rPr>
-      </w:pPr>
       <w:r>
         <w:t xml:space="preserve">В каждой заметке должно быть разделение на </w:t>
       </w:r>
@@ -5976,6 +5971,9 @@
     <w:p/>
     <w:p>
       <w:r>
+        <w:rPr>
+          <w:noProof/>
+        </w:rPr>
         <w:lastRenderedPageBreak/>
         <w:drawing>
           <wp:inline distT="0" distB="0" distL="0" distR="0" wp14:anchorId="78325A18" wp14:editId="7326F347">
@@ -5993,7 +5991,7 @@
                     <pic:cNvPicPr/>
                   </pic:nvPicPr>
                   <pic:blipFill>
-                    <a:blip r:embed="rId5"/>
+                    <a:blip r:embed="rId6"/>
                     <a:stretch>
                       <a:fillRect/>
                     </a:stretch>
@@ -6034,33 +6032,21 @@
     <w:p>
       <w:pPr>
         <w:jc w:val="center"/>
-        <w:rPr>
-          <w:lang w:val="en-US"/>
-        </w:rPr>
       </w:pPr>
     </w:p>
     <w:p>
       <w:pPr>
         <w:jc w:val="center"/>
-        <w:rPr>
-          <w:lang w:val="en-US"/>
-        </w:rPr>
       </w:pPr>
     </w:p>
     <w:p>
       <w:pPr>
         <w:jc w:val="center"/>
-        <w:rPr>
-          <w:lang w:val="en-US"/>
-        </w:rPr>
       </w:pPr>
     </w:p>
     <w:p>
       <w:pPr>
         <w:jc w:val="center"/>
-        <w:rPr>
-          <w:lang w:val="en-US"/>
-        </w:rPr>
       </w:pPr>
     </w:p>
     <w:p>
@@ -6157,13 +6143,7 @@
         <w:t>.</w:t>
       </w:r>
     </w:p>
-    <w:p>
-      <w:pPr>
-        <w:rPr>
-          <w:lang w:val="en-US"/>
-        </w:rPr>
-      </w:pPr>
-    </w:p>
+    <w:p/>
     <w:p>
       <w:pPr>
         <w:pStyle w:val="ListParagraph"/>
@@ -6196,29 +6176,86 @@
         <w:t>CreateNote</w:t>
       </w:r>
       <w:r>
-        <w:t xml:space="preserve">, принимающий заголовок заметки. Для корректного создания заметки должна производиться проверка заголовка – он не может быть пустым, не может состоять из пробелов. При создании все недопустимые в файловой системе символы должны заменяться на символ нижнего подчёркивания </w:t>
-      </w:r>
-      <w:r>
-        <w:t>“</w:t>
-      </w:r>
-      <w:r>
-        <w:t>_</w:t>
-      </w:r>
-      <w:r>
-        <w:t>”</w:t>
-      </w:r>
-      <w:r>
-        <w:t xml:space="preserve">. Создается объект </w:t>
-      </w:r>
-      <w:r>
-        <w:rPr>
-          <w:lang w:val="en-US"/>
-        </w:rPr>
-        <w:t xml:space="preserve">Note </w:t>
-      </w:r>
-      <w:r>
-        <w:t xml:space="preserve">с пустым содержимым. </w:t>
-      </w:r>
+        <w:t>, принимающий заголовок заметки.</w:t>
+      </w:r>
+      <w:r>
+        <w:t xml:space="preserve"> Алгоритм создания должен выполнять следующие действия:</w:t>
+      </w:r>
+    </w:p>
+    <w:p>
+      <w:pPr>
+        <w:pStyle w:val="ListParagraph"/>
+        <w:numPr>
+          <w:ilvl w:val="6"/>
+          <w:numId w:val="10"/>
+        </w:numPr>
+      </w:pPr>
+      <w:r>
+        <w:t xml:space="preserve">Проверка заголовка, переданного в метод – при получении пустого заголовка или заголовка, состоящего из пробелов, </w:t>
+      </w:r>
+      <w:r>
+        <w:t xml:space="preserve">выбрасывается исключение. Для пустого заголовка выбрасывается </w:t>
+      </w:r>
+      <w:r>
+        <w:rPr>
+          <w:lang w:val="en-US"/>
+        </w:rPr>
+        <w:t>ArgumentNullException</w:t>
+      </w:r>
+      <w:r>
+        <w:t xml:space="preserve">, </w:t>
+      </w:r>
+      <w:r>
+        <w:t xml:space="preserve">для пробельного – </w:t>
+      </w:r>
+      <w:r>
+        <w:rPr>
+          <w:lang w:val="en-US"/>
+        </w:rPr>
+        <w:t>ArgumentException</w:t>
+      </w:r>
+    </w:p>
+    <w:p>
+      <w:pPr>
+        <w:pStyle w:val="ListParagraph"/>
+        <w:numPr>
+          <w:ilvl w:val="6"/>
+          <w:numId w:val="10"/>
+        </w:numPr>
+      </w:pPr>
+      <w:r>
+        <w:t>Получить запрещённые для имени файла символы в заголовке, заменить их на нижнее подчёркивание.</w:t>
+      </w:r>
+    </w:p>
+    <w:p>
+      <w:pPr>
+        <w:pStyle w:val="ListParagraph"/>
+        <w:numPr>
+          <w:ilvl w:val="6"/>
+          <w:numId w:val="10"/>
+        </w:numPr>
+      </w:pPr>
+      <w:r>
+        <w:t>Сформировать новую пустую заметку с полученным заголовком.</w:t>
+      </w:r>
+    </w:p>
+    <w:p>
+      <w:pPr>
+        <w:pStyle w:val="ListParagraph"/>
+        <w:numPr>
+          <w:ilvl w:val="6"/>
+          <w:numId w:val="10"/>
+        </w:numPr>
+      </w:pPr>
+      <w:r>
+        <w:t>Вернуть объект сформированной заметки.</w:t>
+      </w:r>
+    </w:p>
+    <w:p>
+      <w:pPr>
+        <w:pStyle w:val="ListParagraph"/>
+        <w:ind w:left="1151"/>
+      </w:pPr>
       <w:r>
         <w:br/>
         <w:t xml:space="preserve">Пока заметка находится в оперативной памяти и не сохранена на диск ни разу, ей присваивается идентификатор </w:t>
@@ -6244,6 +6281,24 @@
     </w:p>
     <w:p>
       <w:pPr>
+        <w:pStyle w:val="ListParagraph"/>
+        <w:ind w:left="1151"/>
+      </w:pPr>
+      <w:r>
+        <w:t xml:space="preserve">Для записи созданной заметки на диск требуется вызов </w:t>
+      </w:r>
+      <w:r>
+        <w:rPr>
+          <w:lang w:val="en-US"/>
+        </w:rPr>
+        <w:t>SaveNote</w:t>
+      </w:r>
+      <w:r>
+        <w:t>.</w:t>
+      </w:r>
+    </w:p>
+    <w:p>
+      <w:pPr>
         <w:ind w:left="754"/>
       </w:pPr>
     </w:p>
@@ -6269,7 +6324,10 @@
         <w:rPr>
           <w:lang w:val="en-US"/>
         </w:rPr>
-        <w:t xml:space="preserve">LoadAll, </w:t>
+        <w:t>LoadAll</w:t>
+      </w:r>
+      <w:r>
+        <w:t xml:space="preserve">, </w:t>
       </w:r>
       <w:r>
         <w:t xml:space="preserve">возвращающий список объектов </w:t>
@@ -6291,11 +6349,6 @@
     <w:p>
       <w:pPr>
         <w:pStyle w:val="ListParagraph"/>
-      </w:pPr>
-    </w:p>
-    <w:p>
-      <w:pPr>
-        <w:pStyle w:val="ListParagraph"/>
         <w:numPr>
           <w:ilvl w:val="6"/>
           <w:numId w:val="10"/>
@@ -6353,6 +6406,7 @@
         </w:numPr>
       </w:pPr>
       <w:r>
+        <w:lastRenderedPageBreak/>
         <w:t xml:space="preserve">Выделение </w:t>
       </w:r>
       <w:r>
@@ -6386,6 +6440,9 @@
         <w:t>Note</w:t>
       </w:r>
       <w:r>
+        <w:t xml:space="preserve"> </w:t>
+      </w:r>
+      <w:r>
         <w:t>с соответствующими свойствами.</w:t>
       </w:r>
     </w:p>
@@ -6416,67 +6473,100 @@
     <w:p>
       <w:pPr>
         <w:pStyle w:val="ListParagraph"/>
-        <w:ind w:left="907"/>
-      </w:pPr>
-    </w:p>
-    <w:p>
-      <w:pPr>
-        <w:pStyle w:val="ListParagraph"/>
-        <w:ind w:left="907"/>
-      </w:pPr>
-    </w:p>
-    <w:p>
-      <w:pPr>
-        <w:pStyle w:val="ListParagraph"/>
-        <w:ind w:left="907"/>
-      </w:pPr>
-      <w:r>
-        <w:t xml:space="preserve">Для загрузки конкретной заметки создается метод </w:t>
-      </w:r>
-      <w:r>
-        <w:rPr>
-          <w:lang w:val="en-US"/>
-        </w:rPr>
-        <w:t>LoadNote</w:t>
-      </w:r>
-      <w:r>
-        <w:t xml:space="preserve">, </w:t>
-      </w:r>
-      <w:r>
-        <w:t>принимающий идентификатор заметки. Алгоритм загрузки конкретной заметки:</w:t>
-      </w:r>
-    </w:p>
-    <w:p>
-      <w:pPr>
-        <w:pStyle w:val="ListParagraph"/>
         <w:numPr>
           <w:ilvl w:val="6"/>
           <w:numId w:val="10"/>
         </w:numPr>
       </w:pPr>
       <w:r>
-        <w:t xml:space="preserve">Проверка </w:t>
-      </w:r>
-      <w:r>
-        <w:rPr>
-          <w:lang w:val="en-US"/>
-        </w:rPr>
-        <w:t>Guid</w:t>
-      </w:r>
-      <w:r>
-        <w:t xml:space="preserve"> </w:t>
-      </w:r>
-      <w:r>
-        <w:t xml:space="preserve">заметки на равенство пустому </w:t>
-      </w:r>
-      <w:r>
-        <w:rPr>
-          <w:lang w:val="en-US"/>
-        </w:rPr>
-        <w:t>Guid</w:t>
-      </w:r>
-      <w:r>
-        <w:t>. В этом случае выбрасывается исключение нулевого аргумента.</w:t>
+        <w:t>Возвращение списка заметок в папке.</w:t>
+      </w:r>
+    </w:p>
+    <w:p>
+      <w:pPr>
+        <w:pStyle w:val="ListParagraph"/>
+        <w:ind w:left="1587"/>
+      </w:pPr>
+    </w:p>
+    <w:p>
+      <w:pPr>
+        <w:pStyle w:val="ListParagraph"/>
+        <w:ind w:left="907"/>
+      </w:pPr>
+      <w:r>
+        <w:t xml:space="preserve">При выделении </w:t>
+      </w:r>
+      <w:r>
+        <w:rPr>
+          <w:lang w:val="en-US"/>
+        </w:rPr>
+        <w:t>YAML</w:t>
+      </w:r>
+      <w:r>
+        <w:t xml:space="preserve">-фронтматтера используются строки с разделителями </w:t>
+      </w:r>
+    </w:p>
+    <w:p>
+      <w:pPr>
+        <w:pStyle w:val="ListParagraph"/>
+        <w:ind w:left="907"/>
+      </w:pPr>
+      <w:r>
+        <w:t>“</w:t>
+      </w:r>
+      <w:r>
+        <w:t>---</w:t>
+      </w:r>
+      <w:r>
+        <w:t>”</w:t>
+      </w:r>
+      <w:r>
+        <w:t xml:space="preserve">. Основное содержание заметки восстанавливается из файла без удаления пользовательских пропусков строк и пробельных символов. </w:t>
+      </w:r>
+    </w:p>
+    <w:p>
+      <w:pPr>
+        <w:pStyle w:val="ListParagraph"/>
+        <w:ind w:left="907"/>
+      </w:pPr>
+      <w:r>
+        <w:t xml:space="preserve">Если отдельный файл недоступен или не может быть открыта в связи с некорректным форматом, загрузка последующих </w:t>
+      </w:r>
+      <w:r>
+        <w:t xml:space="preserve">При возникновении ошибок с доступом к каталогу или при ошибке формирования самого списка файлов ошибки пробрасываются выше </w:t>
+      </w:r>
+      <w:r>
+        <w:t xml:space="preserve">вызывающему компоненту </w:t>
+      </w:r>
+      <w:r>
+        <w:t>для отображения пользователю.</w:t>
+      </w:r>
+    </w:p>
+    <w:p>
+      <w:pPr>
+        <w:pStyle w:val="ListParagraph"/>
+        <w:ind w:left="907"/>
+      </w:pPr>
+    </w:p>
+    <w:p>
+      <w:pPr>
+        <w:pStyle w:val="ListParagraph"/>
+        <w:ind w:left="907"/>
+      </w:pPr>
+      <w:r>
+        <w:t xml:space="preserve">Для загрузки конкретной заметки создается метод </w:t>
+      </w:r>
+      <w:r>
+        <w:rPr>
+          <w:lang w:val="en-US"/>
+        </w:rPr>
+        <w:t>LoadNote</w:t>
+      </w:r>
+      <w:r>
+        <w:t xml:space="preserve">, </w:t>
+      </w:r>
+      <w:r>
+        <w:t>принимающий идентификатор заметки. Алгоритм загрузки конкретной заметки:</w:t>
       </w:r>
     </w:p>
     <w:p>
@@ -6488,7 +6578,28 @@
         </w:numPr>
       </w:pPr>
       <w:r>
-        <w:t>Проверка существования директории заметок. Так как в данном методе производится загрузка конкретной заметки, выбрасываем исключение.</w:t>
+        <w:t xml:space="preserve">Проверка </w:t>
+      </w:r>
+      <w:r>
+        <w:rPr>
+          <w:lang w:val="en-US"/>
+        </w:rPr>
+        <w:t>Guid</w:t>
+      </w:r>
+      <w:r>
+        <w:t xml:space="preserve"> </w:t>
+      </w:r>
+      <w:r>
+        <w:t xml:space="preserve">заметки на равенство пустому </w:t>
+      </w:r>
+      <w:r>
+        <w:rPr>
+          <w:lang w:val="en-US"/>
+        </w:rPr>
+        <w:t>Guid</w:t>
+      </w:r>
+      <w:r>
+        <w:t>. В этом случае выбрасывается исключение нулевого аргумента.</w:t>
       </w:r>
     </w:p>
     <w:p>
@@ -6500,19 +6611,7 @@
         </w:numPr>
       </w:pPr>
       <w:r>
-        <w:t xml:space="preserve">Итерирование по файлам заметок в директории, нахождение в </w:t>
-      </w:r>
-      <w:r>
-        <w:rPr>
-          <w:lang w:val="en-US"/>
-        </w:rPr>
-        <w:t>YAML</w:t>
-      </w:r>
-      <w:r>
-        <w:t>-фронтматтере соответствующего и</w:t>
-      </w:r>
-      <w:r>
-        <w:t>дентификатора.</w:t>
+        <w:t>Проверка существования директории заметок. Так как в данном методе производится загрузка конкретной заметки, выбрасываем исключение.</w:t>
       </w:r>
     </w:p>
     <w:p>
@@ -6524,7 +6623,19 @@
         </w:numPr>
       </w:pPr>
       <w:r>
-        <w:t>В случае ошибок доступа или другого исключения производится логирование в читаемый формат.</w:t>
+        <w:t xml:space="preserve">Итерирование по файлам заметок в директории, нахождение в </w:t>
+      </w:r>
+      <w:r>
+        <w:rPr>
+          <w:lang w:val="en-US"/>
+        </w:rPr>
+        <w:t>YAML</w:t>
+      </w:r>
+      <w:r>
+        <w:t>-фронтматтере соответствующего и</w:t>
+      </w:r>
+      <w:r>
+        <w:t>дентификатора.</w:t>
       </w:r>
     </w:p>
     <w:p>
@@ -6536,19 +6647,7 @@
         </w:numPr>
       </w:pPr>
       <w:r>
-        <w:t xml:space="preserve">В случае отсутствия заметки с указанным </w:t>
-      </w:r>
-      <w:r>
-        <w:rPr>
-          <w:lang w:val="en-US"/>
-        </w:rPr>
-        <w:t>ID</w:t>
-      </w:r>
-      <w:r>
-        <w:t xml:space="preserve"> </w:t>
-      </w:r>
-      <w:r>
-        <w:t xml:space="preserve">в директории пробрасывается исключение. </w:t>
+        <w:t>В случае ошибок доступа или другого исключения производится логирование в читаемый формат.</w:t>
       </w:r>
     </w:p>
     <w:p>
@@ -6560,9 +6659,467 @@
         </w:numPr>
       </w:pPr>
       <w:r>
+        <w:t xml:space="preserve">В случае отсутствия заметки с указанным </w:t>
+      </w:r>
+      <w:r>
+        <w:rPr>
+          <w:lang w:val="en-US"/>
+        </w:rPr>
+        <w:t>ID</w:t>
+      </w:r>
+      <w:r>
+        <w:t xml:space="preserve"> </w:t>
+      </w:r>
+      <w:r>
+        <w:t xml:space="preserve">в директории пробрасывается исключение. </w:t>
+      </w:r>
+    </w:p>
+    <w:p>
+      <w:pPr>
+        <w:pStyle w:val="ListParagraph"/>
+        <w:numPr>
+          <w:ilvl w:val="6"/>
+          <w:numId w:val="10"/>
+        </w:numPr>
+      </w:pPr>
+      <w:r>
         <w:t>Возвращение объекта заметки.</w:t>
       </w:r>
     </w:p>
+    <w:p>
+      <w:pPr>
+        <w:ind w:left="708"/>
+      </w:pPr>
+      <w:r>
+        <w:t>Исключения, появляющиеся при ошибках нахождения заметки для загрузки, требуется передавать наверх вызывающему компоненту для показа предупреждения пользователю. Непрочитанный файл не должен считаться программой как отсутствующий.</w:t>
+      </w:r>
+    </w:p>
+    <w:p>
+      <w:pPr>
+        <w:ind w:left="708"/>
+      </w:pPr>
+      <w:r>
+        <w:t xml:space="preserve">Использование </w:t>
+      </w:r>
+      <w:r>
+        <w:rPr>
+          <w:lang w:val="en-US"/>
+        </w:rPr>
+        <w:t>GUID</w:t>
+      </w:r>
+      <w:r>
+        <w:t xml:space="preserve"> </w:t>
+      </w:r>
+      <w:r>
+        <w:t xml:space="preserve">из метаданных позволяет находить заметку независимо от её изменяемого заголовка. В первоначальной реализации </w:t>
+      </w:r>
+      <w:r>
+        <w:rPr>
+          <w:lang w:val="en-US"/>
+        </w:rPr>
+        <w:t>CRUD</w:t>
+      </w:r>
+      <w:r>
+        <w:t xml:space="preserve"> </w:t>
+      </w:r>
+      <w:r>
+        <w:t>производится последовательный поиск до нахождения соответствия идентификатора.</w:t>
+      </w:r>
+    </w:p>
+    <w:p>
+      <w:pPr>
+        <w:pStyle w:val="ListParagraph"/>
+        <w:numPr>
+          <w:ilvl w:val="1"/>
+          <w:numId w:val="1"/>
+        </w:numPr>
+      </w:pPr>
+      <w:r>
+        <w:rPr>
+          <w:b/>
+          <w:bCs/>
+        </w:rPr>
+        <w:t xml:space="preserve">Сохранение и изменение заметок </w:t>
+      </w:r>
+      <w:r>
+        <w:t>–</w:t>
+      </w:r>
+      <w:r>
+        <w:t xml:space="preserve"> </w:t>
+      </w:r>
+      <w:r>
+        <w:t xml:space="preserve">процесс заключается в записи текущего заголовка, содержимого, метаданных в файл в локальном хранилище. Первичное сохранение и последующее обновление заметки выполняется при помощи вызова метода </w:t>
+      </w:r>
+      <w:r>
+        <w:rPr>
+          <w:lang w:val="en-US"/>
+        </w:rPr>
+        <w:t>SaveNote</w:t>
+      </w:r>
+      <w:r>
+        <w:t xml:space="preserve">, принимающий объект </w:t>
+      </w:r>
+      <w:r>
+        <w:rPr>
+          <w:lang w:val="en-US"/>
+        </w:rPr>
+        <w:t>Note</w:t>
+      </w:r>
+      <w:r>
+        <w:t>.</w:t>
+      </w:r>
+    </w:p>
+    <w:p>
+      <w:pPr>
+        <w:pStyle w:val="ListParagraph"/>
+        <w:ind w:left="822"/>
+        <w:rPr>
+          <w:b/>
+          <w:bCs/>
+        </w:rPr>
+      </w:pPr>
+    </w:p>
+    <w:p>
+      <w:pPr>
+        <w:pStyle w:val="ListParagraph"/>
+        <w:ind w:left="822"/>
+      </w:pPr>
+      <w:r>
+        <w:lastRenderedPageBreak/>
+        <w:t>Алгоритм сохранения должен выглядеть следующим образом:</w:t>
+      </w:r>
+    </w:p>
+    <w:p>
+      <w:pPr>
+        <w:pStyle w:val="ListParagraph"/>
+        <w:numPr>
+          <w:ilvl w:val="5"/>
+          <w:numId w:val="10"/>
+        </w:numPr>
+      </w:pPr>
+      <w:r>
+        <w:t xml:space="preserve">Проверка текущей заметки на </w:t>
+      </w:r>
+      <w:r>
+        <w:rPr>
+          <w:lang w:val="en-US"/>
+        </w:rPr>
+        <w:t>null</w:t>
+      </w:r>
+      <w:r>
+        <w:t xml:space="preserve">-значение. В этом случае выбрасывается исключение </w:t>
+      </w:r>
+      <w:r>
+        <w:rPr>
+          <w:lang w:val="en-US"/>
+        </w:rPr>
+        <w:t>ArgumentNullException</w:t>
+      </w:r>
+      <w:r>
+        <w:t>.</w:t>
+      </w:r>
+    </w:p>
+    <w:p>
+      <w:pPr>
+        <w:pStyle w:val="ListParagraph"/>
+        <w:numPr>
+          <w:ilvl w:val="5"/>
+          <w:numId w:val="10"/>
+        </w:numPr>
+      </w:pPr>
+      <w:r>
+        <w:t xml:space="preserve">Проверка заголовка заметки на пустой или пробельный заголовок. В случае пустого диалога выбрасывается исключение </w:t>
+      </w:r>
+      <w:r>
+        <w:rPr>
+          <w:lang w:val="en-US"/>
+        </w:rPr>
+        <w:t>ArgumentNullException</w:t>
+      </w:r>
+      <w:r>
+        <w:t>.</w:t>
+      </w:r>
+      <w:r>
+        <w:t xml:space="preserve"> В случае пробельного заголовка выбрасывается </w:t>
+      </w:r>
+      <w:r>
+        <w:rPr>
+          <w:lang w:val="en-US"/>
+        </w:rPr>
+        <w:t>ArgumentException.</w:t>
+      </w:r>
+    </w:p>
+    <w:p>
+      <w:pPr>
+        <w:pStyle w:val="ListParagraph"/>
+        <w:numPr>
+          <w:ilvl w:val="5"/>
+          <w:numId w:val="10"/>
+        </w:numPr>
+      </w:pPr>
+      <w:r>
+        <w:t xml:space="preserve">Проверка </w:t>
+      </w:r>
+      <w:r>
+        <w:rPr>
+          <w:lang w:val="en-US"/>
+        </w:rPr>
+        <w:t>Guid</w:t>
+      </w:r>
+      <w:r>
+        <w:t xml:space="preserve"> </w:t>
+      </w:r>
+      <w:r>
+        <w:t xml:space="preserve">заметки на соответствие нулевому </w:t>
+      </w:r>
+      <w:r>
+        <w:rPr>
+          <w:lang w:val="en-US"/>
+        </w:rPr>
+        <w:t>Guid</w:t>
+      </w:r>
+      <w:r>
+        <w:t xml:space="preserve">. </w:t>
+      </w:r>
+      <w:r>
+        <w:t xml:space="preserve">В случае, если </w:t>
+      </w:r>
+      <w:r>
+        <w:rPr>
+          <w:lang w:val="en-US"/>
+        </w:rPr>
+        <w:t>Guid</w:t>
+      </w:r>
+      <w:r>
+        <w:t xml:space="preserve"> </w:t>
+      </w:r>
+      <w:r>
+        <w:t>заметки еще пустой, при сохранении создаётся новый.</w:t>
+      </w:r>
+    </w:p>
+    <w:p>
+      <w:pPr>
+        <w:pStyle w:val="ListParagraph"/>
+        <w:numPr>
+          <w:ilvl w:val="5"/>
+          <w:numId w:val="10"/>
+        </w:numPr>
+      </w:pPr>
+      <w:r>
+        <w:t xml:space="preserve">Установление времени обновления заметки в </w:t>
+      </w:r>
+      <w:r>
+        <w:rPr>
+          <w:lang w:val="en-US"/>
+        </w:rPr>
+        <w:t>DateTime</w:t>
+      </w:r>
+      <w:r>
+        <w:t>.</w:t>
+      </w:r>
+      <w:r>
+        <w:rPr>
+          <w:lang w:val="en-US"/>
+        </w:rPr>
+        <w:t>Now</w:t>
+      </w:r>
+      <w:r>
+        <w:t xml:space="preserve"> </w:t>
+      </w:r>
+      <w:r>
+        <w:t>–</w:t>
+      </w:r>
+      <w:r>
+        <w:t xml:space="preserve"> </w:t>
+      </w:r>
+      <w:r>
+        <w:t>текущее время.</w:t>
+      </w:r>
+    </w:p>
+    <w:p>
+      <w:pPr>
+        <w:pStyle w:val="ListParagraph"/>
+        <w:numPr>
+          <w:ilvl w:val="5"/>
+          <w:numId w:val="10"/>
+        </w:numPr>
+      </w:pPr>
+      <w:r>
+        <w:t>Замена недопустимых символов на символ нижнего подчеркивания.</w:t>
+      </w:r>
+    </w:p>
+    <w:p>
+      <w:pPr>
+        <w:pStyle w:val="ListParagraph"/>
+        <w:numPr>
+          <w:ilvl w:val="5"/>
+          <w:numId w:val="10"/>
+        </w:numPr>
+      </w:pPr>
+      <w:r>
+        <w:t>Фиксация старого имени файла.</w:t>
+      </w:r>
+    </w:p>
+    <w:p>
+      <w:pPr>
+        <w:pStyle w:val="ListParagraph"/>
+        <w:numPr>
+          <w:ilvl w:val="5"/>
+          <w:numId w:val="10"/>
+        </w:numPr>
+      </w:pPr>
+      <w:r>
+        <w:t xml:space="preserve">При смене старого имени файла на новое </w:t>
+      </w:r>
+      <w:r>
+        <w:t>–</w:t>
+      </w:r>
+      <w:r>
+        <w:t xml:space="preserve"> </w:t>
+      </w:r>
+      <w:r>
+        <w:t>запись текущего состояния файла во временный,</w:t>
+      </w:r>
+      <w:r>
+        <w:t xml:space="preserve"> </w:t>
+      </w:r>
+      <w:r>
+        <w:t>в случае успешной записи – преобразование временного файла в полноценный новый, старый файл удаляется.</w:t>
+      </w:r>
+    </w:p>
+    <w:p>
+      <w:pPr>
+        <w:pStyle w:val="ListParagraph"/>
+        <w:numPr>
+          <w:ilvl w:val="5"/>
+          <w:numId w:val="10"/>
+        </w:numPr>
+      </w:pPr>
+      <w:r>
+        <w:t xml:space="preserve">В случае ошибки записи – проброс исключения выше для уведомления пользователя. </w:t>
+      </w:r>
+      <w:r>
+        <w:t>Удаление временного файла, старый файл остаётся.</w:t>
+      </w:r>
+    </w:p>
+    <w:p>
+      <w:pPr>
+        <w:pStyle w:val="ListParagraph"/>
+        <w:numPr>
+          <w:ilvl w:val="5"/>
+          <w:numId w:val="10"/>
+        </w:numPr>
+      </w:pPr>
+      <w:r>
+        <w:t>Проверка существования файла с текущим именем заметки. Если таковой есть, производится формирование имени заметки с суффиксом (</w:t>
+      </w:r>
+      <w:r>
+        <w:rPr>
+          <w:lang w:val="en-US"/>
+        </w:rPr>
+        <w:t>n</w:t>
+      </w:r>
+      <w:r>
+        <w:t xml:space="preserve">), где </w:t>
+      </w:r>
+      <w:r>
+        <w:rPr>
+          <w:lang w:val="en-US"/>
+        </w:rPr>
+        <w:t>n</w:t>
+      </w:r>
+      <w:r>
+        <w:t xml:space="preserve"> </w:t>
+      </w:r>
+      <w:r>
+        <w:t>–</w:t>
+      </w:r>
+      <w:r>
+        <w:t xml:space="preserve"> </w:t>
+      </w:r>
+      <w:r>
+        <w:t xml:space="preserve">количество файлов с исходным названием. </w:t>
+      </w:r>
+    </w:p>
+    <w:p>
+      <w:pPr>
+        <w:pStyle w:val="ListParagraph"/>
+        <w:numPr>
+          <w:ilvl w:val="5"/>
+          <w:numId w:val="10"/>
+        </w:numPr>
+      </w:pPr>
+      <w:r>
+        <w:t>Формирование содержимого заметки по установленному формату. Запись заметки в файл.</w:t>
+      </w:r>
+    </w:p>
+    <w:p>
+      <w:pPr>
+        <w:ind w:left="708"/>
+      </w:pPr>
+      <w:r>
+        <w:t>При изменении имени файла в системе должна формироваться временная копия со старым содержимым, пока файл не будет гарантированно записан. Удаление старого</w:t>
+      </w:r>
+      <w:r>
+        <w:t xml:space="preserve"> файла производится только после того, как новый временный файл будет записан на диск без ошибок сохранения.</w:t>
+      </w:r>
+    </w:p>
+    <w:p>
+      <w:pPr>
+        <w:ind w:left="708"/>
+      </w:pPr>
+      <w:r>
+        <w:t xml:space="preserve">Для формирования корректного вида заметки используется вспомогательный метод </w:t>
+      </w:r>
+      <w:r>
+        <w:rPr>
+          <w:lang w:val="en-US"/>
+        </w:rPr>
+        <w:t>BuildFileContent</w:t>
+      </w:r>
+      <w:r>
+        <w:t xml:space="preserve">, </w:t>
+      </w:r>
+      <w:r>
+        <w:t xml:space="preserve">который создает объект </w:t>
+      </w:r>
+      <w:r>
+        <w:rPr>
+          <w:lang w:val="en-US"/>
+        </w:rPr>
+        <w:t>NoteMetadata</w:t>
+      </w:r>
+      <w:r>
+        <w:t xml:space="preserve">, сериализует его в </w:t>
+      </w:r>
+      <w:r>
+        <w:rPr>
+          <w:lang w:val="en-US"/>
+        </w:rPr>
+        <w:t>YAML</w:t>
+      </w:r>
+      <w:r>
+        <w:t>-формат для последующей записи в файл перед текстом заметки.</w:t>
+      </w:r>
+    </w:p>
+    <w:p>
+      <w:pPr>
+        <w:ind w:left="708"/>
+      </w:pPr>
+      <w:r>
+        <w:t xml:space="preserve">После успешного сохранения заметки обновляется снимок – состояние редактора и сбрасывается переменная проверки статуса сохранения </w:t>
+      </w:r>
+      <w:r>
+        <w:rPr>
+          <w:lang w:val="en-US"/>
+        </w:rPr>
+        <w:t>IsDirty</w:t>
+      </w:r>
+      <w:r>
+        <w:t>. При ошибке сохранения не примененные изменения остаются на редактирование пользователю.</w:t>
+      </w:r>
+    </w:p>
+    <w:p/>
     <w:p/>
     <w:p/>
     <w:sectPr>
@@ -7569,9 +8126,9 @@
       <w:lvlJc w:val="left"/>
       <w:pPr>
         <w:tabs>
-          <w:tab w:val="num" w:pos="794"/>
-        </w:tabs>
-        <w:ind w:left="1151" w:hanging="397"/>
+          <w:tab w:val="num" w:pos="465"/>
+        </w:tabs>
+        <w:ind w:left="822" w:hanging="397"/>
       </w:pPr>
       <w:rPr>
         <w:lang w:val="en-US"/>
@@ -9210,4 +9767,16 @@
   <a:objectDefaults/>
   <a:extraClrSchemeLst/>
 </a:theme>
+</file>
+
+<file path=customXml/item1.xml><?xml version="1.0" encoding="utf-8"?>
+<b:Sources xmlns:b="http://schemas.openxmlformats.org/officeDocument/2006/bibliography" xmlns="http://schemas.openxmlformats.org/officeDocument/2006/bibliography" SelectedStyle="\APASixthEditionOfficeOnline.xsl" StyleName="APA" Version="6"/>
+</file>
+
+<file path=customXml/itemProps1.xml><?xml version="1.0" encoding="utf-8"?>
+<ds:datastoreItem xmlns:ds="http://schemas.openxmlformats.org/officeDocument/2006/customXml" ds:itemID="{22DC914F-B4B7-4436-9A41-167BF005A775}">
+  <ds:schemaRefs>
+    <ds:schemaRef ds:uri="http://schemas.openxmlformats.org/officeDocument/2006/bibliography"/>
+  </ds:schemaRefs>
+</ds:datastoreItem>
 </file>
</xml_diff>